<commit_message>
Add CO2 cohort characteristics to manuscript draft
</commit_message>
<xml_diff>
--- a/docs/manuscript_development/CO2_MANUSCRIPT_DRAFT_V1.docx
+++ b/docs/manuscript_development/CO2_MANUSCRIPT_DRAFT_V1.docx
@@ -361,17 +361,47 @@
         <w:pStyle w:val="Heading2"/>
       </w:pPr>
       <w:r>
-        <w:t>Analytic cohorts and intraoperative EtCO2 distributions</w:t>
+        <w:t>Analytic cohorts and patient characteristics</w:t>
       </w:r>
     </w:p>
     <w:p>
       <w:r>
-        <w:t>The analytic cohorts included 1,792 patients for left SctO2 and right SctO2 and 1,789 patients for SftO2. Before filtering, each channel contained more than 20 million timestamp-level observations. EtCO2 values were concentrated around 30 mmHg at the patient level, with a mean of approximately 30.0 mmHg and SD of 2.6. Patient-level mean tissue oxygenation was lower in the cerebral channels and higher in the forearm channel.</w:t>
+        <w:t>The analytic cohorts included 1,792 patients for left SctO2 and right SctO2 and 1,789 patients for SftO2. The source time-series file contained 25,385,328 timestamp-level rows from 1,872 patients before outcome-specific filtering. After requiring nonmissing EtCO2 and the corresponding tissue oxygenation channel, applying the cohort-defining EtCO2 and tissue oxygenation screens, and excluding values outside the strict analytic ranges, the final usable timestamp counts were 20,021,703 for left SctO2, 20,075,597 for right SctO2, and 20,068,759 for SftO2.</w:t>
       </w:r>
     </w:p>
     <w:p>
       <w:r>
-        <w:t>[Insert Table 1 after generating baseline and intraoperative characteristics.]</w:t>
+        <w:t xml:space="preserve">The CO2-specific Table 1/2 generation script was run on the active </w:t>
+      </w:r>
+      <w:r>
+        <w:rPr>
+          <w:rFonts w:ascii="Consolas" w:hAnsi="Consolas"/>
+          <w:sz w:val="20"/>
+        </w:rPr>
+        <w:t>g24</w:t>
+      </w:r>
+      <w:r>
+        <w:t xml:space="preserve"> compute node using the project Python environment. Baseline characteristics were similar across the three channel-specific cohorts. In the left SctO2 cohort, mean age was 68.7 years (SD, 5.3), mean BMI was 25.3 kg/m2 (SD, 3.2), mean baseline cardiac index was 2.5 L/min/m2 (SD, 0.8), mean baseline mean blood pressure was 90.0 mmHg (SD, 12.4), and mean hemoglobin was 132.1 g/L (SD, 15.5). Diabetes was present in 770 patients (43.0%), hypertension in 1,316 patients (73.4%), and drinking history in 458 patients (25.6%). Corresponding values were essentially unchanged in the right SctO2 cohort and differed only slightly in the SftO2 cohort because three fewer patients were included.</w:t>
+      </w:r>
+    </w:p>
+    <w:p>
+      <w:r>
+        <w:t>Patient-level EtCO2 summaries showed mean EtCO2 near 30 mmHg across channels. Mean tissue oxygenation differed by site, with patient-level means of 71.1% for left SctO2, 71.5% for right SctO2, and 75.6% for SftO2 in the current output.</w:t>
+      </w:r>
+    </w:p>
+    <w:p>
+      <w:r>
+        <w:t xml:space="preserve">[Insert Table 1/2 from </w:t>
+      </w:r>
+      <w:r>
+        <w:rPr>
+          <w:rFonts w:ascii="Consolas" w:hAnsi="Consolas"/>
+          <w:sz w:val="20"/>
+        </w:rPr>
+        <w:t>results/manuscript_tables/table1_2_co2_rso2.xlsx</w:t>
+      </w:r>
+      <w:r>
+        <w:t xml:space="preserve"> after the generated files are pulled back into the local mirror.]</w:t>
       </w:r>
     </w:p>
     <w:p>

</xml_diff>

<commit_message>
Expand CO2 manuscript package
</commit_message>
<xml_diff>
--- a/docs/manuscript_development/CO2_MANUSCRIPT_DRAFT_V1.docx
+++ b/docs/manuscript_development/CO2_MANUSCRIPT_DRAFT_V1.docx
@@ -12,7 +12,7 @@
           <w:color w:val="0B2545"/>
           <w:sz w:val="36"/>
         </w:rPr>
-        <w:t>End-tidal carbon dioxide and cerebral tissue oxygenation during off-pump coronary bypass</w:t>
+        <w:t>End-tidal carbon dioxide and regional tissue oxygenation during off-pump coronary bypass</w:t>
       </w:r>
     </w:p>
     <w:p>
@@ -43,7 +43,7 @@
     </w:p>
     <w:p>
       <w:r>
-        <w:t>End-tidal carbon dioxide and cerebral tissue oxygenation during off-pump coronary bypass</w:t>
+        <w:t>End-tidal carbon dioxide and regional tissue oxygenation during off-pump coronary bypass</w:t>
       </w:r>
     </w:p>
     <w:p>
@@ -82,7 +82,7 @@
     </w:p>
     <w:p>
       <w:r>
-        <w:t>EtCO2 and cerebral oxygenation during OPCAB</w:t>
+        <w:t>EtCO2 and tissue oxygenation during OPCAB</w:t>
       </w:r>
     </w:p>
     <w:p>
@@ -161,7 +161,7 @@
     </w:p>
     <w:p>
       <w:r>
-        <w:t>Cerebral and peripheral tissue oxygenation can change rapidly during cardiac surgery, but the intraoperative physiology behind these changes is difficult to quantify because ventilation, hemodynamics, oxygen delivery, and temperature vary together. Carbon dioxide is a plausible driver because it affects cerebral vascular tone and is continuously monitored as end-tidal carbon dioxide (EtCO2) during anesthesia. Here we estimate the adjusted relationship between EtCO2 and regional tissue oxygenation during off-pump coronary bypass surgery using high-frequency intraoperative data. We analyzed approximately 1,800 patients with more than 20 million timestamp-level observations per oxygenation channel. Generalized additive models estimated nonlinear EtCO2-rSO2 relationships while adjusting for FiO2, temperature, mean arterial pressure, hemodynamic covariates, and patient-level factors; bootstrap resampling quantified uncertainty. A 5 mmHg higher EtCO2 was associated with higher rSO2 by 2.89 percentage points (95% CI, 2.41 to 3.33) in left SctO2, 2.98 percentage points (95% CI, 2.64 to 3.28) in right SctO2, and 0.92 percentage points (95% CI, 0.68 to 1.16) in SftO2. Comparable clinical-step changes in FiO2 and temperature were smaller and less consistent. These findings identify EtCO2 as a major modifiable correlate of intraoperative tissue oxygenation. They do not establish an optimal EtCO2 target or prove that EtCO2 manipulation improves outcomes.</w:t>
+        <w:t>Near-infrared spectroscopy tracks tissue oxygenation during cardiac surgery, but changes in rSO2 are difficult to attribute because ventilation, oxygen delivery, temperature, blood pressure, and flow vary together. Carbon dioxide is a plausible contributor because it affects cerebrovascular tone and is continuously available as end-tidal carbon dioxide (EtCO2) during anesthesia. We used high-frequency intraoperative data from approximately 1,800 patients undergoing off-pump coronary bypass surgery to estimate adjusted nonlinear relationships between EtCO2 and regional tissue oxygenation. EtCO2 was analyzed as a continuously available clinical marker of ventilation-perfusion and perfusion physiology, not as a direct substitute for PaCO2. Generalized additive models were fitted separately for left cerebral tissue oxygen saturation (left SctO2), right SctO2, and forearm tissue oxygen saturation (SftO2), with adjustment for FiO2, temperature, mean arterial pressure, cardiac index, other available covariates, and patient-level factors. A 5 mmHg higher EtCO2 was associated with higher tissue oxygenation by 2.89 percentage points (95% CI, 2.41 to 3.33) for left SctO2, 2.98 percentage points (95% CI, 2.64 to 3.28) for right SctO2, and 0.92 percentage points (95% CI, 0.68 to 1.16) for SftO2. Comparable clinical-step changes in FiO2 and temperature were smaller and less consistent. These findings identify EtCO2 as an adjusted correlate of intraoperative cerebral oxygenation, but they do not establish PaCO2-mediated causality, an optimal EtCO2 target, or benefit from EtCO2 manipulation.</w:t>
       </w:r>
     </w:p>
     <w:p>
@@ -174,22 +174,22 @@
     </w:p>
     <w:p>
       <w:r>
-        <w:t>Near-infrared spectroscopy gives anesthesiologists a continuous view of regional cerebral oxygenation during cardiac surgery. The monitor is clinically attractive because it changes before many downstream neurological outcomes can be observed, but the number itself is not self-explanatory. A fall in rSO2 may reflect changes in perfusion pressure, cardiac output, arterial oxygen content, cerebral metabolism, ventilation, temperature, sensor position, or several of these at once.</w:t>
+        <w:t>Near-infrared spectroscopy gives anesthesiologists a continuous view of regional tissue oxygenation during cardiac surgery.^1 The signal precedes clinical neurological or systemic outcomes, but its physiological source is often ambiguous. A fall in rSO2 may reflect changes in perfusion pressure, cardiac output, arterial oxygen content, cerebral metabolism, ventilation, temperature, sensor position, or several of these at once.</w:t>
       </w:r>
     </w:p>
     <w:p>
       <w:r>
-        <w:t>Carbon dioxide deserves separate attention. PaCO2 and EtCO2 affect cerebral blood flow through cerebrovascular reactivity, and EtCO2 is available continuously during anesthesia. In practice, however, EtCO2 is not a pure respiratory exposure. It also reflects ventilation-perfusion matching, pulmonary blood flow, and systemic perfusion. This makes EtCO2 clinically useful and analytically difficult: the same number can signal a ventilation change, a perfusion change, or both.</w:t>
+        <w:t>Carbon dioxide is a plausible contributor because PaCO2 changes cerebral blood flow through cerebrovascular reactivity, and EtCO2 is recorded continuously during anesthesia.^2 In practice, however, EtCO2 is not a pure respiratory exposure. It also reflects ventilation-perfusion matching, pulmonary blood flow, and systemic perfusion. This makes EtCO2 clinically useful and analytically difficult: the same number can signal a ventilation change, a perfusion change, or both.</w:t>
       </w:r>
     </w:p>
     <w:p>
       <w:r>
-        <w:t>Controlled studies have shown that manipulating carbon dioxide can alter cerebral oxygen saturation. Healthy-volunteer experiments found graded cerebral oxygenation responses to end-tidal carbon dioxide, and perioperative studies have examined EtCO2-rSO2 relationships in selected surgical settings. Cardiac-surgery work has also explored whether NIRS reflects CO2-related physiology and whether mild hypercapnia can attenuate cerebral desaturation. These studies support biological plausibility, but most used small samples, controlled gas challenges, selected surgical settings, or intermittent measurements.</w:t>
+        <w:t>Controlled studies have shown that manipulating carbon dioxide can alter cerebral oxygen saturation. Healthy-volunteer experiments found graded cerebral oxygenation responses to end-tidal carbon dioxide, and perioperative studies have examined EtCO2-rSO2 relationships in selected surgical settings.^2,3 Cardiac-surgery work has also explored whether NIRS reflects CO2-related physiology and whether mild hypercapnia can attenuate cerebral desaturation.^4,5 These studies support biological plausibility, but most used small samples, controlled gas challenges, selected surgical settings, or intermittent measurements.</w:t>
       </w:r>
     </w:p>
     <w:p>
       <w:r>
-        <w:t>The missing piece is a high-frequency, adjusted description of the EtCO2-rSO2 relationship during the physiologically unstable period of off-pump coronary bypass surgery. We therefore modeled EtCO2 and tissue oxygenation continuously, using generalized additive models to estimate nonlinear relationships after adjustment for FiO2, temperature, hemodynamics, and patient factors. We also compared EtCO2 with other adjustable intraoperative variables using clinically interpretable exposure increments.</w:t>
+        <w:t>Few data describe the adjusted EtCO2-rSO2 relationship at high temporal resolution during off-pump coronary bypass. We therefore modeled EtCO2 and tissue oxygenation continuously, using generalized additive models to estimate nonlinear relationships after adjustment for FiO2, temperature, hemodynamics, and patient factors. We also compared EtCO2 with FiO2 and temperature using clinically interpretable exposure increments, and we examined whether the association differed between cerebral and forearm tissue beds.</w:t>
       </w:r>
     </w:p>
     <w:p>
@@ -258,32 +258,12 @@
         <w:t>rSO2_Ch3</w:t>
       </w:r>
       <w:r>
-        <w:t xml:space="preserve">, corresponding to left cerebral tissue oxygen saturation (left SctO2), right cerebral tissue oxygen saturation (right SctO2), and forearm tissue oxygen saturation (SftO2), respectively. A channel-naming audit found that the main CO2 Python and R model/plot scripts and the prior MAP/CI manuscript consistently map </w:t>
-      </w:r>
-      <w:r>
-        <w:rPr>
-          <w:rFonts w:ascii="Consolas" w:hAnsi="Consolas"/>
-          <w:sz w:val="20"/>
-        </w:rPr>
-        <w:t>rSO2_Ch3</w:t>
-      </w:r>
-      <w:r>
-        <w:t xml:space="preserve"> to SftO2, while the CO2 supplemental eTable 3-5 generation path had used a conflicting </w:t>
-      </w:r>
-      <w:r>
-        <w:rPr>
-          <w:rFonts w:ascii="Consolas" w:hAnsi="Consolas"/>
-          <w:sz w:val="20"/>
-        </w:rPr>
-        <w:t>Frontal SctO2 cohort</w:t>
-      </w:r>
-      <w:r>
-        <w:t xml:space="preserve"> label. The latter should be treated as a label bug and corrected before submission.</w:t>
+        <w:t>, corresponding to left cerebral tissue oxygen saturation (left SctO2), right cerebral tissue oxygen saturation (right SctO2), and forearm tissue oxygen saturation (SftO2), respectively. The third NIRS channel was analyzed as SftO2 according to the channel mapping used in the primary modeling and plotting scripts.</w:t>
       </w:r>
     </w:p>
     <w:p>
       <w:r>
-        <w:t>The primary exposure was EtCO2. Time-varying covariates included FiO2, temperature, mean arterial pressure, and hemodynamic variables. Patient-level covariates included demographic and clinical variables used in the prior tissue oxygenation models. Missing time-varying covariates were processed using the ordered imputation strategy described in the prior supplementary methods and documented in the CO2 supplemental eTables.</w:t>
+        <w:t>The primary exposure was EtCO2. EtCO2 was treated as a continuously available clinical marker rather than a direct PaCO2 measurement. The primary model adjusted for hemodynamic status using MAP and cardiac index, in addition to smooth terms for EtCO2, FiO2, temperature, and prespecified patient-level covariates. Missing time-varying covariates were processed using ordered within-patient and median imputation, as described in the Supplementary Methods and documented in the CO2 supplemental eTables.</w:t>
       </w:r>
     </w:p>
     <w:p>
@@ -333,6 +313,21 @@
     <w:p>
       <w:r>
         <w:t>To make the nonlinear model clinically interpretable, we estimated expected rSO2 changes for common intraoperative exposure increments. The primary contrast was a 5 mmHg EtCO2 difference. Comparator contrasts included FiO2 and temperature increments defined in the analysis configuration. Local slopes were also summarized across exposure quantile bins.</w:t>
+      </w:r>
+    </w:p>
+    <w:p>
+      <w:r>
+        <w:t xml:space="preserve">Clinical-step contrasts were estimated from the 10,000-row </w:t>
+      </w:r>
+      <w:r>
+        <w:rPr>
+          <w:rFonts w:ascii="Consolas" w:hAnsi="Consolas"/>
+          <w:sz w:val="20"/>
+        </w:rPr>
+        <w:t>map_ci_te</w:t>
+      </w:r>
+      <w:r>
+        <w:t xml:space="preserve"> analysis run, with 95% confidence intervals derived from archived bootstrap prediction matrices. These intervals are treated as model-based uncertainty intervals unless a patient-level bootstrap is finalized.</w:t>
       </w:r>
     </w:p>
     <w:p>
@@ -419,7 +414,7 @@
     </w:p>
     <w:p>
       <w:r>
-        <w:t>This comparison supports EtCO2 as the strongest current respiratory correlate of cerebral oxygenation in the available model. The comparison should remain limited to EtCO2, FiO2, and temperature unless the missing all-intraop comparisons are completed.</w:t>
+        <w:t>Among the three prespecified clinical-step comparisons shown here, EtCO2 had the largest association with left and right SctO2. The comparison should remain limited to EtCO2, FiO2, and temperature unless the missing all-intraop comparisons are completed.</w:t>
       </w:r>
     </w:p>
     <w:p>
@@ -457,7 +452,7 @@
     </w:p>
     <w:p>
       <w:r>
-        <w:t>The adjusted EtCO2 response curves showed increasing rSO2 across much of the observed EtCO2 range. Left and right SctO2 had similar curve shapes and effect sizes, while SftO2 showed higher baseline oxygenation and a smaller EtCO2-associated contrast. Local slope summaries supported this pattern. For left SctO2, the mean EtCO2 slope rose from 0.36 percentage points per mmHg in the lowest exposure decile to about 0.61 near the middle of the exposure distribution, then declined to 0.11 in the upper decile. Right SctO2 showed a similar mid-range peak, increasing from 0.16 to about 0.62 before tapering. SftO2 showed a more gradual decline from 0.29 in the lowest decile to 0.11 in the highest decile. Uncertainty widened near the upper exposure tail, consistent with fewer observations at higher EtCO2 values.</w:t>
+        <w:t>The adjusted EtCO2 response curves showed increasing rSO2 across much of the observed EtCO2 range. Left and right SctO2 had similar curve shapes and effect sizes, while SftO2 showed higher baseline oxygenation and a smaller EtCO2-associated contrast. Descriptive local-slope summaries suggested steeper EtCO2-rSO2 gradients in the central exposure range and flatter gradients near the upper tail, where data were sparser and uncertainty was wider.</w:t>
       </w:r>
     </w:p>
     <w:p>
@@ -472,7 +467,7 @@
         <w:t>generated_assets/figure2_etco2_adjusted_curves.png</w:t>
       </w:r>
       <w:r>
-        <w:t>.]</w:t>
+        <w:t>. Bands show uncertainty intervals derived from archived prediction matrices; the bootstrap construction and sampling unit are described in the Supplement.]</w:t>
       </w:r>
     </w:p>
     <w:p>
@@ -498,7 +493,7 @@
     </w:p>
     <w:p>
       <w:r>
-        <w:t>The repository includes planned sensitivity summaries, but the 5-model sensitivity analysis currently reports missing result directories for all planned model variants. The present draft therefore does not claim robustness across those sensitivity models. These analyses should either be completed before submission or removed from the manuscript and supplement.</w:t>
+        <w:t>Planned sensitivity analyses across alternative ventilatory and hemodynamic specifications were not available in the current analysis package and should be completed before any robustness claim is made. These analyses should either be completed before submission or removed from the manuscript and supplement.</w:t>
       </w:r>
     </w:p>
     <w:p>
@@ -511,22 +506,37 @@
     </w:p>
     <w:p>
       <w:r>
-        <w:t>This analysis identifies EtCO2 as the dominant respiratory correlate of regional tissue oxygenation in high-frequency data from off-pump coronary bypass surgery. The estimated association was clinically interpretable: a 5 mmHg higher EtCO2 corresponded to roughly a 3 percentage-point higher rSO2 in the left and right cerebral channels, with bootstrap confidence intervals that excluded zero. SftO2 showed a smaller association, consistent with tissue-bed differences between cerebral and forearm oxygenation.</w:t>
+        <w:t>This high-frequency intraoperative analysis identifies EtCO2 as a clinically interpretable correlate of tissue oxygenation during off-pump coronary bypass surgery. The association was largest in the two cerebral channels: a 5 mmHg higher EtCO2 corresponded to approximately 3 percentage points higher left and right SctO2, with bootstrap confidence intervals that excluded zero. The corresponding association with SftO2 was positive but smaller. This site-specific pattern argues against treating cerebral and forearm oximetry channels as interchangeable. Cerebral and forearm sensors appear to carry related but distinct physiologic information.</w:t>
       </w:r>
     </w:p>
     <w:p>
       <w:r>
-        <w:t>The finding is physiologically plausible. Carbon dioxide changes cerebrovascular tone, and controlled studies have shown graded cerebral oxygenation responses to carbon dioxide. Our analysis adds a different piece of evidence: the relationship remains visible in routine intraoperative data after adjustment for oxygen concentration, temperature, mean arterial pressure, hemodynamic covariates, and patient factors. This does not make EtCO2 a causal treatment target. It does suggest that EtCO2 should be considered when interpreting rSO2 changes during off-pump coronary bypass.</w:t>
+        <w:t>The cerebral finding is biologically plausible. Carbon dioxide is a potent regulator of cerebrovascular tone, and controlled human studies show graded cerebral oxygenation responses to changes in end-tidal or arterial carbon dioxide.^2 Rather than studying a controlled gas challenge, this analysis estimates the EtCO2-rSO2 relationship in routine intraoperative data, during a procedure in which ventilation, perfusion, oxygen delivery, vasoactive treatment, and temperature vary simultaneously. The association remained visible after adjustment for FiO2, temperature, mean arterial pressure, hemodynamic covariates, and patient-level factors. These data indicate that EtCO2 should be considered alongside hemodynamic and oxygenation variables when interpreting cerebral oximetry changes during off-pump coronary bypass.</w:t>
       </w:r>
     </w:p>
     <w:p>
       <w:r>
-        <w:t>The comparison with FiO2 and temperature helps define the clinical meaning of the EtCO2 result. These variables are adjustable during anesthesia, but their estimated clinical-step associations with rSO2 were smaller and less consistent in the current analysis. If this finding remains stable after sensitivity analyses, it will support a practical message: when cerebral oxygenation changes during off-pump coronary bypass, EtCO2 is not just a ventilation readout but a major physiologic correlate of the oxygenation signal.</w:t>
+        <w:t>The smaller SftO2 association supports tissue-bed specificity rather than a uniform oximetry response across sensor sites. Forearm tissue oxygenation reflects skeletal muscle, skin, subcutaneous tissue, venous volume, local microvascular tone, and probe-specific factors. These determinants differ from those of cerebral oxygenation, where carbon dioxide-mediated cerebrovascular reactivity is expected to be more prominent. The observed pattern is consistent with a stronger CO2-linked signal in cerebral tissue than in the peripheral tissue bed. It also supports using paired cerebral and peripheral oximetry cautiously: concordant changes may suggest shared systemic physiology, whereas disproportionate cerebral changes may prompt closer review of cerebral perfusion, ventilation, and carbon dioxide measurements.</w:t>
       </w:r>
     </w:p>
     <w:p>
       <w:r>
-        <w:t>Several limits matter. EtCO2 is not PaCO2. It is affected by ventilation, dead space, pulmonary blood flow, and cardiac output, so residual confounding by perfusion cannot be eliminated. The study is observational and cannot identify an optimal EtCO2 range. The current analysis also lacks completed sensitivity runs and outcome endpoints. The manuscript should therefore make a physiologic claim, not a therapeutic claim: EtCO2 is a major, continuously available correlate of intraoperative cerebral oxygenation, and prospective studies are needed to test whether EtCO2-guided management improves patient outcomes.</w:t>
+        <w:t>The FiO2 and temperature contrasts place the EtCO2 association on a clinical scale. FiO2, temperature, and ventilation are all adjustable during anesthesia, but their modeled clinical-step associations with rSO2 were not equivalent. In the current analysis, EtCO2 showed the largest and most consistent association with left and right SctO2 among the evaluated respiratory and thermal variables. This does not mean that EtCO2 should be manipulated automatically whenever rSO2 falls. It suggests that EtCO2 is a relevant contextual variable when clinicians interpret low or falling cerebral rSO2. A low or falling rSO2 value may not be interpretable without knowing whether EtCO2 has changed, particularly when arterial oxygen saturation is already high and perfusion variables are changing at the same time.</w:t>
+      </w:r>
+    </w:p>
+    <w:p>
+      <w:r>
+        <w:t>Prior studies tested carbon dioxide under controlled or selected perioperative conditions; this analysis examines routine off-pump bypass data at timestamp level. In carotid endarterectomy, EtCO2-rSO2 pharmacodynamic modeling showed that rSO2 tended to increase as EtCO2 increased.^3 In cardiac surgery, PaCO2 changes have been linked to changes in cerebral oxygenation during controlled conditions, and pilot trials have tested mild hypercapnia during cardiopulmonary bypass or off-pump bypass.^4,5 The present analysis differs in scale and design. It uses millions of timestamp-level observations from off-pump coronary bypass surgery and models nonlinear adjusted relationships rather than relying on intermittent measurements or selected gas targets. This design is useful for physiologic interpretation, but it is not a substitute for a prospective trial.</w:t>
+      </w:r>
+    </w:p>
+    <w:p>
+      <w:r>
+        <w:t>The claim has clear limits. EtCO2 is not PaCO2. It is influenced by ventilation, dead space, pulmonary blood flow, cardiac output, and ventilation-perfusion matching, so residual confounding by perfusion and gas exchange cannot be eliminated. The study is observational, and the modeled association should not be interpreted as proof that raising EtCO2 will raise cerebral oxygenation in a given patient. The analysis does not identify an optimal EtCO2 range, does not test postoperative neurological outcomes, and does not yet include the full planned sensitivity package. Current comparisons are limited to EtCO2, FiO2, and temperature; broader comparisons with all intraoperative hemodynamic and ventilatory variables require completed all-intraop models. The manuscript should therefore make a physiologic and interpretive claim, not a therapeutic claim.</w:t>
+      </w:r>
+    </w:p>
+    <w:p>
+      <w:r>
+        <w:t>EtCO2 provides clinically available context for interpreting intraoperative cerebral oxygenation during off-pump coronary bypass. If the association is supported by sensitivity analyses and external cohorts, EtCO2 may become a useful component of physiology-guided interpretation of cerebral oximetry. Prospective studies with PaCO2 measurement, prespecified EtCO2 protocols, and clinical endpoints are needed before this approach can be tested as a management strategy.</w:t>
       </w:r>
     </w:p>
     <w:p>
@@ -539,7 +549,7 @@
     </w:p>
     <w:p>
       <w:r>
-        <w:t>In high-frequency intraoperative data from off-pump coronary bypass surgery, EtCO2 showed a consistent, nonlinear, and clinically interpretable association with regional tissue oxygenation. A 5 mmHg higher EtCO2 was associated with nearly 3 percentage points higher left and right SctO2, exceeding the comparable associations observed for FiO2 and temperature in the current analysis. SftO2 showed a smaller but positive association. These results support EtCO2 as an important variable for interpreting intraoperative tissue oxygenation, while leaving causal targets and patient-outcome effects to future prospective studies.</w:t>
+        <w:t>In high-frequency intraoperative data from off-pump coronary bypass surgery, EtCO2 showed a nonlinear and clinically interpretable association with regional tissue oxygenation. A 5 mmHg higher EtCO2 was associated with nearly 3 percentage points higher left and right SctO2, exceeding the comparable associations observed for FiO2 and temperature in the current analysis. SftO2 showed a smaller but positive association. These results support EtCO2 as context for interpreting intraoperative cerebral oximetry, while leaving causal targets and patient-outcome effects to future prospective studies.</w:t>
       </w:r>
     </w:p>
     <w:p>
@@ -563,7 +573,7 @@
         <w:pStyle w:val="ListNumber"/>
       </w:pPr>
       <w:r>
-        <w:t>Mutch, W. A. C. et al. Cerebral oxygen saturation: graded response to carbon dioxide with isoxia and graded response to oxygen with isocapnia. PLoS ONE 8, e57881 (2013). https://pubmed.ncbi.nlm.nih.gov/23469096/</w:t>
+        <w:t>Mutch, W. A. C. et al. Cerebral oxygen saturation: graded response to carbon dioxide with isoxia and graded response to oxygen with isocapnia. PLoS ONE 8, e57881 (2013). https://doi.org/10.1371/journal.pone.0057881</w:t>
       </w:r>
     </w:p>
     <w:p>
@@ -571,7 +581,7 @@
         <w:pStyle w:val="ListNumber"/>
       </w:pPr>
       <w:r>
-        <w:t>Park, C. S. et al. Near-infrared spectroscopy as a possible device for continuous monitoring of arterial carbon dioxide tension during cardiac surgery. Perfusion 26, 524-528 (2011). https://pubmed.ncbi.nlm.nih.gov/21844113/</w:t>
+        <w:t>Ki, S. H. et al. Quantitative analysis of the effect of end-tidal carbon dioxide on regional cerebral oxygen saturation in patients undergoing carotid endarterectomy under general anaesthesia. British Journal of Clinical Pharmacology 84, 292-300 (2018). https://doi.org/10.1111/bcp.13441</w:t>
       </w:r>
     </w:p>
     <w:p>
@@ -579,7 +589,7 @@
         <w:pStyle w:val="ListNumber"/>
       </w:pPr>
       <w:r>
-        <w:t>Quantitative analysis of the effect of end-tidal carbon dioxide on regional cerebral oxygen saturation in patients undergoing carotid endarterectomy under general anaesthesia. https://pmc.ncbi.nlm.nih.gov/articles/PMC5777433/</w:t>
+        <w:t>Park, C. S. et al. Near-infrared spectroscopy as a possible device for continuous monitoring of arterial carbon dioxide tension during cardiac surgery. Perfusion 26, 524-528 (2011). https://doi.org/10.1177/0267659111419034</w:t>
       </w:r>
     </w:p>
     <w:p>
@@ -587,7 +597,7 @@
         <w:pStyle w:val="ListNumber"/>
       </w:pPr>
       <w:r>
-        <w:t>A pilot randomized controlled study of mild hypercapnia during cardiac surgery with cardiopulmonary bypass. https://research.monash.edu/en/publications/a-pilot-randomized-controlled-study-of-mild-hypercapnia-during-ca</w:t>
+        <w:t>Chan, M. J. et al. A Pilot Randomized Controlled Study of Mild Hypercapnia During Cardiac Surgery With Cardiopulmonary Bypass. Journal of Cardiothoracic and Vascular Anesthesia 33, 2968-2978 (2019). https://doi.org/10.1053/j.jvca.2019.03.012</w:t>
       </w:r>
     </w:p>
     <w:p>
@@ -595,7 +605,15 @@
         <w:pStyle w:val="ListNumber"/>
       </w:pPr>
       <w:r>
-        <w:t>Prospective randomized pilot trial on the effects of mild hypercapnia on cerebral oxygen saturation in patients undergoing off-pump coronary artery bypass grafting. https://www.sciencedirect.com/science/article/pii/S1053077024001563</w:t>
+        <w:t>Bhandari, C., Gandhi, H., Panwar, A., Haranal, M. &amp; Pandya, H. Prospective Randomized Pilot Trial on the Effects of Mild Hypercapnia on Cerebral Oxygen Saturation in Patients Undergoing Off-Pump Coronary Artery Bypass Grafting. Journal of Cardiothoracic and Vascular Anesthesia 38, 1322-1327 (2024). https://doi.org/10.1053/j.jvca.2024.02.034</w:t>
+      </w:r>
+    </w:p>
+    <w:p>
+      <w:pPr>
+        <w:pStyle w:val="ListNumber"/>
+      </w:pPr>
+      <w:r>
+        <w:t>Han, J. et al. Care guided by tissue oxygenation and haemodynamic monitoring in off-pump coronary artery bypass grafting (Bottomline-CS): assessor blind, single centre, randomised controlled trial. BMJ 388, e082104 (2025). https://doi.org/10.1136/bmj-2024-082104</w:t>
       </w:r>
     </w:p>
     <w:p>

</xml_diff>

<commit_message>
Add local CO2 Table 1 outputs
</commit_message>
<xml_diff>
--- a/docs/manuscript_development/CO2_MANUSCRIPT_DRAFT_V1.docx
+++ b/docs/manuscript_development/CO2_MANUSCRIPT_DRAFT_V1.docx
@@ -386,7 +386,7 @@
     </w:p>
     <w:p>
       <w:r>
-        <w:t xml:space="preserve">[Insert Table 1/2 from </w:t>
+        <w:t xml:space="preserve">[Insert Table 1/2 from the local workbook </w:t>
       </w:r>
       <w:r>
         <w:rPr>
@@ -396,7 +396,7 @@
         <w:t>results/manuscript_tables/table1_2_co2_rso2.xlsx</w:t>
       </w:r>
       <w:r>
-        <w:t xml:space="preserve"> after the generated files are pulled back into the local mirror.]</w:t>
+        <w:t>. Supporting flow-count, long-format, wide-format, and available-column CSV files are in the same directory.]</w:t>
       </w:r>
     </w:p>
     <w:p>

</xml_diff>

<commit_message>
Generate manuscript Table 1 assets
</commit_message>
<xml_diff>
--- a/docs/manuscript_development/CO2_MANUSCRIPT_DRAFT_V1.docx
+++ b/docs/manuscript_development/CO2_MANUSCRIPT_DRAFT_V1.docx
@@ -386,17 +386,37 @@
     </w:p>
     <w:p>
       <w:r>
-        <w:t xml:space="preserve">[Insert Table 1/2 from the local workbook </w:t>
+        <w:t xml:space="preserve">[Insert Table 1 from </w:t>
       </w:r>
       <w:r>
         <w:rPr>
           <w:rFonts w:ascii="Consolas" w:hAnsi="Consolas"/>
           <w:sz w:val="20"/>
         </w:rPr>
-        <w:t>results/manuscript_tables/table1_2_co2_rso2.xlsx</w:t>
+        <w:t>docs/manuscript_development/generated_assets/table1_cohort_characteristics.xlsx</w:t>
       </w:r>
       <w:r>
-        <w:t>. Supporting flow-count, long-format, wide-format, and available-column CSV files are in the same directory.]</w:t>
+        <w:t xml:space="preserve">. The full baseline, intraoperative, and flow-count tables are available as Supplementary eTable 1/2 in </w:t>
+      </w:r>
+      <w:r>
+        <w:rPr>
+          <w:rFonts w:ascii="Consolas" w:hAnsi="Consolas"/>
+          <w:sz w:val="20"/>
+        </w:rPr>
+        <w:t>docs/manuscript_development/generated_assets/supplementary_etable1_2_cohort_characteristics.xlsx</w:t>
+      </w:r>
+      <w:r>
+        <w:t xml:space="preserve">. The source-coded </w:t>
+      </w:r>
+      <w:r>
+        <w:rPr>
+          <w:rFonts w:ascii="Consolas" w:hAnsi="Consolas"/>
+          <w:sz w:val="20"/>
+        </w:rPr>
+        <w:t>SEX=1</w:t>
+      </w:r>
+      <w:r>
+        <w:t xml:space="preserve"> row requires final data-dictionary confirmation before journal submission.]</w:t>
       </w:r>
     </w:p>
     <w:p>

</xml_diff>

<commit_message>
Document sensitivity analysis decision
</commit_message>
<xml_diff>
--- a/docs/manuscript_development/CO2_MANUSCRIPT_DRAFT_V1.docx
+++ b/docs/manuscript_development/CO2_MANUSCRIPT_DRAFT_V1.docx
@@ -505,19 +505,6 @@
     </w:p>
     <w:p>
       <w:pPr>
-        <w:pStyle w:val="Heading2"/>
-      </w:pPr>
-      <w:r>
-        <w:t>Sensitivity analyses remain incomplete</w:t>
-      </w:r>
-    </w:p>
-    <w:p>
-      <w:r>
-        <w:t>Planned sensitivity analyses across alternative ventilatory and hemodynamic specifications were not available in the current analysis package and should be completed before any robustness claim is made. These analyses should either be completed before submission or removed from the manuscript and supplement.</w:t>
-      </w:r>
-    </w:p>
-    <w:p>
-      <w:pPr>
         <w:pStyle w:val="Heading1"/>
       </w:pPr>
       <w:r>
@@ -551,7 +538,7 @@
     </w:p>
     <w:p>
       <w:r>
-        <w:t>The claim has clear limits. EtCO2 is not PaCO2. It is influenced by ventilation, dead space, pulmonary blood flow, cardiac output, and ventilation-perfusion matching, so residual confounding by perfusion and gas exchange cannot be eliminated. The study is observational, and the modeled association should not be interpreted as proof that raising EtCO2 will raise cerebral oxygenation in a given patient. The analysis does not identify an optimal EtCO2 range, does not test postoperative neurological outcomes, and does not yet include the full planned sensitivity package. Current comparisons are limited to EtCO2, FiO2, and temperature; broader comparisons with all intraoperative hemodynamic and ventilatory variables require completed all-intraop models. The manuscript should therefore make a physiologic and interpretive claim, not a therapeutic claim.</w:t>
+        <w:t>The claim has clear limits. EtCO2 is not PaCO2. It is influenced by ventilation, dead space, pulmonary blood flow, cardiac output, and ventilation-perfusion matching, so residual confounding by perfusion and gas exchange cannot be eliminated. The study is observational, and the modeled association should not be interpreted as proof that raising EtCO2 will raise cerebral oxygenation in a given patient. The analysis does not identify an optimal EtCO2 range and does not test postoperative neurological outcomes. Current comparisons are limited to EtCO2, FiO2, and temperature; broader comparisons with all intraoperative hemodynamic and ventilatory variables would require completed all-intraoperative models. The manuscript should therefore make a physiologic and interpretive claim, not a therapeutic claim.</w:t>
       </w:r>
     </w:p>
     <w:p>

</xml_diff>

<commit_message>
Confirm male label for manuscript Table 1
</commit_message>
<xml_diff>
--- a/docs/manuscript_development/CO2_MANUSCRIPT_DRAFT_V1.docx
+++ b/docs/manuscript_development/CO2_MANUSCRIPT_DRAFT_V1.docx
@@ -406,7 +406,7 @@
         <w:t>docs/manuscript_development/generated_assets/supplementary_etable1_2_cohort_characteristics.xlsx</w:t>
       </w:r>
       <w:r>
-        <w:t xml:space="preserve">. The source-coded </w:t>
+        <w:t xml:space="preserve">. The sex label audit supports reporting the source-coded </w:t>
       </w:r>
       <w:r>
         <w:rPr>
@@ -416,7 +416,7 @@
         <w:t>SEX=1</w:t>
       </w:r>
       <w:r>
-        <w:t xml:space="preserve"> row requires final data-dictionary confirmation before journal submission.]</w:t>
+        <w:t xml:space="preserve"> row as male.]</w:t>
       </w:r>
     </w:p>
     <w:p>

</xml_diff>

<commit_message>
Add CO2 submission statements template
</commit_message>
<xml_diff>
--- a/docs/manuscript_development/CO2_MANUSCRIPT_DRAFT_V1.docx
+++ b/docs/manuscript_development/CO2_MANUSCRIPT_DRAFT_V1.docx
@@ -628,71 +628,121 @@
         <w:pStyle w:val="Heading1"/>
       </w:pPr>
       <w:r>
-        <w:t>Author-side items not filled</w:t>
+        <w:t>Author Information and Declarations</w:t>
       </w:r>
     </w:p>
     <w:p>
       <w:pPr>
-        <w:pStyle w:val="ListBullet"/>
+        <w:pStyle w:val="Heading2"/>
       </w:pPr>
       <w:r>
-        <w:t>final author list and order;</w:t>
+        <w:t>Author list and affiliations</w:t>
+      </w:r>
+    </w:p>
+    <w:p>
+      <w:r>
+        <w:t>[Insert the confirmed CO2 manuscript author list, order, affiliations, and ORCID identifiers. Do not copy the prior MAP/CI author block unless the author group and order are confirmed.]</w:t>
       </w:r>
     </w:p>
     <w:p>
       <w:pPr>
-        <w:pStyle w:val="ListBullet"/>
+        <w:pStyle w:val="Heading2"/>
       </w:pPr>
       <w:r>
-        <w:t>corresponding author;</w:t>
+        <w:t>Ethics approval and consent to participate</w:t>
+      </w:r>
+    </w:p>
+    <w:p>
+      <w:r>
+        <w:t>[Insert the institutional review board name, approval number, approval date, and consent/waiver wording for the CO2 analysis. The current draft uses parent-cohort language from the prior MAP/CI manuscript and Bottomline-CS trial registration (</w:t>
+      </w:r>
+      <w:r>
+        <w:rPr>
+          <w:rFonts w:ascii="Consolas" w:hAnsi="Consolas"/>
+          <w:sz w:val="20"/>
+        </w:rPr>
+        <w:t>NCT04896736</w:t>
+      </w:r>
+      <w:r>
+        <w:t>), but the exact ethics statement must be confirmed before submission.]</w:t>
       </w:r>
     </w:p>
     <w:p>
       <w:pPr>
-        <w:pStyle w:val="ListBullet"/>
+        <w:pStyle w:val="Heading2"/>
       </w:pPr>
       <w:r>
-        <w:t>funding statement;</w:t>
+        <w:t>Funding</w:t>
+      </w:r>
+    </w:p>
+    <w:p>
+      <w:r>
+        <w:t>[Insert the confirmed funding statement for the CO2 manuscript. The prior MAP/CI manuscript reported institutional/departmental support at Tianjin Chest Hospital, affiliated with Tianjin University and Indiana University School of Medicine, with no other funding sources; use that wording only if it applies to the CO2 analysis.]</w:t>
       </w:r>
     </w:p>
     <w:p>
       <w:pPr>
-        <w:pStyle w:val="ListBullet"/>
+        <w:pStyle w:val="Heading2"/>
       </w:pPr>
       <w:r>
-        <w:t>conflict of interest statement;</w:t>
+        <w:t>Competing interests</w:t>
+      </w:r>
+    </w:p>
+    <w:p>
+      <w:r>
+        <w:t>[Insert the confirmed competing-interests statement. Do not state that the authors have no competing interests until all authors have confirmed.]</w:t>
       </w:r>
     </w:p>
     <w:p>
       <w:pPr>
-        <w:pStyle w:val="ListBullet"/>
+        <w:pStyle w:val="Heading2"/>
       </w:pPr>
       <w:r>
-        <w:t>ethics approval details;</w:t>
+        <w:t>Author contributions</w:t>
+      </w:r>
+    </w:p>
+    <w:p>
+      <w:r>
+        <w:t>[Insert contribution roles after the author list is final. Suggested role categories: conceptualization, data curation, formal analysis, methodology, software, validation, visualization, writing-original draft, writing-review and editing, supervision, and project administration.]</w:t>
       </w:r>
     </w:p>
     <w:p>
       <w:pPr>
-        <w:pStyle w:val="ListBullet"/>
+        <w:pStyle w:val="Heading2"/>
       </w:pPr>
       <w:r>
-        <w:t>data availability statement;</w:t>
+        <w:t>Data availability</w:t>
+      </w:r>
+    </w:p>
+    <w:p>
+      <w:r>
+        <w:t>[Insert the confirmed data availability statement. Patient-level intraoperative data are expected to be restricted because they derive from clinical records; state the access pathway, approval requirements, and contact point only after confirmation.]</w:t>
       </w:r>
     </w:p>
     <w:p>
       <w:pPr>
-        <w:pStyle w:val="ListBullet"/>
+        <w:pStyle w:val="Heading2"/>
       </w:pPr>
       <w:r>
-        <w:t>code availability statement;</w:t>
+        <w:t>Code availability</w:t>
+      </w:r>
+    </w:p>
+    <w:p>
+      <w:r>
+        <w:t>[Insert the confirmed code availability statement. Archive the CO2-rSO2 repository at the final submission commit hash and state whether the repository is public, private, or available on reasonable request.]</w:t>
       </w:r>
     </w:p>
     <w:p>
       <w:pPr>
-        <w:pStyle w:val="ListBullet"/>
+        <w:pStyle w:val="Heading2"/>
       </w:pPr>
       <w:r>
-        <w:t>author contributions.</w:t>
+        <w:t>Acknowledgements</w:t>
+      </w:r>
+    </w:p>
+    <w:p>
+      <w:r>
+        <w:t>[Insert acknowledgements after author and funding confirmation.]</w:t>
       </w:r>
     </w:p>
     <w:sectPr>

</xml_diff>

<commit_message>
Add EtCO2-focused main figure assets
</commit_message>
<xml_diff>
--- a/docs/manuscript_development/CO2_MANUSCRIPT_DRAFT_V1.docx
+++ b/docs/manuscript_development/CO2_MANUSCRIPT_DRAFT_V1.docx
@@ -124,7 +124,7 @@
         <w:pStyle w:val="ListBullet"/>
       </w:pPr>
       <w:r>
-        <w:t>Figure 1. Cohort assembly and intraoperative EtCO2/rSO2 distributions.</w:t>
+        <w:t>Figure 1. Cohort assembly by tissue oxygenation channel.</w:t>
       </w:r>
     </w:p>
     <w:p>
@@ -420,6 +420,31 @@
       </w:r>
     </w:p>
     <w:p>
+      <w:r>
+        <w:t xml:space="preserve">[Insert Figure 1: </w:t>
+      </w:r>
+      <w:r>
+        <w:rPr>
+          <w:rFonts w:ascii="Consolas" w:hAnsi="Consolas"/>
+          <w:sz w:val="20"/>
+        </w:rPr>
+        <w:t>docs/manuscript_development/generated_assets/figure1_cohort_flow.png</w:t>
+      </w:r>
+      <w:r>
+        <w:t xml:space="preserve">. Source data: </w:t>
+      </w:r>
+      <w:r>
+        <w:rPr>
+          <w:rFonts w:ascii="Consolas" w:hAnsi="Consolas"/>
+          <w:sz w:val="20"/>
+        </w:rPr>
+        <w:t>docs/manuscript_development/generated_assets/source_data_figure1_cohort_flow.csv</w:t>
+      </w:r>
+      <w:r>
+        <w:t>.]</w:t>
+      </w:r>
+    </w:p>
+    <w:p>
       <w:pPr>
         <w:pStyle w:val="Heading2"/>
       </w:pPr>
@@ -488,6 +513,31 @@
       </w:r>
       <w:r>
         <w:t>. Bands show uncertainty intervals derived from archived prediction matrices; the bootstrap construction and sampling unit are described in the Supplement.]</w:t>
+      </w:r>
+    </w:p>
+    <w:p>
+      <w:r>
+        <w:t xml:space="preserve">[Insert Figure 4: </w:t>
+      </w:r>
+      <w:r>
+        <w:rPr>
+          <w:rFonts w:ascii="Consolas" w:hAnsi="Consolas"/>
+          <w:sz w:val="20"/>
+        </w:rPr>
+        <w:t>generated_assets/figure4_etco2_local_slopes.png</w:t>
+      </w:r>
+      <w:r>
+        <w:t xml:space="preserve">. Source data: </w:t>
+      </w:r>
+      <w:r>
+        <w:rPr>
+          <w:rFonts w:ascii="Consolas" w:hAnsi="Consolas"/>
+          <w:sz w:val="20"/>
+        </w:rPr>
+        <w:t>generated_assets/source_data_figure4_etco2_local_slopes.csv</w:t>
+      </w:r>
+      <w:r>
+        <w:t>. Local slopes are descriptive model summaries from EtCO2 decile bins.]</w:t>
       </w:r>
     </w:p>
     <w:p>

</xml_diff>

<commit_message>
Add CO2 reference audit
</commit_message>
<xml_diff>
--- a/docs/manuscript_development/CO2_MANUSCRIPT_DRAFT_V1.docx
+++ b/docs/manuscript_development/CO2_MANUSCRIPT_DRAFT_V1.docx
@@ -614,7 +614,7 @@
         <w:pStyle w:val="Heading1"/>
       </w:pPr>
       <w:r>
-        <w:t>References to verify and format</w:t>
+        <w:t>References</w:t>
       </w:r>
     </w:p>
     <w:p>
@@ -671,6 +671,21 @@
       </w:pPr>
       <w:r>
         <w:t>Han, J. et al. Care guided by tissue oxygenation and haemodynamic monitoring in off-pump coronary artery bypass grafting (Bottomline-CS): assessor blind, single centre, randomised controlled trial. BMJ 388, e082104 (2025). https://doi.org/10.1136/bmj-2024-082104</w:t>
+      </w:r>
+    </w:p>
+    <w:p>
+      <w:r>
+        <w:t xml:space="preserve">Reference verification status is documented in </w:t>
+      </w:r>
+      <w:r>
+        <w:rPr>
+          <w:rFonts w:ascii="Consolas" w:hAnsi="Consolas"/>
+          <w:sz w:val="20"/>
+        </w:rPr>
+        <w:t>docs/manuscript_development/CO2_REFERENCE_AUDIT.md</w:t>
+      </w:r>
+      <w:r>
+        <w:t>.</w:t>
       </w:r>
     </w:p>
     <w:p>

</xml_diff>

<commit_message>
Embed CO2 manuscript display items
</commit_message>
<xml_diff>
--- a/docs/manuscript_development/CO2_MANUSCRIPT_DRAFT_V1.docx
+++ b/docs/manuscript_development/CO2_MANUSCRIPT_DRAFT_V1.docx
@@ -385,65 +385,2372 @@
       </w:r>
     </w:p>
     <w:p>
-      <w:r>
-        <w:t xml:space="preserve">[Insert Table 1 from </w:t>
-      </w:r>
+      <w:pPr>
+        <w:spacing w:before="200" w:after="80"/>
+      </w:pPr>
       <w:r>
         <w:rPr>
-          <w:rFonts w:ascii="Consolas" w:hAnsi="Consolas"/>
-          <w:sz w:val="20"/>
+          <w:b/>
         </w:rPr>
-        <w:t>docs/manuscript_development/generated_assets/table1_cohort_characteristics.xlsx</w:t>
-      </w:r>
-      <w:r>
-        <w:t xml:space="preserve">. The full baseline, intraoperative, and flow-count tables are available as Supplementary eTable 1/2 in </w:t>
-      </w:r>
-      <w:r>
-        <w:rPr>
-          <w:rFonts w:ascii="Consolas" w:hAnsi="Consolas"/>
-          <w:sz w:val="20"/>
-        </w:rPr>
-        <w:t>docs/manuscript_development/generated_assets/supplementary_etable1_2_cohort_characteristics.xlsx</w:t>
-      </w:r>
-      <w:r>
-        <w:t xml:space="preserve">. The sex label audit supports reporting the source-coded </w:t>
-      </w:r>
-      <w:r>
-        <w:rPr>
-          <w:rFonts w:ascii="Consolas" w:hAnsi="Consolas"/>
-          <w:sz w:val="20"/>
-        </w:rPr>
-        <w:t>SEX=1</w:t>
-      </w:r>
-      <w:r>
-        <w:t xml:space="preserve"> row as male.]</w:t>
+        <w:t>Table 1 | Cohort characteristics.</w:t>
       </w:r>
     </w:p>
     <w:p>
+      <w:pPr>
+        <w:spacing w:after="120"/>
+      </w:pPr>
       <w:r>
-        <w:t xml:space="preserve">[Insert Figure 1: </w:t>
+        <w:t>Values are shown by channel-specific analytic cohort. Continuous variables are mean (s.d.); categorical variables are n (%). SctO2, cerebral tissue oxygen saturation; SftO2, forearm tissue oxygen saturation.</w:t>
       </w:r>
+    </w:p>
+    <w:tbl>
+      <w:tblPr>
+        <w:tblW w:type="auto" w:w="0"/>
+        <w:tblLook w:firstColumn="1" w:firstRow="1" w:lastColumn="0" w:lastRow="0" w:noHBand="0" w:noVBand="1" w:val="04A0"/>
+        <w:tblW w:w="9360" w:type="dxa"/>
+        <w:tblInd w:w="120" w:type="dxa"/>
+      </w:tblPr>
+      <w:tblGrid>
+        <w:gridCol w:w="2340"/>
+        <w:gridCol w:w="2340"/>
+        <w:gridCol w:w="2340"/>
+        <w:gridCol w:w="2340"/>
+      </w:tblGrid>
+      <w:tr>
+        <w:tc>
+          <w:tcPr>
+            <w:tcW w:type="dxa" w:w="2340"/>
+            <w:tcMar>
+              <w:top w:w="60" w:type="dxa"/>
+              <w:start w:w="90" w:type="dxa"/>
+              <w:bottom w:w="60" w:type="dxa"/>
+              <w:end w:w="90" w:type="dxa"/>
+            </w:tcMar>
+            <w:tcBorders>
+              <w:top w:val="single" w:sz="8" w:color="000000"/>
+              <w:bottom w:val="single" w:sz="8" w:color="000000"/>
+              <w:left w:val="nil"/>
+              <w:right w:val="nil"/>
+            </w:tcBorders>
+          </w:tcPr>
+          <w:p>
+            <w:pPr>
+              <w:spacing w:after="0"/>
+            </w:pPr>
+            <w:r>
+              <w:rPr>
+                <w:b/>
+                <w:sz w:val="14"/>
+              </w:rPr>
+              <w:t>Characteristic</w:t>
+            </w:r>
+          </w:p>
+        </w:tc>
+        <w:tc>
+          <w:tcPr>
+            <w:tcW w:type="dxa" w:w="2340"/>
+            <w:tcMar>
+              <w:top w:w="60" w:type="dxa"/>
+              <w:start w:w="90" w:type="dxa"/>
+              <w:bottom w:w="60" w:type="dxa"/>
+              <w:end w:w="90" w:type="dxa"/>
+            </w:tcMar>
+            <w:tcBorders>
+              <w:top w:val="single" w:sz="8" w:color="000000"/>
+              <w:bottom w:val="single" w:sz="8" w:color="000000"/>
+              <w:left w:val="nil"/>
+              <w:right w:val="nil"/>
+            </w:tcBorders>
+          </w:tcPr>
+          <w:p>
+            <w:pPr>
+              <w:spacing w:after="0"/>
+            </w:pPr>
+            <w:r>
+              <w:rPr>
+                <w:b/>
+                <w:sz w:val="14"/>
+              </w:rPr>
+              <w:t>Left SctO2</w:t>
+            </w:r>
+          </w:p>
+        </w:tc>
+        <w:tc>
+          <w:tcPr>
+            <w:tcW w:type="dxa" w:w="2340"/>
+            <w:tcMar>
+              <w:top w:w="60" w:type="dxa"/>
+              <w:start w:w="90" w:type="dxa"/>
+              <w:bottom w:w="60" w:type="dxa"/>
+              <w:end w:w="90" w:type="dxa"/>
+            </w:tcMar>
+            <w:tcBorders>
+              <w:top w:val="single" w:sz="8" w:color="000000"/>
+              <w:bottom w:val="single" w:sz="8" w:color="000000"/>
+              <w:left w:val="nil"/>
+              <w:right w:val="nil"/>
+            </w:tcBorders>
+          </w:tcPr>
+          <w:p>
+            <w:pPr>
+              <w:spacing w:after="0"/>
+            </w:pPr>
+            <w:r>
+              <w:rPr>
+                <w:b/>
+                <w:sz w:val="14"/>
+              </w:rPr>
+              <w:t>Right SctO2</w:t>
+            </w:r>
+          </w:p>
+        </w:tc>
+        <w:tc>
+          <w:tcPr>
+            <w:tcW w:type="dxa" w:w="2340"/>
+            <w:tcMar>
+              <w:top w:w="60" w:type="dxa"/>
+              <w:start w:w="90" w:type="dxa"/>
+              <w:bottom w:w="60" w:type="dxa"/>
+              <w:end w:w="90" w:type="dxa"/>
+            </w:tcMar>
+            <w:tcBorders>
+              <w:top w:val="single" w:sz="8" w:color="000000"/>
+              <w:bottom w:val="single" w:sz="8" w:color="000000"/>
+              <w:left w:val="nil"/>
+              <w:right w:val="nil"/>
+            </w:tcBorders>
+          </w:tcPr>
+          <w:p>
+            <w:pPr>
+              <w:spacing w:after="0"/>
+            </w:pPr>
+            <w:r>
+              <w:rPr>
+                <w:b/>
+                <w:sz w:val="14"/>
+              </w:rPr>
+              <w:t>SftO2</w:t>
+            </w:r>
+          </w:p>
+        </w:tc>
+      </w:tr>
+      <w:tr>
+        <w:tc>
+          <w:tcPr>
+            <w:tcW w:type="dxa" w:w="2340"/>
+            <w:tcMar>
+              <w:top w:w="60" w:type="dxa"/>
+              <w:start w:w="90" w:type="dxa"/>
+              <w:bottom w:w="60" w:type="dxa"/>
+              <w:end w:w="90" w:type="dxa"/>
+            </w:tcMar>
+            <w:tcBorders>
+              <w:top w:val="nil"/>
+              <w:bottom w:val="nil"/>
+              <w:left w:val="nil"/>
+              <w:right w:val="nil"/>
+            </w:tcBorders>
+          </w:tcPr>
+          <w:p>
+            <w:pPr>
+              <w:spacing w:after="0"/>
+            </w:pPr>
+            <w:r>
+              <w:rPr>
+                <w:sz w:val="14"/>
+              </w:rPr>
+              <w:t>Patients, n</w:t>
+            </w:r>
+          </w:p>
+        </w:tc>
+        <w:tc>
+          <w:tcPr>
+            <w:tcW w:type="dxa" w:w="2340"/>
+            <w:tcMar>
+              <w:top w:w="60" w:type="dxa"/>
+              <w:start w:w="90" w:type="dxa"/>
+              <w:bottom w:w="60" w:type="dxa"/>
+              <w:end w:w="90" w:type="dxa"/>
+            </w:tcMar>
+            <w:tcBorders>
+              <w:top w:val="nil"/>
+              <w:bottom w:val="nil"/>
+              <w:left w:val="nil"/>
+              <w:right w:val="nil"/>
+            </w:tcBorders>
+          </w:tcPr>
+          <w:p>
+            <w:pPr>
+              <w:spacing w:after="0"/>
+            </w:pPr>
+            <w:r>
+              <w:rPr>
+                <w:sz w:val="14"/>
+              </w:rPr>
+              <w:t>1792</w:t>
+            </w:r>
+          </w:p>
+        </w:tc>
+        <w:tc>
+          <w:tcPr>
+            <w:tcW w:type="dxa" w:w="2340"/>
+            <w:tcMar>
+              <w:top w:w="60" w:type="dxa"/>
+              <w:start w:w="90" w:type="dxa"/>
+              <w:bottom w:w="60" w:type="dxa"/>
+              <w:end w:w="90" w:type="dxa"/>
+            </w:tcMar>
+            <w:tcBorders>
+              <w:top w:val="nil"/>
+              <w:bottom w:val="nil"/>
+              <w:left w:val="nil"/>
+              <w:right w:val="nil"/>
+            </w:tcBorders>
+          </w:tcPr>
+          <w:p>
+            <w:pPr>
+              <w:spacing w:after="0"/>
+            </w:pPr>
+            <w:r>
+              <w:rPr>
+                <w:sz w:val="14"/>
+              </w:rPr>
+              <w:t>1792</w:t>
+            </w:r>
+          </w:p>
+        </w:tc>
+        <w:tc>
+          <w:tcPr>
+            <w:tcW w:type="dxa" w:w="2340"/>
+            <w:tcMar>
+              <w:top w:w="60" w:type="dxa"/>
+              <w:start w:w="90" w:type="dxa"/>
+              <w:bottom w:w="60" w:type="dxa"/>
+              <w:end w:w="90" w:type="dxa"/>
+            </w:tcMar>
+            <w:tcBorders>
+              <w:top w:val="nil"/>
+              <w:bottom w:val="nil"/>
+              <w:left w:val="nil"/>
+              <w:right w:val="nil"/>
+            </w:tcBorders>
+          </w:tcPr>
+          <w:p>
+            <w:pPr>
+              <w:spacing w:after="0"/>
+            </w:pPr>
+            <w:r>
+              <w:rPr>
+                <w:sz w:val="14"/>
+              </w:rPr>
+              <w:t>1789</w:t>
+            </w:r>
+          </w:p>
+        </w:tc>
+      </w:tr>
+      <w:tr>
+        <w:tc>
+          <w:tcPr>
+            <w:tcW w:type="dxa" w:w="2340"/>
+            <w:tcMar>
+              <w:top w:w="60" w:type="dxa"/>
+              <w:start w:w="90" w:type="dxa"/>
+              <w:bottom w:w="60" w:type="dxa"/>
+              <w:end w:w="90" w:type="dxa"/>
+            </w:tcMar>
+            <w:tcBorders>
+              <w:top w:val="nil"/>
+              <w:bottom w:val="nil"/>
+              <w:left w:val="nil"/>
+              <w:right w:val="nil"/>
+            </w:tcBorders>
+          </w:tcPr>
+          <w:p>
+            <w:pPr>
+              <w:spacing w:after="0"/>
+            </w:pPr>
+            <w:r>
+              <w:rPr>
+                <w:sz w:val="14"/>
+              </w:rPr>
+              <w:t>Timestamp-level observations, n</w:t>
+            </w:r>
+          </w:p>
+        </w:tc>
+        <w:tc>
+          <w:tcPr>
+            <w:tcW w:type="dxa" w:w="2340"/>
+            <w:tcMar>
+              <w:top w:w="60" w:type="dxa"/>
+              <w:start w:w="90" w:type="dxa"/>
+              <w:bottom w:w="60" w:type="dxa"/>
+              <w:end w:w="90" w:type="dxa"/>
+            </w:tcMar>
+            <w:tcBorders>
+              <w:top w:val="nil"/>
+              <w:bottom w:val="nil"/>
+              <w:left w:val="nil"/>
+              <w:right w:val="nil"/>
+            </w:tcBorders>
+          </w:tcPr>
+          <w:p>
+            <w:pPr>
+              <w:spacing w:after="0"/>
+            </w:pPr>
+            <w:r>
+              <w:rPr>
+                <w:sz w:val="14"/>
+              </w:rPr>
+              <w:t>20,021,703</w:t>
+            </w:r>
+          </w:p>
+        </w:tc>
+        <w:tc>
+          <w:tcPr>
+            <w:tcW w:type="dxa" w:w="2340"/>
+            <w:tcMar>
+              <w:top w:w="60" w:type="dxa"/>
+              <w:start w:w="90" w:type="dxa"/>
+              <w:bottom w:w="60" w:type="dxa"/>
+              <w:end w:w="90" w:type="dxa"/>
+            </w:tcMar>
+            <w:tcBorders>
+              <w:top w:val="nil"/>
+              <w:bottom w:val="nil"/>
+              <w:left w:val="nil"/>
+              <w:right w:val="nil"/>
+            </w:tcBorders>
+          </w:tcPr>
+          <w:p>
+            <w:pPr>
+              <w:spacing w:after="0"/>
+            </w:pPr>
+            <w:r>
+              <w:rPr>
+                <w:sz w:val="14"/>
+              </w:rPr>
+              <w:t>20,075,597</w:t>
+            </w:r>
+          </w:p>
+        </w:tc>
+        <w:tc>
+          <w:tcPr>
+            <w:tcW w:type="dxa" w:w="2340"/>
+            <w:tcMar>
+              <w:top w:w="60" w:type="dxa"/>
+              <w:start w:w="90" w:type="dxa"/>
+              <w:bottom w:w="60" w:type="dxa"/>
+              <w:end w:w="90" w:type="dxa"/>
+            </w:tcMar>
+            <w:tcBorders>
+              <w:top w:val="nil"/>
+              <w:bottom w:val="nil"/>
+              <w:left w:val="nil"/>
+              <w:right w:val="nil"/>
+            </w:tcBorders>
+          </w:tcPr>
+          <w:p>
+            <w:pPr>
+              <w:spacing w:after="0"/>
+            </w:pPr>
+            <w:r>
+              <w:rPr>
+                <w:sz w:val="14"/>
+              </w:rPr>
+              <w:t>20,068,759</w:t>
+            </w:r>
+          </w:p>
+        </w:tc>
+      </w:tr>
+      <w:tr>
+        <w:tc>
+          <w:tcPr>
+            <w:tcW w:type="dxa" w:w="2340"/>
+            <w:tcMar>
+              <w:top w:w="60" w:type="dxa"/>
+              <w:start w:w="90" w:type="dxa"/>
+              <w:bottom w:w="60" w:type="dxa"/>
+              <w:end w:w="90" w:type="dxa"/>
+            </w:tcMar>
+            <w:tcBorders>
+              <w:top w:val="nil"/>
+              <w:bottom w:val="nil"/>
+              <w:left w:val="nil"/>
+              <w:right w:val="nil"/>
+            </w:tcBorders>
+          </w:tcPr>
+          <w:p>
+            <w:pPr>
+              <w:spacing w:after="0"/>
+            </w:pPr>
+            <w:r>
+              <w:rPr>
+                <w:sz w:val="14"/>
+              </w:rPr>
+              <w:t>Age, years, mean (s.d.)</w:t>
+            </w:r>
+          </w:p>
+        </w:tc>
+        <w:tc>
+          <w:tcPr>
+            <w:tcW w:type="dxa" w:w="2340"/>
+            <w:tcMar>
+              <w:top w:w="60" w:type="dxa"/>
+              <w:start w:w="90" w:type="dxa"/>
+              <w:bottom w:w="60" w:type="dxa"/>
+              <w:end w:w="90" w:type="dxa"/>
+            </w:tcMar>
+            <w:tcBorders>
+              <w:top w:val="nil"/>
+              <w:bottom w:val="nil"/>
+              <w:left w:val="nil"/>
+              <w:right w:val="nil"/>
+            </w:tcBorders>
+          </w:tcPr>
+          <w:p>
+            <w:pPr>
+              <w:spacing w:after="0"/>
+            </w:pPr>
+            <w:r>
+              <w:rPr>
+                <w:sz w:val="14"/>
+              </w:rPr>
+              <w:t>68.7 (5.3)</w:t>
+            </w:r>
+          </w:p>
+        </w:tc>
+        <w:tc>
+          <w:tcPr>
+            <w:tcW w:type="dxa" w:w="2340"/>
+            <w:tcMar>
+              <w:top w:w="60" w:type="dxa"/>
+              <w:start w:w="90" w:type="dxa"/>
+              <w:bottom w:w="60" w:type="dxa"/>
+              <w:end w:w="90" w:type="dxa"/>
+            </w:tcMar>
+            <w:tcBorders>
+              <w:top w:val="nil"/>
+              <w:bottom w:val="nil"/>
+              <w:left w:val="nil"/>
+              <w:right w:val="nil"/>
+            </w:tcBorders>
+          </w:tcPr>
+          <w:p>
+            <w:pPr>
+              <w:spacing w:after="0"/>
+            </w:pPr>
+            <w:r>
+              <w:rPr>
+                <w:sz w:val="14"/>
+              </w:rPr>
+              <w:t>68.7 (5.3)</w:t>
+            </w:r>
+          </w:p>
+        </w:tc>
+        <w:tc>
+          <w:tcPr>
+            <w:tcW w:type="dxa" w:w="2340"/>
+            <w:tcMar>
+              <w:top w:w="60" w:type="dxa"/>
+              <w:start w:w="90" w:type="dxa"/>
+              <w:bottom w:w="60" w:type="dxa"/>
+              <w:end w:w="90" w:type="dxa"/>
+            </w:tcMar>
+            <w:tcBorders>
+              <w:top w:val="nil"/>
+              <w:bottom w:val="nil"/>
+              <w:left w:val="nil"/>
+              <w:right w:val="nil"/>
+            </w:tcBorders>
+          </w:tcPr>
+          <w:p>
+            <w:pPr>
+              <w:spacing w:after="0"/>
+            </w:pPr>
+            <w:r>
+              <w:rPr>
+                <w:sz w:val="14"/>
+              </w:rPr>
+              <w:t>68.7 (5.3)</w:t>
+            </w:r>
+          </w:p>
+        </w:tc>
+      </w:tr>
+      <w:tr>
+        <w:tc>
+          <w:tcPr>
+            <w:tcW w:type="dxa" w:w="2340"/>
+            <w:tcMar>
+              <w:top w:w="60" w:type="dxa"/>
+              <w:start w:w="90" w:type="dxa"/>
+              <w:bottom w:w="60" w:type="dxa"/>
+              <w:end w:w="90" w:type="dxa"/>
+            </w:tcMar>
+            <w:tcBorders>
+              <w:top w:val="nil"/>
+              <w:bottom w:val="nil"/>
+              <w:left w:val="nil"/>
+              <w:right w:val="nil"/>
+            </w:tcBorders>
+          </w:tcPr>
+          <w:p>
+            <w:pPr>
+              <w:spacing w:after="0"/>
+            </w:pPr>
+            <w:r>
+              <w:rPr>
+                <w:sz w:val="14"/>
+              </w:rPr>
+              <w:t>Body mass index, kg/m2, mean (s.d.)</w:t>
+            </w:r>
+          </w:p>
+        </w:tc>
+        <w:tc>
+          <w:tcPr>
+            <w:tcW w:type="dxa" w:w="2340"/>
+            <w:tcMar>
+              <w:top w:w="60" w:type="dxa"/>
+              <w:start w:w="90" w:type="dxa"/>
+              <w:bottom w:w="60" w:type="dxa"/>
+              <w:end w:w="90" w:type="dxa"/>
+            </w:tcMar>
+            <w:tcBorders>
+              <w:top w:val="nil"/>
+              <w:bottom w:val="nil"/>
+              <w:left w:val="nil"/>
+              <w:right w:val="nil"/>
+            </w:tcBorders>
+          </w:tcPr>
+          <w:p>
+            <w:pPr>
+              <w:spacing w:after="0"/>
+            </w:pPr>
+            <w:r>
+              <w:rPr>
+                <w:sz w:val="14"/>
+              </w:rPr>
+              <w:t>25.3 (3.2)</w:t>
+            </w:r>
+          </w:p>
+        </w:tc>
+        <w:tc>
+          <w:tcPr>
+            <w:tcW w:type="dxa" w:w="2340"/>
+            <w:tcMar>
+              <w:top w:w="60" w:type="dxa"/>
+              <w:start w:w="90" w:type="dxa"/>
+              <w:bottom w:w="60" w:type="dxa"/>
+              <w:end w:w="90" w:type="dxa"/>
+            </w:tcMar>
+            <w:tcBorders>
+              <w:top w:val="nil"/>
+              <w:bottom w:val="nil"/>
+              <w:left w:val="nil"/>
+              <w:right w:val="nil"/>
+            </w:tcBorders>
+          </w:tcPr>
+          <w:p>
+            <w:pPr>
+              <w:spacing w:after="0"/>
+            </w:pPr>
+            <w:r>
+              <w:rPr>
+                <w:sz w:val="14"/>
+              </w:rPr>
+              <w:t>25.3 (3.2)</w:t>
+            </w:r>
+          </w:p>
+        </w:tc>
+        <w:tc>
+          <w:tcPr>
+            <w:tcW w:type="dxa" w:w="2340"/>
+            <w:tcMar>
+              <w:top w:w="60" w:type="dxa"/>
+              <w:start w:w="90" w:type="dxa"/>
+              <w:bottom w:w="60" w:type="dxa"/>
+              <w:end w:w="90" w:type="dxa"/>
+            </w:tcMar>
+            <w:tcBorders>
+              <w:top w:val="nil"/>
+              <w:bottom w:val="nil"/>
+              <w:left w:val="nil"/>
+              <w:right w:val="nil"/>
+            </w:tcBorders>
+          </w:tcPr>
+          <w:p>
+            <w:pPr>
+              <w:spacing w:after="0"/>
+            </w:pPr>
+            <w:r>
+              <w:rPr>
+                <w:sz w:val="14"/>
+              </w:rPr>
+              <w:t>25.3 (3.2)</w:t>
+            </w:r>
+          </w:p>
+        </w:tc>
+      </w:tr>
+      <w:tr>
+        <w:tc>
+          <w:tcPr>
+            <w:tcW w:type="dxa" w:w="2340"/>
+            <w:tcMar>
+              <w:top w:w="60" w:type="dxa"/>
+              <w:start w:w="90" w:type="dxa"/>
+              <w:bottom w:w="60" w:type="dxa"/>
+              <w:end w:w="90" w:type="dxa"/>
+            </w:tcMar>
+            <w:tcBorders>
+              <w:top w:val="nil"/>
+              <w:bottom w:val="nil"/>
+              <w:left w:val="nil"/>
+              <w:right w:val="nil"/>
+            </w:tcBorders>
+          </w:tcPr>
+          <w:p>
+            <w:pPr>
+              <w:spacing w:after="0"/>
+            </w:pPr>
+            <w:r>
+              <w:rPr>
+                <w:sz w:val="14"/>
+              </w:rPr>
+              <w:t>Male, n (%)</w:t>
+            </w:r>
+          </w:p>
+        </w:tc>
+        <w:tc>
+          <w:tcPr>
+            <w:tcW w:type="dxa" w:w="2340"/>
+            <w:tcMar>
+              <w:top w:w="60" w:type="dxa"/>
+              <w:start w:w="90" w:type="dxa"/>
+              <w:bottom w:w="60" w:type="dxa"/>
+              <w:end w:w="90" w:type="dxa"/>
+            </w:tcMar>
+            <w:tcBorders>
+              <w:top w:val="nil"/>
+              <w:bottom w:val="nil"/>
+              <w:left w:val="nil"/>
+              <w:right w:val="nil"/>
+            </w:tcBorders>
+          </w:tcPr>
+          <w:p>
+            <w:pPr>
+              <w:spacing w:after="0"/>
+            </w:pPr>
+            <w:r>
+              <w:rPr>
+                <w:sz w:val="14"/>
+              </w:rPr>
+              <w:t>1255 (70.0%)</w:t>
+            </w:r>
+          </w:p>
+        </w:tc>
+        <w:tc>
+          <w:tcPr>
+            <w:tcW w:type="dxa" w:w="2340"/>
+            <w:tcMar>
+              <w:top w:w="60" w:type="dxa"/>
+              <w:start w:w="90" w:type="dxa"/>
+              <w:bottom w:w="60" w:type="dxa"/>
+              <w:end w:w="90" w:type="dxa"/>
+            </w:tcMar>
+            <w:tcBorders>
+              <w:top w:val="nil"/>
+              <w:bottom w:val="nil"/>
+              <w:left w:val="nil"/>
+              <w:right w:val="nil"/>
+            </w:tcBorders>
+          </w:tcPr>
+          <w:p>
+            <w:pPr>
+              <w:spacing w:after="0"/>
+            </w:pPr>
+            <w:r>
+              <w:rPr>
+                <w:sz w:val="14"/>
+              </w:rPr>
+              <w:t>1255 (70.0%)</w:t>
+            </w:r>
+          </w:p>
+        </w:tc>
+        <w:tc>
+          <w:tcPr>
+            <w:tcW w:type="dxa" w:w="2340"/>
+            <w:tcMar>
+              <w:top w:w="60" w:type="dxa"/>
+              <w:start w:w="90" w:type="dxa"/>
+              <w:bottom w:w="60" w:type="dxa"/>
+              <w:end w:w="90" w:type="dxa"/>
+            </w:tcMar>
+            <w:tcBorders>
+              <w:top w:val="nil"/>
+              <w:bottom w:val="nil"/>
+              <w:left w:val="nil"/>
+              <w:right w:val="nil"/>
+            </w:tcBorders>
+          </w:tcPr>
+          <w:p>
+            <w:pPr>
+              <w:spacing w:after="0"/>
+            </w:pPr>
+            <w:r>
+              <w:rPr>
+                <w:sz w:val="14"/>
+              </w:rPr>
+              <w:t>1254 (70.1%)</w:t>
+            </w:r>
+          </w:p>
+        </w:tc>
+      </w:tr>
+      <w:tr>
+        <w:tc>
+          <w:tcPr>
+            <w:tcW w:type="dxa" w:w="2340"/>
+            <w:tcMar>
+              <w:top w:w="60" w:type="dxa"/>
+              <w:start w:w="90" w:type="dxa"/>
+              <w:bottom w:w="60" w:type="dxa"/>
+              <w:end w:w="90" w:type="dxa"/>
+            </w:tcMar>
+            <w:tcBorders>
+              <w:top w:val="nil"/>
+              <w:bottom w:val="nil"/>
+              <w:left w:val="nil"/>
+              <w:right w:val="nil"/>
+            </w:tcBorders>
+          </w:tcPr>
+          <w:p>
+            <w:pPr>
+              <w:spacing w:after="0"/>
+            </w:pPr>
+            <w:r>
+              <w:rPr>
+                <w:sz w:val="14"/>
+              </w:rPr>
+              <w:t>Diabetes, n (%)</w:t>
+            </w:r>
+          </w:p>
+        </w:tc>
+        <w:tc>
+          <w:tcPr>
+            <w:tcW w:type="dxa" w:w="2340"/>
+            <w:tcMar>
+              <w:top w:w="60" w:type="dxa"/>
+              <w:start w:w="90" w:type="dxa"/>
+              <w:bottom w:w="60" w:type="dxa"/>
+              <w:end w:w="90" w:type="dxa"/>
+            </w:tcMar>
+            <w:tcBorders>
+              <w:top w:val="nil"/>
+              <w:bottom w:val="nil"/>
+              <w:left w:val="nil"/>
+              <w:right w:val="nil"/>
+            </w:tcBorders>
+          </w:tcPr>
+          <w:p>
+            <w:pPr>
+              <w:spacing w:after="0"/>
+            </w:pPr>
+            <w:r>
+              <w:rPr>
+                <w:sz w:val="14"/>
+              </w:rPr>
+              <w:t>770 (43.0%)</w:t>
+            </w:r>
+          </w:p>
+        </w:tc>
+        <w:tc>
+          <w:tcPr>
+            <w:tcW w:type="dxa" w:w="2340"/>
+            <w:tcMar>
+              <w:top w:w="60" w:type="dxa"/>
+              <w:start w:w="90" w:type="dxa"/>
+              <w:bottom w:w="60" w:type="dxa"/>
+              <w:end w:w="90" w:type="dxa"/>
+            </w:tcMar>
+            <w:tcBorders>
+              <w:top w:val="nil"/>
+              <w:bottom w:val="nil"/>
+              <w:left w:val="nil"/>
+              <w:right w:val="nil"/>
+            </w:tcBorders>
+          </w:tcPr>
+          <w:p>
+            <w:pPr>
+              <w:spacing w:after="0"/>
+            </w:pPr>
+            <w:r>
+              <w:rPr>
+                <w:sz w:val="14"/>
+              </w:rPr>
+              <w:t>770 (43.0%)</w:t>
+            </w:r>
+          </w:p>
+        </w:tc>
+        <w:tc>
+          <w:tcPr>
+            <w:tcW w:type="dxa" w:w="2340"/>
+            <w:tcMar>
+              <w:top w:w="60" w:type="dxa"/>
+              <w:start w:w="90" w:type="dxa"/>
+              <w:bottom w:w="60" w:type="dxa"/>
+              <w:end w:w="90" w:type="dxa"/>
+            </w:tcMar>
+            <w:tcBorders>
+              <w:top w:val="nil"/>
+              <w:bottom w:val="nil"/>
+              <w:left w:val="nil"/>
+              <w:right w:val="nil"/>
+            </w:tcBorders>
+          </w:tcPr>
+          <w:p>
+            <w:pPr>
+              <w:spacing w:after="0"/>
+            </w:pPr>
+            <w:r>
+              <w:rPr>
+                <w:sz w:val="14"/>
+              </w:rPr>
+              <w:t>768 (42.9%)</w:t>
+            </w:r>
+          </w:p>
+        </w:tc>
+      </w:tr>
+      <w:tr>
+        <w:tc>
+          <w:tcPr>
+            <w:tcW w:type="dxa" w:w="2340"/>
+            <w:tcMar>
+              <w:top w:w="60" w:type="dxa"/>
+              <w:start w:w="90" w:type="dxa"/>
+              <w:bottom w:w="60" w:type="dxa"/>
+              <w:end w:w="90" w:type="dxa"/>
+            </w:tcMar>
+            <w:tcBorders>
+              <w:top w:val="nil"/>
+              <w:bottom w:val="nil"/>
+              <w:left w:val="nil"/>
+              <w:right w:val="nil"/>
+            </w:tcBorders>
+          </w:tcPr>
+          <w:p>
+            <w:pPr>
+              <w:spacing w:after="0"/>
+            </w:pPr>
+            <w:r>
+              <w:rPr>
+                <w:sz w:val="14"/>
+              </w:rPr>
+              <w:t>Hypertension, n (%)</w:t>
+            </w:r>
+          </w:p>
+        </w:tc>
+        <w:tc>
+          <w:tcPr>
+            <w:tcW w:type="dxa" w:w="2340"/>
+            <w:tcMar>
+              <w:top w:w="60" w:type="dxa"/>
+              <w:start w:w="90" w:type="dxa"/>
+              <w:bottom w:w="60" w:type="dxa"/>
+              <w:end w:w="90" w:type="dxa"/>
+            </w:tcMar>
+            <w:tcBorders>
+              <w:top w:val="nil"/>
+              <w:bottom w:val="nil"/>
+              <w:left w:val="nil"/>
+              <w:right w:val="nil"/>
+            </w:tcBorders>
+          </w:tcPr>
+          <w:p>
+            <w:pPr>
+              <w:spacing w:after="0"/>
+            </w:pPr>
+            <w:r>
+              <w:rPr>
+                <w:sz w:val="14"/>
+              </w:rPr>
+              <w:t>1316 (73.4%)</w:t>
+            </w:r>
+          </w:p>
+        </w:tc>
+        <w:tc>
+          <w:tcPr>
+            <w:tcW w:type="dxa" w:w="2340"/>
+            <w:tcMar>
+              <w:top w:w="60" w:type="dxa"/>
+              <w:start w:w="90" w:type="dxa"/>
+              <w:bottom w:w="60" w:type="dxa"/>
+              <w:end w:w="90" w:type="dxa"/>
+            </w:tcMar>
+            <w:tcBorders>
+              <w:top w:val="nil"/>
+              <w:bottom w:val="nil"/>
+              <w:left w:val="nil"/>
+              <w:right w:val="nil"/>
+            </w:tcBorders>
+          </w:tcPr>
+          <w:p>
+            <w:pPr>
+              <w:spacing w:after="0"/>
+            </w:pPr>
+            <w:r>
+              <w:rPr>
+                <w:sz w:val="14"/>
+              </w:rPr>
+              <w:t>1316 (73.4%)</w:t>
+            </w:r>
+          </w:p>
+        </w:tc>
+        <w:tc>
+          <w:tcPr>
+            <w:tcW w:type="dxa" w:w="2340"/>
+            <w:tcMar>
+              <w:top w:w="60" w:type="dxa"/>
+              <w:start w:w="90" w:type="dxa"/>
+              <w:bottom w:w="60" w:type="dxa"/>
+              <w:end w:w="90" w:type="dxa"/>
+            </w:tcMar>
+            <w:tcBorders>
+              <w:top w:val="nil"/>
+              <w:bottom w:val="nil"/>
+              <w:left w:val="nil"/>
+              <w:right w:val="nil"/>
+            </w:tcBorders>
+          </w:tcPr>
+          <w:p>
+            <w:pPr>
+              <w:spacing w:after="0"/>
+            </w:pPr>
+            <w:r>
+              <w:rPr>
+                <w:sz w:val="14"/>
+              </w:rPr>
+              <w:t>1313 (73.4%)</w:t>
+            </w:r>
+          </w:p>
+        </w:tc>
+      </w:tr>
+      <w:tr>
+        <w:tc>
+          <w:tcPr>
+            <w:tcW w:type="dxa" w:w="2340"/>
+            <w:tcMar>
+              <w:top w:w="60" w:type="dxa"/>
+              <w:start w:w="90" w:type="dxa"/>
+              <w:bottom w:w="60" w:type="dxa"/>
+              <w:end w:w="90" w:type="dxa"/>
+            </w:tcMar>
+            <w:tcBorders>
+              <w:top w:val="nil"/>
+              <w:bottom w:val="nil"/>
+              <w:left w:val="nil"/>
+              <w:right w:val="nil"/>
+            </w:tcBorders>
+          </w:tcPr>
+          <w:p>
+            <w:pPr>
+              <w:spacing w:after="0"/>
+            </w:pPr>
+            <w:r>
+              <w:rPr>
+                <w:sz w:val="14"/>
+              </w:rPr>
+              <w:t>Drinking history, n (%)</w:t>
+            </w:r>
+          </w:p>
+        </w:tc>
+        <w:tc>
+          <w:tcPr>
+            <w:tcW w:type="dxa" w:w="2340"/>
+            <w:tcMar>
+              <w:top w:w="60" w:type="dxa"/>
+              <w:start w:w="90" w:type="dxa"/>
+              <w:bottom w:w="60" w:type="dxa"/>
+              <w:end w:w="90" w:type="dxa"/>
+            </w:tcMar>
+            <w:tcBorders>
+              <w:top w:val="nil"/>
+              <w:bottom w:val="nil"/>
+              <w:left w:val="nil"/>
+              <w:right w:val="nil"/>
+            </w:tcBorders>
+          </w:tcPr>
+          <w:p>
+            <w:pPr>
+              <w:spacing w:after="0"/>
+            </w:pPr>
+            <w:r>
+              <w:rPr>
+                <w:sz w:val="14"/>
+              </w:rPr>
+              <w:t>458 (25.6%)</w:t>
+            </w:r>
+          </w:p>
+        </w:tc>
+        <w:tc>
+          <w:tcPr>
+            <w:tcW w:type="dxa" w:w="2340"/>
+            <w:tcMar>
+              <w:top w:w="60" w:type="dxa"/>
+              <w:start w:w="90" w:type="dxa"/>
+              <w:bottom w:w="60" w:type="dxa"/>
+              <w:end w:w="90" w:type="dxa"/>
+            </w:tcMar>
+            <w:tcBorders>
+              <w:top w:val="nil"/>
+              <w:bottom w:val="nil"/>
+              <w:left w:val="nil"/>
+              <w:right w:val="nil"/>
+            </w:tcBorders>
+          </w:tcPr>
+          <w:p>
+            <w:pPr>
+              <w:spacing w:after="0"/>
+            </w:pPr>
+            <w:r>
+              <w:rPr>
+                <w:sz w:val="14"/>
+              </w:rPr>
+              <w:t>458 (25.6%)</w:t>
+            </w:r>
+          </w:p>
+        </w:tc>
+        <w:tc>
+          <w:tcPr>
+            <w:tcW w:type="dxa" w:w="2340"/>
+            <w:tcMar>
+              <w:top w:w="60" w:type="dxa"/>
+              <w:start w:w="90" w:type="dxa"/>
+              <w:bottom w:w="60" w:type="dxa"/>
+              <w:end w:w="90" w:type="dxa"/>
+            </w:tcMar>
+            <w:tcBorders>
+              <w:top w:val="nil"/>
+              <w:bottom w:val="nil"/>
+              <w:left w:val="nil"/>
+              <w:right w:val="nil"/>
+            </w:tcBorders>
+          </w:tcPr>
+          <w:p>
+            <w:pPr>
+              <w:spacing w:after="0"/>
+            </w:pPr>
+            <w:r>
+              <w:rPr>
+                <w:sz w:val="14"/>
+              </w:rPr>
+              <w:t>458 (25.6%)</w:t>
+            </w:r>
+          </w:p>
+        </w:tc>
+      </w:tr>
+      <w:tr>
+        <w:tc>
+          <w:tcPr>
+            <w:tcW w:type="dxa" w:w="2340"/>
+            <w:tcMar>
+              <w:top w:w="60" w:type="dxa"/>
+              <w:start w:w="90" w:type="dxa"/>
+              <w:bottom w:w="60" w:type="dxa"/>
+              <w:end w:w="90" w:type="dxa"/>
+            </w:tcMar>
+            <w:tcBorders>
+              <w:top w:val="nil"/>
+              <w:bottom w:val="nil"/>
+              <w:left w:val="nil"/>
+              <w:right w:val="nil"/>
+            </w:tcBorders>
+          </w:tcPr>
+          <w:p>
+            <w:pPr>
+              <w:spacing w:after="0"/>
+            </w:pPr>
+            <w:r>
+              <w:rPr>
+                <w:sz w:val="14"/>
+              </w:rPr>
+              <w:t>Haemoglobin, g/L, mean (s.d.)</w:t>
+            </w:r>
+          </w:p>
+        </w:tc>
+        <w:tc>
+          <w:tcPr>
+            <w:tcW w:type="dxa" w:w="2340"/>
+            <w:tcMar>
+              <w:top w:w="60" w:type="dxa"/>
+              <w:start w:w="90" w:type="dxa"/>
+              <w:bottom w:w="60" w:type="dxa"/>
+              <w:end w:w="90" w:type="dxa"/>
+            </w:tcMar>
+            <w:tcBorders>
+              <w:top w:val="nil"/>
+              <w:bottom w:val="nil"/>
+              <w:left w:val="nil"/>
+              <w:right w:val="nil"/>
+            </w:tcBorders>
+          </w:tcPr>
+          <w:p>
+            <w:pPr>
+              <w:spacing w:after="0"/>
+            </w:pPr>
+            <w:r>
+              <w:rPr>
+                <w:sz w:val="14"/>
+              </w:rPr>
+              <w:t>132.1 (15.5)</w:t>
+            </w:r>
+          </w:p>
+        </w:tc>
+        <w:tc>
+          <w:tcPr>
+            <w:tcW w:type="dxa" w:w="2340"/>
+            <w:tcMar>
+              <w:top w:w="60" w:type="dxa"/>
+              <w:start w:w="90" w:type="dxa"/>
+              <w:bottom w:w="60" w:type="dxa"/>
+              <w:end w:w="90" w:type="dxa"/>
+            </w:tcMar>
+            <w:tcBorders>
+              <w:top w:val="nil"/>
+              <w:bottom w:val="nil"/>
+              <w:left w:val="nil"/>
+              <w:right w:val="nil"/>
+            </w:tcBorders>
+          </w:tcPr>
+          <w:p>
+            <w:pPr>
+              <w:spacing w:after="0"/>
+            </w:pPr>
+            <w:r>
+              <w:rPr>
+                <w:sz w:val="14"/>
+              </w:rPr>
+              <w:t>132.1 (15.5)</w:t>
+            </w:r>
+          </w:p>
+        </w:tc>
+        <w:tc>
+          <w:tcPr>
+            <w:tcW w:type="dxa" w:w="2340"/>
+            <w:tcMar>
+              <w:top w:w="60" w:type="dxa"/>
+              <w:start w:w="90" w:type="dxa"/>
+              <w:bottom w:w="60" w:type="dxa"/>
+              <w:end w:w="90" w:type="dxa"/>
+            </w:tcMar>
+            <w:tcBorders>
+              <w:top w:val="nil"/>
+              <w:bottom w:val="nil"/>
+              <w:left w:val="nil"/>
+              <w:right w:val="nil"/>
+            </w:tcBorders>
+          </w:tcPr>
+          <w:p>
+            <w:pPr>
+              <w:spacing w:after="0"/>
+            </w:pPr>
+            <w:r>
+              <w:rPr>
+                <w:sz w:val="14"/>
+              </w:rPr>
+              <w:t>132.1 (15.5)</w:t>
+            </w:r>
+          </w:p>
+        </w:tc>
+      </w:tr>
+      <w:tr>
+        <w:tc>
+          <w:tcPr>
+            <w:tcW w:type="dxa" w:w="2340"/>
+            <w:tcMar>
+              <w:top w:w="60" w:type="dxa"/>
+              <w:start w:w="90" w:type="dxa"/>
+              <w:bottom w:w="60" w:type="dxa"/>
+              <w:end w:w="90" w:type="dxa"/>
+            </w:tcMar>
+            <w:tcBorders>
+              <w:top w:val="nil"/>
+              <w:bottom w:val="nil"/>
+              <w:left w:val="nil"/>
+              <w:right w:val="nil"/>
+            </w:tcBorders>
+          </w:tcPr>
+          <w:p>
+            <w:pPr>
+              <w:spacing w:after="0"/>
+            </w:pPr>
+            <w:r>
+              <w:rPr>
+                <w:sz w:val="14"/>
+              </w:rPr>
+              <w:t>Baseline cardiac index, L/min/m2, mean (s.d.)</w:t>
+            </w:r>
+          </w:p>
+        </w:tc>
+        <w:tc>
+          <w:tcPr>
+            <w:tcW w:type="dxa" w:w="2340"/>
+            <w:tcMar>
+              <w:top w:w="60" w:type="dxa"/>
+              <w:start w:w="90" w:type="dxa"/>
+              <w:bottom w:w="60" w:type="dxa"/>
+              <w:end w:w="90" w:type="dxa"/>
+            </w:tcMar>
+            <w:tcBorders>
+              <w:top w:val="nil"/>
+              <w:bottom w:val="nil"/>
+              <w:left w:val="nil"/>
+              <w:right w:val="nil"/>
+            </w:tcBorders>
+          </w:tcPr>
+          <w:p>
+            <w:pPr>
+              <w:spacing w:after="0"/>
+            </w:pPr>
+            <w:r>
+              <w:rPr>
+                <w:sz w:val="14"/>
+              </w:rPr>
+              <w:t>2.5 (0.8)</w:t>
+            </w:r>
+          </w:p>
+        </w:tc>
+        <w:tc>
+          <w:tcPr>
+            <w:tcW w:type="dxa" w:w="2340"/>
+            <w:tcMar>
+              <w:top w:w="60" w:type="dxa"/>
+              <w:start w:w="90" w:type="dxa"/>
+              <w:bottom w:w="60" w:type="dxa"/>
+              <w:end w:w="90" w:type="dxa"/>
+            </w:tcMar>
+            <w:tcBorders>
+              <w:top w:val="nil"/>
+              <w:bottom w:val="nil"/>
+              <w:left w:val="nil"/>
+              <w:right w:val="nil"/>
+            </w:tcBorders>
+          </w:tcPr>
+          <w:p>
+            <w:pPr>
+              <w:spacing w:after="0"/>
+            </w:pPr>
+            <w:r>
+              <w:rPr>
+                <w:sz w:val="14"/>
+              </w:rPr>
+              <w:t>2.5 (0.8)</w:t>
+            </w:r>
+          </w:p>
+        </w:tc>
+        <w:tc>
+          <w:tcPr>
+            <w:tcW w:type="dxa" w:w="2340"/>
+            <w:tcMar>
+              <w:top w:w="60" w:type="dxa"/>
+              <w:start w:w="90" w:type="dxa"/>
+              <w:bottom w:w="60" w:type="dxa"/>
+              <w:end w:w="90" w:type="dxa"/>
+            </w:tcMar>
+            <w:tcBorders>
+              <w:top w:val="nil"/>
+              <w:bottom w:val="nil"/>
+              <w:left w:val="nil"/>
+              <w:right w:val="nil"/>
+            </w:tcBorders>
+          </w:tcPr>
+          <w:p>
+            <w:pPr>
+              <w:spacing w:after="0"/>
+            </w:pPr>
+            <w:r>
+              <w:rPr>
+                <w:sz w:val="14"/>
+              </w:rPr>
+              <w:t>2.5 (0.8)</w:t>
+            </w:r>
+          </w:p>
+        </w:tc>
+      </w:tr>
+      <w:tr>
+        <w:tc>
+          <w:tcPr>
+            <w:tcW w:type="dxa" w:w="2340"/>
+            <w:tcMar>
+              <w:top w:w="60" w:type="dxa"/>
+              <w:start w:w="90" w:type="dxa"/>
+              <w:bottom w:w="60" w:type="dxa"/>
+              <w:end w:w="90" w:type="dxa"/>
+            </w:tcMar>
+            <w:tcBorders>
+              <w:top w:val="nil"/>
+              <w:bottom w:val="nil"/>
+              <w:left w:val="nil"/>
+              <w:right w:val="nil"/>
+            </w:tcBorders>
+          </w:tcPr>
+          <w:p>
+            <w:pPr>
+              <w:spacing w:after="0"/>
+            </w:pPr>
+            <w:r>
+              <w:rPr>
+                <w:sz w:val="14"/>
+              </w:rPr>
+              <w:t>Baseline mean blood pressure, mmHg, mean (s.d.)</w:t>
+            </w:r>
+          </w:p>
+        </w:tc>
+        <w:tc>
+          <w:tcPr>
+            <w:tcW w:type="dxa" w:w="2340"/>
+            <w:tcMar>
+              <w:top w:w="60" w:type="dxa"/>
+              <w:start w:w="90" w:type="dxa"/>
+              <w:bottom w:w="60" w:type="dxa"/>
+              <w:end w:w="90" w:type="dxa"/>
+            </w:tcMar>
+            <w:tcBorders>
+              <w:top w:val="nil"/>
+              <w:bottom w:val="nil"/>
+              <w:left w:val="nil"/>
+              <w:right w:val="nil"/>
+            </w:tcBorders>
+          </w:tcPr>
+          <w:p>
+            <w:pPr>
+              <w:spacing w:after="0"/>
+            </w:pPr>
+            <w:r>
+              <w:rPr>
+                <w:sz w:val="14"/>
+              </w:rPr>
+              <w:t>90.0 (12.4)</w:t>
+            </w:r>
+          </w:p>
+        </w:tc>
+        <w:tc>
+          <w:tcPr>
+            <w:tcW w:type="dxa" w:w="2340"/>
+            <w:tcMar>
+              <w:top w:w="60" w:type="dxa"/>
+              <w:start w:w="90" w:type="dxa"/>
+              <w:bottom w:w="60" w:type="dxa"/>
+              <w:end w:w="90" w:type="dxa"/>
+            </w:tcMar>
+            <w:tcBorders>
+              <w:top w:val="nil"/>
+              <w:bottom w:val="nil"/>
+              <w:left w:val="nil"/>
+              <w:right w:val="nil"/>
+            </w:tcBorders>
+          </w:tcPr>
+          <w:p>
+            <w:pPr>
+              <w:spacing w:after="0"/>
+            </w:pPr>
+            <w:r>
+              <w:rPr>
+                <w:sz w:val="14"/>
+              </w:rPr>
+              <w:t>90.0 (12.4)</w:t>
+            </w:r>
+          </w:p>
+        </w:tc>
+        <w:tc>
+          <w:tcPr>
+            <w:tcW w:type="dxa" w:w="2340"/>
+            <w:tcMar>
+              <w:top w:w="60" w:type="dxa"/>
+              <w:start w:w="90" w:type="dxa"/>
+              <w:bottom w:w="60" w:type="dxa"/>
+              <w:end w:w="90" w:type="dxa"/>
+            </w:tcMar>
+            <w:tcBorders>
+              <w:top w:val="nil"/>
+              <w:bottom w:val="nil"/>
+              <w:left w:val="nil"/>
+              <w:right w:val="nil"/>
+            </w:tcBorders>
+          </w:tcPr>
+          <w:p>
+            <w:pPr>
+              <w:spacing w:after="0"/>
+            </w:pPr>
+            <w:r>
+              <w:rPr>
+                <w:sz w:val="14"/>
+              </w:rPr>
+              <w:t>89.9 (12.4)</w:t>
+            </w:r>
+          </w:p>
+        </w:tc>
+      </w:tr>
+      <w:tr>
+        <w:tc>
+          <w:tcPr>
+            <w:tcW w:type="dxa" w:w="2340"/>
+            <w:tcMar>
+              <w:top w:w="60" w:type="dxa"/>
+              <w:start w:w="90" w:type="dxa"/>
+              <w:bottom w:w="60" w:type="dxa"/>
+              <w:end w:w="90" w:type="dxa"/>
+            </w:tcMar>
+            <w:tcBorders>
+              <w:top w:val="nil"/>
+              <w:bottom w:val="nil"/>
+              <w:left w:val="nil"/>
+              <w:right w:val="nil"/>
+            </w:tcBorders>
+          </w:tcPr>
+          <w:p>
+            <w:pPr>
+              <w:spacing w:after="0"/>
+            </w:pPr>
+            <w:r>
+              <w:rPr>
+                <w:sz w:val="14"/>
+              </w:rPr>
+              <w:t>EtCO2, mmHg, mean (s.d.)</w:t>
+            </w:r>
+          </w:p>
+        </w:tc>
+        <w:tc>
+          <w:tcPr>
+            <w:tcW w:type="dxa" w:w="2340"/>
+            <w:tcMar>
+              <w:top w:w="60" w:type="dxa"/>
+              <w:start w:w="90" w:type="dxa"/>
+              <w:bottom w:w="60" w:type="dxa"/>
+              <w:end w:w="90" w:type="dxa"/>
+            </w:tcMar>
+            <w:tcBorders>
+              <w:top w:val="nil"/>
+              <w:bottom w:val="nil"/>
+              <w:left w:val="nil"/>
+              <w:right w:val="nil"/>
+            </w:tcBorders>
+          </w:tcPr>
+          <w:p>
+            <w:pPr>
+              <w:spacing w:after="0"/>
+            </w:pPr>
+            <w:r>
+              <w:rPr>
+                <w:sz w:val="14"/>
+              </w:rPr>
+              <w:t>30.1 (4.1)</w:t>
+            </w:r>
+          </w:p>
+        </w:tc>
+        <w:tc>
+          <w:tcPr>
+            <w:tcW w:type="dxa" w:w="2340"/>
+            <w:tcMar>
+              <w:top w:w="60" w:type="dxa"/>
+              <w:start w:w="90" w:type="dxa"/>
+              <w:bottom w:w="60" w:type="dxa"/>
+              <w:end w:w="90" w:type="dxa"/>
+            </w:tcMar>
+            <w:tcBorders>
+              <w:top w:val="nil"/>
+              <w:bottom w:val="nil"/>
+              <w:left w:val="nil"/>
+              <w:right w:val="nil"/>
+            </w:tcBorders>
+          </w:tcPr>
+          <w:p>
+            <w:pPr>
+              <w:spacing w:after="0"/>
+            </w:pPr>
+            <w:r>
+              <w:rPr>
+                <w:sz w:val="14"/>
+              </w:rPr>
+              <w:t>30.1 (4.1)</w:t>
+            </w:r>
+          </w:p>
+        </w:tc>
+        <w:tc>
+          <w:tcPr>
+            <w:tcW w:type="dxa" w:w="2340"/>
+            <w:tcMar>
+              <w:top w:w="60" w:type="dxa"/>
+              <w:start w:w="90" w:type="dxa"/>
+              <w:bottom w:w="60" w:type="dxa"/>
+              <w:end w:w="90" w:type="dxa"/>
+            </w:tcMar>
+            <w:tcBorders>
+              <w:top w:val="nil"/>
+              <w:bottom w:val="nil"/>
+              <w:left w:val="nil"/>
+              <w:right w:val="nil"/>
+            </w:tcBorders>
+          </w:tcPr>
+          <w:p>
+            <w:pPr>
+              <w:spacing w:after="0"/>
+            </w:pPr>
+            <w:r>
+              <w:rPr>
+                <w:sz w:val="14"/>
+              </w:rPr>
+              <w:t>30.1 (4.1)</w:t>
+            </w:r>
+          </w:p>
+        </w:tc>
+      </w:tr>
+      <w:tr>
+        <w:tc>
+          <w:tcPr>
+            <w:tcW w:type="dxa" w:w="2340"/>
+            <w:tcMar>
+              <w:top w:w="60" w:type="dxa"/>
+              <w:start w:w="90" w:type="dxa"/>
+              <w:bottom w:w="60" w:type="dxa"/>
+              <w:end w:w="90" w:type="dxa"/>
+            </w:tcMar>
+            <w:tcBorders>
+              <w:top w:val="nil"/>
+              <w:bottom w:val="nil"/>
+              <w:left w:val="nil"/>
+              <w:right w:val="nil"/>
+            </w:tcBorders>
+          </w:tcPr>
+          <w:p>
+            <w:pPr>
+              <w:spacing w:after="0"/>
+            </w:pPr>
+            <w:r>
+              <w:rPr>
+                <w:sz w:val="14"/>
+              </w:rPr>
+              <w:t>FiO2, %, mean (s.d.)</w:t>
+            </w:r>
+          </w:p>
+        </w:tc>
+        <w:tc>
+          <w:tcPr>
+            <w:tcW w:type="dxa" w:w="2340"/>
+            <w:tcMar>
+              <w:top w:w="60" w:type="dxa"/>
+              <w:start w:w="90" w:type="dxa"/>
+              <w:bottom w:w="60" w:type="dxa"/>
+              <w:end w:w="90" w:type="dxa"/>
+            </w:tcMar>
+            <w:tcBorders>
+              <w:top w:val="nil"/>
+              <w:bottom w:val="nil"/>
+              <w:left w:val="nil"/>
+              <w:right w:val="nil"/>
+            </w:tcBorders>
+          </w:tcPr>
+          <w:p>
+            <w:pPr>
+              <w:spacing w:after="0"/>
+            </w:pPr>
+            <w:r>
+              <w:rPr>
+                <w:sz w:val="14"/>
+              </w:rPr>
+              <w:t>65.4 (14.1)</w:t>
+            </w:r>
+          </w:p>
+        </w:tc>
+        <w:tc>
+          <w:tcPr>
+            <w:tcW w:type="dxa" w:w="2340"/>
+            <w:tcMar>
+              <w:top w:w="60" w:type="dxa"/>
+              <w:start w:w="90" w:type="dxa"/>
+              <w:bottom w:w="60" w:type="dxa"/>
+              <w:end w:w="90" w:type="dxa"/>
+            </w:tcMar>
+            <w:tcBorders>
+              <w:top w:val="nil"/>
+              <w:bottom w:val="nil"/>
+              <w:left w:val="nil"/>
+              <w:right w:val="nil"/>
+            </w:tcBorders>
+          </w:tcPr>
+          <w:p>
+            <w:pPr>
+              <w:spacing w:after="0"/>
+            </w:pPr>
+            <w:r>
+              <w:rPr>
+                <w:sz w:val="14"/>
+              </w:rPr>
+              <w:t>65.4 (14.1)</w:t>
+            </w:r>
+          </w:p>
+        </w:tc>
+        <w:tc>
+          <w:tcPr>
+            <w:tcW w:type="dxa" w:w="2340"/>
+            <w:tcMar>
+              <w:top w:w="60" w:type="dxa"/>
+              <w:start w:w="90" w:type="dxa"/>
+              <w:bottom w:w="60" w:type="dxa"/>
+              <w:end w:w="90" w:type="dxa"/>
+            </w:tcMar>
+            <w:tcBorders>
+              <w:top w:val="nil"/>
+              <w:bottom w:val="nil"/>
+              <w:left w:val="nil"/>
+              <w:right w:val="nil"/>
+            </w:tcBorders>
+          </w:tcPr>
+          <w:p>
+            <w:pPr>
+              <w:spacing w:after="0"/>
+            </w:pPr>
+            <w:r>
+              <w:rPr>
+                <w:sz w:val="14"/>
+              </w:rPr>
+              <w:t>65.4 (14.1)</w:t>
+            </w:r>
+          </w:p>
+        </w:tc>
+      </w:tr>
+      <w:tr>
+        <w:tc>
+          <w:tcPr>
+            <w:tcW w:type="dxa" w:w="2340"/>
+            <w:tcMar>
+              <w:top w:w="60" w:type="dxa"/>
+              <w:start w:w="90" w:type="dxa"/>
+              <w:bottom w:w="60" w:type="dxa"/>
+              <w:end w:w="90" w:type="dxa"/>
+            </w:tcMar>
+            <w:tcBorders>
+              <w:top w:val="nil"/>
+              <w:bottom w:val="nil"/>
+              <w:left w:val="nil"/>
+              <w:right w:val="nil"/>
+            </w:tcBorders>
+          </w:tcPr>
+          <w:p>
+            <w:pPr>
+              <w:spacing w:after="0"/>
+            </w:pPr>
+            <w:r>
+              <w:rPr>
+                <w:sz w:val="14"/>
+              </w:rPr>
+              <w:t>Temperature, C, mean (s.d.)</w:t>
+            </w:r>
+          </w:p>
+        </w:tc>
+        <w:tc>
+          <w:tcPr>
+            <w:tcW w:type="dxa" w:w="2340"/>
+            <w:tcMar>
+              <w:top w:w="60" w:type="dxa"/>
+              <w:start w:w="90" w:type="dxa"/>
+              <w:bottom w:w="60" w:type="dxa"/>
+              <w:end w:w="90" w:type="dxa"/>
+            </w:tcMar>
+            <w:tcBorders>
+              <w:top w:val="nil"/>
+              <w:bottom w:val="nil"/>
+              <w:left w:val="nil"/>
+              <w:right w:val="nil"/>
+            </w:tcBorders>
+          </w:tcPr>
+          <w:p>
+            <w:pPr>
+              <w:spacing w:after="0"/>
+            </w:pPr>
+            <w:r>
+              <w:rPr>
+                <w:sz w:val="14"/>
+              </w:rPr>
+              <w:t>35.5 (0.6)</w:t>
+            </w:r>
+          </w:p>
+        </w:tc>
+        <w:tc>
+          <w:tcPr>
+            <w:tcW w:type="dxa" w:w="2340"/>
+            <w:tcMar>
+              <w:top w:w="60" w:type="dxa"/>
+              <w:start w:w="90" w:type="dxa"/>
+              <w:bottom w:w="60" w:type="dxa"/>
+              <w:end w:w="90" w:type="dxa"/>
+            </w:tcMar>
+            <w:tcBorders>
+              <w:top w:val="nil"/>
+              <w:bottom w:val="nil"/>
+              <w:left w:val="nil"/>
+              <w:right w:val="nil"/>
+            </w:tcBorders>
+          </w:tcPr>
+          <w:p>
+            <w:pPr>
+              <w:spacing w:after="0"/>
+            </w:pPr>
+            <w:r>
+              <w:rPr>
+                <w:sz w:val="14"/>
+              </w:rPr>
+              <w:t>35.5 (0.6)</w:t>
+            </w:r>
+          </w:p>
+        </w:tc>
+        <w:tc>
+          <w:tcPr>
+            <w:tcW w:type="dxa" w:w="2340"/>
+            <w:tcMar>
+              <w:top w:w="60" w:type="dxa"/>
+              <w:start w:w="90" w:type="dxa"/>
+              <w:bottom w:w="60" w:type="dxa"/>
+              <w:end w:w="90" w:type="dxa"/>
+            </w:tcMar>
+            <w:tcBorders>
+              <w:top w:val="nil"/>
+              <w:bottom w:val="nil"/>
+              <w:left w:val="nil"/>
+              <w:right w:val="nil"/>
+            </w:tcBorders>
+          </w:tcPr>
+          <w:p>
+            <w:pPr>
+              <w:spacing w:after="0"/>
+            </w:pPr>
+            <w:r>
+              <w:rPr>
+                <w:sz w:val="14"/>
+              </w:rPr>
+              <w:t>35.5 (0.6)</w:t>
+            </w:r>
+          </w:p>
+        </w:tc>
+      </w:tr>
+      <w:tr>
+        <w:tc>
+          <w:tcPr>
+            <w:tcW w:type="dxa" w:w="2340"/>
+            <w:tcMar>
+              <w:top w:w="60" w:type="dxa"/>
+              <w:start w:w="90" w:type="dxa"/>
+              <w:bottom w:w="60" w:type="dxa"/>
+              <w:end w:w="90" w:type="dxa"/>
+            </w:tcMar>
+            <w:tcBorders>
+              <w:top w:val="nil"/>
+              <w:bottom w:val="nil"/>
+              <w:left w:val="nil"/>
+              <w:right w:val="nil"/>
+            </w:tcBorders>
+          </w:tcPr>
+          <w:p>
+            <w:pPr>
+              <w:spacing w:after="0"/>
+            </w:pPr>
+            <w:r>
+              <w:rPr>
+                <w:sz w:val="14"/>
+              </w:rPr>
+              <w:t>Intraoperative MAP, mmHg, mean (s.d.)</w:t>
+            </w:r>
+          </w:p>
+        </w:tc>
+        <w:tc>
+          <w:tcPr>
+            <w:tcW w:type="dxa" w:w="2340"/>
+            <w:tcMar>
+              <w:top w:w="60" w:type="dxa"/>
+              <w:start w:w="90" w:type="dxa"/>
+              <w:bottom w:w="60" w:type="dxa"/>
+              <w:end w:w="90" w:type="dxa"/>
+            </w:tcMar>
+            <w:tcBorders>
+              <w:top w:val="nil"/>
+              <w:bottom w:val="nil"/>
+              <w:left w:val="nil"/>
+              <w:right w:val="nil"/>
+            </w:tcBorders>
+          </w:tcPr>
+          <w:p>
+            <w:pPr>
+              <w:spacing w:after="0"/>
+            </w:pPr>
+            <w:r>
+              <w:rPr>
+                <w:sz w:val="14"/>
+              </w:rPr>
+              <w:t>75.9 (15.0)</w:t>
+            </w:r>
+          </w:p>
+        </w:tc>
+        <w:tc>
+          <w:tcPr>
+            <w:tcW w:type="dxa" w:w="2340"/>
+            <w:tcMar>
+              <w:top w:w="60" w:type="dxa"/>
+              <w:start w:w="90" w:type="dxa"/>
+              <w:bottom w:w="60" w:type="dxa"/>
+              <w:end w:w="90" w:type="dxa"/>
+            </w:tcMar>
+            <w:tcBorders>
+              <w:top w:val="nil"/>
+              <w:bottom w:val="nil"/>
+              <w:left w:val="nil"/>
+              <w:right w:val="nil"/>
+            </w:tcBorders>
+          </w:tcPr>
+          <w:p>
+            <w:pPr>
+              <w:spacing w:after="0"/>
+            </w:pPr>
+            <w:r>
+              <w:rPr>
+                <w:sz w:val="14"/>
+              </w:rPr>
+              <w:t>75.9 (15.0)</w:t>
+            </w:r>
+          </w:p>
+        </w:tc>
+        <w:tc>
+          <w:tcPr>
+            <w:tcW w:type="dxa" w:w="2340"/>
+            <w:tcMar>
+              <w:top w:w="60" w:type="dxa"/>
+              <w:start w:w="90" w:type="dxa"/>
+              <w:bottom w:w="60" w:type="dxa"/>
+              <w:end w:w="90" w:type="dxa"/>
+            </w:tcMar>
+            <w:tcBorders>
+              <w:top w:val="nil"/>
+              <w:bottom w:val="nil"/>
+              <w:left w:val="nil"/>
+              <w:right w:val="nil"/>
+            </w:tcBorders>
+          </w:tcPr>
+          <w:p>
+            <w:pPr>
+              <w:spacing w:after="0"/>
+            </w:pPr>
+            <w:r>
+              <w:rPr>
+                <w:sz w:val="14"/>
+              </w:rPr>
+              <w:t>75.9 (15.0)</w:t>
+            </w:r>
+          </w:p>
+        </w:tc>
+      </w:tr>
+      <w:tr>
+        <w:tc>
+          <w:tcPr>
+            <w:tcW w:type="dxa" w:w="2340"/>
+            <w:tcMar>
+              <w:top w:w="60" w:type="dxa"/>
+              <w:start w:w="90" w:type="dxa"/>
+              <w:bottom w:w="60" w:type="dxa"/>
+              <w:end w:w="90" w:type="dxa"/>
+            </w:tcMar>
+            <w:tcBorders>
+              <w:top w:val="nil"/>
+              <w:bottom w:val="nil"/>
+              <w:left w:val="nil"/>
+              <w:right w:val="nil"/>
+            </w:tcBorders>
+          </w:tcPr>
+          <w:p>
+            <w:pPr>
+              <w:spacing w:after="0"/>
+            </w:pPr>
+            <w:r>
+              <w:rPr>
+                <w:sz w:val="14"/>
+              </w:rPr>
+              <w:t>Intraoperative cardiac index, L/min/m2, mean (s.d.)</w:t>
+            </w:r>
+          </w:p>
+        </w:tc>
+        <w:tc>
+          <w:tcPr>
+            <w:tcW w:type="dxa" w:w="2340"/>
+            <w:tcMar>
+              <w:top w:w="60" w:type="dxa"/>
+              <w:start w:w="90" w:type="dxa"/>
+              <w:bottom w:w="60" w:type="dxa"/>
+              <w:end w:w="90" w:type="dxa"/>
+            </w:tcMar>
+            <w:tcBorders>
+              <w:top w:val="nil"/>
+              <w:bottom w:val="nil"/>
+              <w:left w:val="nil"/>
+              <w:right w:val="nil"/>
+            </w:tcBorders>
+          </w:tcPr>
+          <w:p>
+            <w:pPr>
+              <w:spacing w:after="0"/>
+            </w:pPr>
+            <w:r>
+              <w:rPr>
+                <w:sz w:val="14"/>
+              </w:rPr>
+              <w:t>2.6 (0.9)</w:t>
+            </w:r>
+          </w:p>
+        </w:tc>
+        <w:tc>
+          <w:tcPr>
+            <w:tcW w:type="dxa" w:w="2340"/>
+            <w:tcMar>
+              <w:top w:w="60" w:type="dxa"/>
+              <w:start w:w="90" w:type="dxa"/>
+              <w:bottom w:w="60" w:type="dxa"/>
+              <w:end w:w="90" w:type="dxa"/>
+            </w:tcMar>
+            <w:tcBorders>
+              <w:top w:val="nil"/>
+              <w:bottom w:val="nil"/>
+              <w:left w:val="nil"/>
+              <w:right w:val="nil"/>
+            </w:tcBorders>
+          </w:tcPr>
+          <w:p>
+            <w:pPr>
+              <w:spacing w:after="0"/>
+            </w:pPr>
+            <w:r>
+              <w:rPr>
+                <w:sz w:val="14"/>
+              </w:rPr>
+              <w:t>2.6 (0.8)</w:t>
+            </w:r>
+          </w:p>
+        </w:tc>
+        <w:tc>
+          <w:tcPr>
+            <w:tcW w:type="dxa" w:w="2340"/>
+            <w:tcMar>
+              <w:top w:w="60" w:type="dxa"/>
+              <w:start w:w="90" w:type="dxa"/>
+              <w:bottom w:w="60" w:type="dxa"/>
+              <w:end w:w="90" w:type="dxa"/>
+            </w:tcMar>
+            <w:tcBorders>
+              <w:top w:val="nil"/>
+              <w:bottom w:val="nil"/>
+              <w:left w:val="nil"/>
+              <w:right w:val="nil"/>
+            </w:tcBorders>
+          </w:tcPr>
+          <w:p>
+            <w:pPr>
+              <w:spacing w:after="0"/>
+            </w:pPr>
+            <w:r>
+              <w:rPr>
+                <w:sz w:val="14"/>
+              </w:rPr>
+              <w:t>2.6 (0.9)</w:t>
+            </w:r>
+          </w:p>
+        </w:tc>
+      </w:tr>
+      <w:tr>
+        <w:tc>
+          <w:tcPr>
+            <w:tcW w:type="dxa" w:w="2340"/>
+            <w:tcMar>
+              <w:top w:w="60" w:type="dxa"/>
+              <w:start w:w="90" w:type="dxa"/>
+              <w:bottom w:w="60" w:type="dxa"/>
+              <w:end w:w="90" w:type="dxa"/>
+            </w:tcMar>
+            <w:tcBorders>
+              <w:top w:val="nil"/>
+              <w:bottom w:val="nil"/>
+              <w:left w:val="nil"/>
+              <w:right w:val="nil"/>
+            </w:tcBorders>
+          </w:tcPr>
+          <w:p>
+            <w:pPr>
+              <w:spacing w:after="0"/>
+            </w:pPr>
+            <w:r>
+              <w:rPr>
+                <w:sz w:val="14"/>
+              </w:rPr>
+              <w:t>Left SctO2, %, mean (s.d.)</w:t>
+            </w:r>
+          </w:p>
+        </w:tc>
+        <w:tc>
+          <w:tcPr>
+            <w:tcW w:type="dxa" w:w="2340"/>
+            <w:tcMar>
+              <w:top w:w="60" w:type="dxa"/>
+              <w:start w:w="90" w:type="dxa"/>
+              <w:bottom w:w="60" w:type="dxa"/>
+              <w:end w:w="90" w:type="dxa"/>
+            </w:tcMar>
+            <w:tcBorders>
+              <w:top w:val="nil"/>
+              <w:bottom w:val="nil"/>
+              <w:left w:val="nil"/>
+              <w:right w:val="nil"/>
+            </w:tcBorders>
+          </w:tcPr>
+          <w:p>
+            <w:pPr>
+              <w:spacing w:after="0"/>
+            </w:pPr>
+            <w:r>
+              <w:rPr>
+                <w:sz w:val="14"/>
+              </w:rPr>
+              <w:t>71.1 (6.0)</w:t>
+            </w:r>
+          </w:p>
+        </w:tc>
+        <w:tc>
+          <w:tcPr>
+            <w:tcW w:type="dxa" w:w="2340"/>
+            <w:tcMar>
+              <w:top w:w="60" w:type="dxa"/>
+              <w:start w:w="90" w:type="dxa"/>
+              <w:bottom w:w="60" w:type="dxa"/>
+              <w:end w:w="90" w:type="dxa"/>
+            </w:tcMar>
+            <w:tcBorders>
+              <w:top w:val="nil"/>
+              <w:bottom w:val="nil"/>
+              <w:left w:val="nil"/>
+              <w:right w:val="nil"/>
+            </w:tcBorders>
+          </w:tcPr>
+          <w:p>
+            <w:pPr>
+              <w:spacing w:after="0"/>
+            </w:pPr>
+            <w:r>
+              <w:rPr>
+                <w:sz w:val="14"/>
+              </w:rPr>
+            </w:r>
+          </w:p>
+        </w:tc>
+        <w:tc>
+          <w:tcPr>
+            <w:tcW w:type="dxa" w:w="2340"/>
+            <w:tcMar>
+              <w:top w:w="60" w:type="dxa"/>
+              <w:start w:w="90" w:type="dxa"/>
+              <w:bottom w:w="60" w:type="dxa"/>
+              <w:end w:w="90" w:type="dxa"/>
+            </w:tcMar>
+            <w:tcBorders>
+              <w:top w:val="nil"/>
+              <w:bottom w:val="nil"/>
+              <w:left w:val="nil"/>
+              <w:right w:val="nil"/>
+            </w:tcBorders>
+          </w:tcPr>
+          <w:p>
+            <w:pPr>
+              <w:spacing w:after="0"/>
+            </w:pPr>
+            <w:r>
+              <w:rPr>
+                <w:sz w:val="14"/>
+              </w:rPr>
+            </w:r>
+          </w:p>
+        </w:tc>
+      </w:tr>
+      <w:tr>
+        <w:tc>
+          <w:tcPr>
+            <w:tcW w:type="dxa" w:w="2340"/>
+            <w:tcMar>
+              <w:top w:w="60" w:type="dxa"/>
+              <w:start w:w="90" w:type="dxa"/>
+              <w:bottom w:w="60" w:type="dxa"/>
+              <w:end w:w="90" w:type="dxa"/>
+            </w:tcMar>
+            <w:tcBorders>
+              <w:top w:val="nil"/>
+              <w:bottom w:val="nil"/>
+              <w:left w:val="nil"/>
+              <w:right w:val="nil"/>
+            </w:tcBorders>
+          </w:tcPr>
+          <w:p>
+            <w:pPr>
+              <w:spacing w:after="0"/>
+            </w:pPr>
+            <w:r>
+              <w:rPr>
+                <w:sz w:val="14"/>
+              </w:rPr>
+              <w:t>Right SctO2, %, mean (s.d.)</w:t>
+            </w:r>
+          </w:p>
+        </w:tc>
+        <w:tc>
+          <w:tcPr>
+            <w:tcW w:type="dxa" w:w="2340"/>
+            <w:tcMar>
+              <w:top w:w="60" w:type="dxa"/>
+              <w:start w:w="90" w:type="dxa"/>
+              <w:bottom w:w="60" w:type="dxa"/>
+              <w:end w:w="90" w:type="dxa"/>
+            </w:tcMar>
+            <w:tcBorders>
+              <w:top w:val="nil"/>
+              <w:bottom w:val="nil"/>
+              <w:left w:val="nil"/>
+              <w:right w:val="nil"/>
+            </w:tcBorders>
+          </w:tcPr>
+          <w:p>
+            <w:pPr>
+              <w:spacing w:after="0"/>
+            </w:pPr>
+            <w:r>
+              <w:rPr>
+                <w:sz w:val="14"/>
+              </w:rPr>
+            </w:r>
+          </w:p>
+        </w:tc>
+        <w:tc>
+          <w:tcPr>
+            <w:tcW w:type="dxa" w:w="2340"/>
+            <w:tcMar>
+              <w:top w:w="60" w:type="dxa"/>
+              <w:start w:w="90" w:type="dxa"/>
+              <w:bottom w:w="60" w:type="dxa"/>
+              <w:end w:w="90" w:type="dxa"/>
+            </w:tcMar>
+            <w:tcBorders>
+              <w:top w:val="nil"/>
+              <w:bottom w:val="nil"/>
+              <w:left w:val="nil"/>
+              <w:right w:val="nil"/>
+            </w:tcBorders>
+          </w:tcPr>
+          <w:p>
+            <w:pPr>
+              <w:spacing w:after="0"/>
+            </w:pPr>
+            <w:r>
+              <w:rPr>
+                <w:sz w:val="14"/>
+              </w:rPr>
+              <w:t>71.5 (5.7)</w:t>
+            </w:r>
+          </w:p>
+        </w:tc>
+        <w:tc>
+          <w:tcPr>
+            <w:tcW w:type="dxa" w:w="2340"/>
+            <w:tcMar>
+              <w:top w:w="60" w:type="dxa"/>
+              <w:start w:w="90" w:type="dxa"/>
+              <w:bottom w:w="60" w:type="dxa"/>
+              <w:end w:w="90" w:type="dxa"/>
+            </w:tcMar>
+            <w:tcBorders>
+              <w:top w:val="nil"/>
+              <w:bottom w:val="nil"/>
+              <w:left w:val="nil"/>
+              <w:right w:val="nil"/>
+            </w:tcBorders>
+          </w:tcPr>
+          <w:p>
+            <w:pPr>
+              <w:spacing w:after="0"/>
+            </w:pPr>
+            <w:r>
+              <w:rPr>
+                <w:sz w:val="14"/>
+              </w:rPr>
+            </w:r>
+          </w:p>
+        </w:tc>
+      </w:tr>
+      <w:tr>
+        <w:tc>
+          <w:tcPr>
+            <w:tcW w:type="dxa" w:w="2340"/>
+            <w:tcMar>
+              <w:top w:w="60" w:type="dxa"/>
+              <w:start w:w="90" w:type="dxa"/>
+              <w:bottom w:w="60" w:type="dxa"/>
+              <w:end w:w="90" w:type="dxa"/>
+            </w:tcMar>
+            <w:tcBorders>
+              <w:bottom w:val="single" w:sz="8" w:color="000000"/>
+              <w:left w:val="nil"/>
+              <w:right w:val="nil"/>
+            </w:tcBorders>
+          </w:tcPr>
+          <w:p>
+            <w:pPr>
+              <w:spacing w:after="0"/>
+            </w:pPr>
+            <w:r>
+              <w:rPr>
+                <w:sz w:val="14"/>
+              </w:rPr>
+              <w:t>SftO2, %, mean (s.d.)</w:t>
+            </w:r>
+          </w:p>
+        </w:tc>
+        <w:tc>
+          <w:tcPr>
+            <w:tcW w:type="dxa" w:w="2340"/>
+            <w:tcMar>
+              <w:top w:w="60" w:type="dxa"/>
+              <w:start w:w="90" w:type="dxa"/>
+              <w:bottom w:w="60" w:type="dxa"/>
+              <w:end w:w="90" w:type="dxa"/>
+            </w:tcMar>
+            <w:tcBorders>
+              <w:bottom w:val="single" w:sz="8" w:color="000000"/>
+              <w:left w:val="nil"/>
+              <w:right w:val="nil"/>
+            </w:tcBorders>
+          </w:tcPr>
+          <w:p>
+            <w:pPr>
+              <w:spacing w:after="0"/>
+            </w:pPr>
+            <w:r>
+              <w:rPr>
+                <w:sz w:val="14"/>
+              </w:rPr>
+            </w:r>
+          </w:p>
+        </w:tc>
+        <w:tc>
+          <w:tcPr>
+            <w:tcW w:type="dxa" w:w="2340"/>
+            <w:tcMar>
+              <w:top w:w="60" w:type="dxa"/>
+              <w:start w:w="90" w:type="dxa"/>
+              <w:bottom w:w="60" w:type="dxa"/>
+              <w:end w:w="90" w:type="dxa"/>
+            </w:tcMar>
+            <w:tcBorders>
+              <w:bottom w:val="single" w:sz="8" w:color="000000"/>
+              <w:left w:val="nil"/>
+              <w:right w:val="nil"/>
+            </w:tcBorders>
+          </w:tcPr>
+          <w:p>
+            <w:pPr>
+              <w:spacing w:after="0"/>
+            </w:pPr>
+            <w:r>
+              <w:rPr>
+                <w:sz w:val="14"/>
+              </w:rPr>
+            </w:r>
+          </w:p>
+        </w:tc>
+        <w:tc>
+          <w:tcPr>
+            <w:tcW w:type="dxa" w:w="2340"/>
+            <w:tcMar>
+              <w:top w:w="60" w:type="dxa"/>
+              <w:start w:w="90" w:type="dxa"/>
+              <w:bottom w:w="60" w:type="dxa"/>
+              <w:end w:w="90" w:type="dxa"/>
+            </w:tcMar>
+            <w:tcBorders>
+              <w:bottom w:val="single" w:sz="8" w:color="000000"/>
+              <w:left w:val="nil"/>
+              <w:right w:val="nil"/>
+            </w:tcBorders>
+          </w:tcPr>
+          <w:p>
+            <w:pPr>
+              <w:spacing w:after="0"/>
+            </w:pPr>
+            <w:r>
+              <w:rPr>
+                <w:sz w:val="14"/>
+              </w:rPr>
+              <w:t>75.5 (5.9)</w:t>
+            </w:r>
+          </w:p>
+        </w:tc>
+      </w:tr>
+    </w:tbl>
+    <w:p/>
+    <w:p>
+      <w:pPr>
+        <w:spacing w:before="200" w:after="80"/>
+      </w:pPr>
       <w:r>
         <w:rPr>
-          <w:rFonts w:ascii="Consolas" w:hAnsi="Consolas"/>
-          <w:sz w:val="20"/>
+          <w:b/>
         </w:rPr>
-        <w:t>docs/manuscript_development/generated_assets/figure1_cohort_flow.png</w:t>
-      </w:r>
-      <w:r>
-        <w:t xml:space="preserve">. Source data: </w:t>
-      </w:r>
-      <w:r>
-        <w:rPr>
-          <w:rFonts w:ascii="Consolas" w:hAnsi="Consolas"/>
-          <w:sz w:val="20"/>
-        </w:rPr>
-        <w:t>docs/manuscript_development/generated_assets/source_data_figure1_cohort_flow.csv</w:t>
-      </w:r>
-      <w:r>
-        <w:t>.]</w:t>
+        <w:t>Figure 1 | Cohort assembly by tissue oxygenation channel.</w:t>
       </w:r>
     </w:p>
+    <w:p>
+      <w:pPr>
+        <w:spacing w:after="120"/>
+      </w:pPr>
+      <w:r>
+        <w:t>Flow counts show patient and timestamp retention for left SctO2, right SctO2, and SftO2 analytic cohorts.</w:t>
+      </w:r>
+    </w:p>
+    <w:p>
+      <w:pPr>
+        <w:jc w:val="center"/>
+      </w:pPr>
+      <w:r>
+        <w:drawing>
+          <wp:inline xmlns:a="http://schemas.openxmlformats.org/drawingml/2006/main" xmlns:pic="http://schemas.openxmlformats.org/drawingml/2006/picture">
+            <wp:extent cx="5669280" cy="2815091"/>
+            <wp:docPr id="1" name="Picture 1"/>
+            <wp:cNvGraphicFramePr>
+              <a:graphicFrameLocks noChangeAspect="1"/>
+            </wp:cNvGraphicFramePr>
+            <a:graphic>
+              <a:graphicData uri="http://schemas.openxmlformats.org/drawingml/2006/picture">
+                <pic:pic>
+                  <pic:nvPicPr>
+                    <pic:cNvPr id="0" name="figure1_cohort_flow.png"/>
+                    <pic:cNvPicPr/>
+                  </pic:nvPicPr>
+                  <pic:blipFill>
+                    <a:blip r:embed="rId9"/>
+                    <a:stretch>
+                      <a:fillRect/>
+                    </a:stretch>
+                  </pic:blipFill>
+                  <pic:spPr>
+                    <a:xfrm>
+                      <a:off x="0" y="0"/>
+                      <a:ext cx="5669280" cy="2815091"/>
+                    </a:xfrm>
+                    <a:prstGeom prst="rect"/>
+                  </pic:spPr>
+                </pic:pic>
+              </a:graphicData>
+            </a:graphic>
+          </wp:inline>
+        </w:drawing>
+      </w:r>
+    </w:p>
+    <w:p/>
     <w:p>
       <w:pPr>
         <w:pStyle w:val="Heading2"/>
@@ -463,30 +2770,1519 @@
       </w:r>
     </w:p>
     <w:p>
-      <w:r>
-        <w:t xml:space="preserve">[Insert Table 2: </w:t>
-      </w:r>
+      <w:pPr>
+        <w:spacing w:before="200" w:after="80"/>
+      </w:pPr>
       <w:r>
         <w:rPr>
-          <w:rFonts w:ascii="Consolas" w:hAnsi="Consolas"/>
-          <w:sz w:val="20"/>
+          <w:b/>
         </w:rPr>
-        <w:t>generated_assets/table2_clinical_step_contrasts.xlsx</w:t>
+        <w:t>Table 2 | Adjusted clinical-step contrasts.</w:t>
       </w:r>
+    </w:p>
+    <w:p>
+      <w:pPr>
+        <w:spacing w:after="120"/>
+      </w:pPr>
       <w:r>
-        <w:t xml:space="preserve">. Insert Figure 3: </w:t>
+        <w:t>Contrasts are model-based adjusted differences in rSO2 for prespecified exposure increments. Confidence intervals are derived from archived prediction matrices and should be interpreted as model-based uncertainty intervals.</w:t>
       </w:r>
+    </w:p>
+    <w:tbl>
+      <w:tblPr>
+        <w:tblW w:type="auto" w:w="0"/>
+        <w:tblLook w:firstColumn="1" w:firstRow="1" w:lastColumn="0" w:lastRow="0" w:noHBand="0" w:noVBand="1" w:val="04A0"/>
+        <w:tblW w:w="9360" w:type="dxa"/>
+        <w:tblInd w:w="120" w:type="dxa"/>
+      </w:tblPr>
+      <w:tblGrid>
+        <w:gridCol w:w="1872"/>
+        <w:gridCol w:w="1872"/>
+        <w:gridCol w:w="1872"/>
+        <w:gridCol w:w="1872"/>
+        <w:gridCol w:w="1872"/>
+      </w:tblGrid>
+      <w:tr>
+        <w:tc>
+          <w:tcPr>
+            <w:tcW w:type="dxa" w:w="1872"/>
+            <w:tcMar>
+              <w:top w:w="60" w:type="dxa"/>
+              <w:start w:w="90" w:type="dxa"/>
+              <w:bottom w:w="60" w:type="dxa"/>
+              <w:end w:w="90" w:type="dxa"/>
+            </w:tcMar>
+            <w:tcBorders>
+              <w:top w:val="single" w:sz="8" w:color="000000"/>
+              <w:bottom w:val="single" w:sz="8" w:color="000000"/>
+              <w:left w:val="nil"/>
+              <w:right w:val="nil"/>
+            </w:tcBorders>
+          </w:tcPr>
+          <w:p>
+            <w:pPr>
+              <w:spacing w:after="0"/>
+            </w:pPr>
+            <w:r>
+              <w:rPr>
+                <w:b/>
+                <w:sz w:val="14"/>
+              </w:rPr>
+              <w:t>Outcome channel</w:t>
+            </w:r>
+          </w:p>
+        </w:tc>
+        <w:tc>
+          <w:tcPr>
+            <w:tcW w:type="dxa" w:w="1872"/>
+            <w:tcMar>
+              <w:top w:w="60" w:type="dxa"/>
+              <w:start w:w="90" w:type="dxa"/>
+              <w:bottom w:w="60" w:type="dxa"/>
+              <w:end w:w="90" w:type="dxa"/>
+            </w:tcMar>
+            <w:tcBorders>
+              <w:top w:val="single" w:sz="8" w:color="000000"/>
+              <w:bottom w:val="single" w:sz="8" w:color="000000"/>
+              <w:left w:val="nil"/>
+              <w:right w:val="nil"/>
+            </w:tcBorders>
+          </w:tcPr>
+          <w:p>
+            <w:pPr>
+              <w:spacing w:after="0"/>
+            </w:pPr>
+            <w:r>
+              <w:rPr>
+                <w:b/>
+                <w:sz w:val="14"/>
+              </w:rPr>
+              <w:t>Exposure</w:t>
+            </w:r>
+          </w:p>
+        </w:tc>
+        <w:tc>
+          <w:tcPr>
+            <w:tcW w:type="dxa" w:w="1872"/>
+            <w:tcMar>
+              <w:top w:w="60" w:type="dxa"/>
+              <w:start w:w="90" w:type="dxa"/>
+              <w:bottom w:w="60" w:type="dxa"/>
+              <w:end w:w="90" w:type="dxa"/>
+            </w:tcMar>
+            <w:tcBorders>
+              <w:top w:val="single" w:sz="8" w:color="000000"/>
+              <w:bottom w:val="single" w:sz="8" w:color="000000"/>
+              <w:left w:val="nil"/>
+              <w:right w:val="nil"/>
+            </w:tcBorders>
+          </w:tcPr>
+          <w:p>
+            <w:pPr>
+              <w:spacing w:after="0"/>
+            </w:pPr>
+            <w:r>
+              <w:rPr>
+                <w:b/>
+                <w:sz w:val="14"/>
+              </w:rPr>
+              <w:t>Clinical increment</w:t>
+            </w:r>
+          </w:p>
+        </w:tc>
+        <w:tc>
+          <w:tcPr>
+            <w:tcW w:type="dxa" w:w="1872"/>
+            <w:tcMar>
+              <w:top w:w="60" w:type="dxa"/>
+              <w:start w:w="90" w:type="dxa"/>
+              <w:bottom w:w="60" w:type="dxa"/>
+              <w:end w:w="90" w:type="dxa"/>
+            </w:tcMar>
+            <w:tcBorders>
+              <w:top w:val="single" w:sz="8" w:color="000000"/>
+              <w:bottom w:val="single" w:sz="8" w:color="000000"/>
+              <w:left w:val="nil"/>
+              <w:right w:val="nil"/>
+            </w:tcBorders>
+          </w:tcPr>
+          <w:p>
+            <w:pPr>
+              <w:spacing w:after="0"/>
+            </w:pPr>
+            <w:r>
+              <w:rPr>
+                <w:b/>
+                <w:sz w:val="14"/>
+              </w:rPr>
+              <w:t>Adjusted rSO2 difference, percentage points</w:t>
+            </w:r>
+          </w:p>
+        </w:tc>
+        <w:tc>
+          <w:tcPr>
+            <w:tcW w:type="dxa" w:w="1872"/>
+            <w:tcMar>
+              <w:top w:w="60" w:type="dxa"/>
+              <w:start w:w="90" w:type="dxa"/>
+              <w:bottom w:w="60" w:type="dxa"/>
+              <w:end w:w="90" w:type="dxa"/>
+            </w:tcMar>
+            <w:tcBorders>
+              <w:top w:val="single" w:sz="8" w:color="000000"/>
+              <w:bottom w:val="single" w:sz="8" w:color="000000"/>
+              <w:left w:val="nil"/>
+              <w:right w:val="nil"/>
+            </w:tcBorders>
+          </w:tcPr>
+          <w:p>
+            <w:pPr>
+              <w:spacing w:after="0"/>
+            </w:pPr>
+            <w:r>
+              <w:rPr>
+                <w:b/>
+                <w:sz w:val="14"/>
+              </w:rPr>
+              <w:t>95% CI</w:t>
+            </w:r>
+          </w:p>
+        </w:tc>
+      </w:tr>
+      <w:tr>
+        <w:tc>
+          <w:tcPr>
+            <w:tcW w:type="dxa" w:w="1872"/>
+            <w:tcMar>
+              <w:top w:w="60" w:type="dxa"/>
+              <w:start w:w="90" w:type="dxa"/>
+              <w:bottom w:w="60" w:type="dxa"/>
+              <w:end w:w="90" w:type="dxa"/>
+            </w:tcMar>
+            <w:tcBorders>
+              <w:top w:val="nil"/>
+              <w:bottom w:val="nil"/>
+              <w:left w:val="nil"/>
+              <w:right w:val="nil"/>
+            </w:tcBorders>
+          </w:tcPr>
+          <w:p>
+            <w:pPr>
+              <w:spacing w:after="0"/>
+            </w:pPr>
+            <w:r>
+              <w:rPr>
+                <w:sz w:val="14"/>
+              </w:rPr>
+              <w:t>Left SctO2</w:t>
+            </w:r>
+          </w:p>
+        </w:tc>
+        <w:tc>
+          <w:tcPr>
+            <w:tcW w:type="dxa" w:w="1872"/>
+            <w:tcMar>
+              <w:top w:w="60" w:type="dxa"/>
+              <w:start w:w="90" w:type="dxa"/>
+              <w:bottom w:w="60" w:type="dxa"/>
+              <w:end w:w="90" w:type="dxa"/>
+            </w:tcMar>
+            <w:tcBorders>
+              <w:top w:val="nil"/>
+              <w:bottom w:val="nil"/>
+              <w:left w:val="nil"/>
+              <w:right w:val="nil"/>
+            </w:tcBorders>
+          </w:tcPr>
+          <w:p>
+            <w:pPr>
+              <w:spacing w:after="0"/>
+            </w:pPr>
+            <w:r>
+              <w:rPr>
+                <w:sz w:val="14"/>
+              </w:rPr>
+              <w:t>EtCO2</w:t>
+            </w:r>
+          </w:p>
+        </w:tc>
+        <w:tc>
+          <w:tcPr>
+            <w:tcW w:type="dxa" w:w="1872"/>
+            <w:tcMar>
+              <w:top w:w="60" w:type="dxa"/>
+              <w:start w:w="90" w:type="dxa"/>
+              <w:bottom w:w="60" w:type="dxa"/>
+              <w:end w:w="90" w:type="dxa"/>
+            </w:tcMar>
+            <w:tcBorders>
+              <w:top w:val="nil"/>
+              <w:bottom w:val="nil"/>
+              <w:left w:val="nil"/>
+              <w:right w:val="nil"/>
+            </w:tcBorders>
+          </w:tcPr>
+          <w:p>
+            <w:pPr>
+              <w:spacing w:after="0"/>
+            </w:pPr>
+            <w:r>
+              <w:rPr>
+                <w:sz w:val="14"/>
+              </w:rPr>
+              <w:t>+5 mmHg</w:t>
+            </w:r>
+          </w:p>
+        </w:tc>
+        <w:tc>
+          <w:tcPr>
+            <w:tcW w:type="dxa" w:w="1872"/>
+            <w:tcMar>
+              <w:top w:w="60" w:type="dxa"/>
+              <w:start w:w="90" w:type="dxa"/>
+              <w:bottom w:w="60" w:type="dxa"/>
+              <w:end w:w="90" w:type="dxa"/>
+            </w:tcMar>
+            <w:tcBorders>
+              <w:top w:val="nil"/>
+              <w:bottom w:val="nil"/>
+              <w:left w:val="nil"/>
+              <w:right w:val="nil"/>
+            </w:tcBorders>
+          </w:tcPr>
+          <w:p>
+            <w:pPr>
+              <w:spacing w:after="0"/>
+            </w:pPr>
+            <w:r>
+              <w:rPr>
+                <w:sz w:val="14"/>
+              </w:rPr>
+              <w:t>2.89</w:t>
+            </w:r>
+          </w:p>
+        </w:tc>
+        <w:tc>
+          <w:tcPr>
+            <w:tcW w:type="dxa" w:w="1872"/>
+            <w:tcMar>
+              <w:top w:w="60" w:type="dxa"/>
+              <w:start w:w="90" w:type="dxa"/>
+              <w:bottom w:w="60" w:type="dxa"/>
+              <w:end w:w="90" w:type="dxa"/>
+            </w:tcMar>
+            <w:tcBorders>
+              <w:top w:val="nil"/>
+              <w:bottom w:val="nil"/>
+              <w:left w:val="nil"/>
+              <w:right w:val="nil"/>
+            </w:tcBorders>
+          </w:tcPr>
+          <w:p>
+            <w:pPr>
+              <w:spacing w:after="0"/>
+            </w:pPr>
+            <w:r>
+              <w:rPr>
+                <w:sz w:val="14"/>
+              </w:rPr>
+              <w:t>2.41 to 3.33</w:t>
+            </w:r>
+          </w:p>
+        </w:tc>
+      </w:tr>
+      <w:tr>
+        <w:tc>
+          <w:tcPr>
+            <w:tcW w:type="dxa" w:w="1872"/>
+            <w:tcMar>
+              <w:top w:w="60" w:type="dxa"/>
+              <w:start w:w="90" w:type="dxa"/>
+              <w:bottom w:w="60" w:type="dxa"/>
+              <w:end w:w="90" w:type="dxa"/>
+            </w:tcMar>
+            <w:tcBorders>
+              <w:top w:val="nil"/>
+              <w:bottom w:val="nil"/>
+              <w:left w:val="nil"/>
+              <w:right w:val="nil"/>
+            </w:tcBorders>
+          </w:tcPr>
+          <w:p>
+            <w:pPr>
+              <w:spacing w:after="0"/>
+            </w:pPr>
+            <w:r>
+              <w:rPr>
+                <w:sz w:val="14"/>
+              </w:rPr>
+              <w:t>Left SctO2</w:t>
+            </w:r>
+          </w:p>
+        </w:tc>
+        <w:tc>
+          <w:tcPr>
+            <w:tcW w:type="dxa" w:w="1872"/>
+            <w:tcMar>
+              <w:top w:w="60" w:type="dxa"/>
+              <w:start w:w="90" w:type="dxa"/>
+              <w:bottom w:w="60" w:type="dxa"/>
+              <w:end w:w="90" w:type="dxa"/>
+            </w:tcMar>
+            <w:tcBorders>
+              <w:top w:val="nil"/>
+              <w:bottom w:val="nil"/>
+              <w:left w:val="nil"/>
+              <w:right w:val="nil"/>
+            </w:tcBorders>
+          </w:tcPr>
+          <w:p>
+            <w:pPr>
+              <w:spacing w:after="0"/>
+            </w:pPr>
+            <w:r>
+              <w:rPr>
+                <w:sz w:val="14"/>
+              </w:rPr>
+              <w:t>FiO2</w:t>
+            </w:r>
+          </w:p>
+        </w:tc>
+        <w:tc>
+          <w:tcPr>
+            <w:tcW w:type="dxa" w:w="1872"/>
+            <w:tcMar>
+              <w:top w:w="60" w:type="dxa"/>
+              <w:start w:w="90" w:type="dxa"/>
+              <w:bottom w:w="60" w:type="dxa"/>
+              <w:end w:w="90" w:type="dxa"/>
+            </w:tcMar>
+            <w:tcBorders>
+              <w:top w:val="nil"/>
+              <w:bottom w:val="nil"/>
+              <w:left w:val="nil"/>
+              <w:right w:val="nil"/>
+            </w:tcBorders>
+          </w:tcPr>
+          <w:p>
+            <w:pPr>
+              <w:spacing w:after="0"/>
+            </w:pPr>
+            <w:r>
+              <w:rPr>
+                <w:sz w:val="14"/>
+              </w:rPr>
+              <w:t>+10 percentage points</w:t>
+            </w:r>
+          </w:p>
+        </w:tc>
+        <w:tc>
+          <w:tcPr>
+            <w:tcW w:type="dxa" w:w="1872"/>
+            <w:tcMar>
+              <w:top w:w="60" w:type="dxa"/>
+              <w:start w:w="90" w:type="dxa"/>
+              <w:bottom w:w="60" w:type="dxa"/>
+              <w:end w:w="90" w:type="dxa"/>
+            </w:tcMar>
+            <w:tcBorders>
+              <w:top w:val="nil"/>
+              <w:bottom w:val="nil"/>
+              <w:left w:val="nil"/>
+              <w:right w:val="nil"/>
+            </w:tcBorders>
+          </w:tcPr>
+          <w:p>
+            <w:pPr>
+              <w:spacing w:after="0"/>
+            </w:pPr>
+            <w:r>
+              <w:rPr>
+                <w:sz w:val="14"/>
+              </w:rPr>
+              <w:t>-0.18</w:t>
+            </w:r>
+          </w:p>
+        </w:tc>
+        <w:tc>
+          <w:tcPr>
+            <w:tcW w:type="dxa" w:w="1872"/>
+            <w:tcMar>
+              <w:top w:w="60" w:type="dxa"/>
+              <w:start w:w="90" w:type="dxa"/>
+              <w:bottom w:w="60" w:type="dxa"/>
+              <w:end w:w="90" w:type="dxa"/>
+            </w:tcMar>
+            <w:tcBorders>
+              <w:top w:val="nil"/>
+              <w:bottom w:val="nil"/>
+              <w:left w:val="nil"/>
+              <w:right w:val="nil"/>
+            </w:tcBorders>
+          </w:tcPr>
+          <w:p>
+            <w:pPr>
+              <w:spacing w:after="0"/>
+            </w:pPr>
+            <w:r>
+              <w:rPr>
+                <w:sz w:val="14"/>
+              </w:rPr>
+              <w:t>-0.49 to 0.12</w:t>
+            </w:r>
+          </w:p>
+        </w:tc>
+      </w:tr>
+      <w:tr>
+        <w:tc>
+          <w:tcPr>
+            <w:tcW w:type="dxa" w:w="1872"/>
+            <w:tcMar>
+              <w:top w:w="60" w:type="dxa"/>
+              <w:start w:w="90" w:type="dxa"/>
+              <w:bottom w:w="60" w:type="dxa"/>
+              <w:end w:w="90" w:type="dxa"/>
+            </w:tcMar>
+            <w:tcBorders>
+              <w:top w:val="nil"/>
+              <w:bottom w:val="nil"/>
+              <w:left w:val="nil"/>
+              <w:right w:val="nil"/>
+            </w:tcBorders>
+          </w:tcPr>
+          <w:p>
+            <w:pPr>
+              <w:spacing w:after="0"/>
+            </w:pPr>
+            <w:r>
+              <w:rPr>
+                <w:sz w:val="14"/>
+              </w:rPr>
+              <w:t>Left SctO2</w:t>
+            </w:r>
+          </w:p>
+        </w:tc>
+        <w:tc>
+          <w:tcPr>
+            <w:tcW w:type="dxa" w:w="1872"/>
+            <w:tcMar>
+              <w:top w:w="60" w:type="dxa"/>
+              <w:start w:w="90" w:type="dxa"/>
+              <w:bottom w:w="60" w:type="dxa"/>
+              <w:end w:w="90" w:type="dxa"/>
+            </w:tcMar>
+            <w:tcBorders>
+              <w:top w:val="nil"/>
+              <w:bottom w:val="nil"/>
+              <w:left w:val="nil"/>
+              <w:right w:val="nil"/>
+            </w:tcBorders>
+          </w:tcPr>
+          <w:p>
+            <w:pPr>
+              <w:spacing w:after="0"/>
+            </w:pPr>
+            <w:r>
+              <w:rPr>
+                <w:sz w:val="14"/>
+              </w:rPr>
+              <w:t>Temperature</w:t>
+            </w:r>
+          </w:p>
+        </w:tc>
+        <w:tc>
+          <w:tcPr>
+            <w:tcW w:type="dxa" w:w="1872"/>
+            <w:tcMar>
+              <w:top w:w="60" w:type="dxa"/>
+              <w:start w:w="90" w:type="dxa"/>
+              <w:bottom w:w="60" w:type="dxa"/>
+              <w:end w:w="90" w:type="dxa"/>
+            </w:tcMar>
+            <w:tcBorders>
+              <w:top w:val="nil"/>
+              <w:bottom w:val="nil"/>
+              <w:left w:val="nil"/>
+              <w:right w:val="nil"/>
+            </w:tcBorders>
+          </w:tcPr>
+          <w:p>
+            <w:pPr>
+              <w:spacing w:after="0"/>
+            </w:pPr>
+            <w:r>
+              <w:rPr>
+                <w:sz w:val="14"/>
+              </w:rPr>
+              <w:t>+0.5 C</w:t>
+            </w:r>
+          </w:p>
+        </w:tc>
+        <w:tc>
+          <w:tcPr>
+            <w:tcW w:type="dxa" w:w="1872"/>
+            <w:tcMar>
+              <w:top w:w="60" w:type="dxa"/>
+              <w:start w:w="90" w:type="dxa"/>
+              <w:bottom w:w="60" w:type="dxa"/>
+              <w:end w:w="90" w:type="dxa"/>
+            </w:tcMar>
+            <w:tcBorders>
+              <w:top w:val="nil"/>
+              <w:bottom w:val="nil"/>
+              <w:left w:val="nil"/>
+              <w:right w:val="nil"/>
+            </w:tcBorders>
+          </w:tcPr>
+          <w:p>
+            <w:pPr>
+              <w:spacing w:after="0"/>
+            </w:pPr>
+            <w:r>
+              <w:rPr>
+                <w:sz w:val="14"/>
+              </w:rPr>
+              <w:t>0.10</w:t>
+            </w:r>
+          </w:p>
+        </w:tc>
+        <w:tc>
+          <w:tcPr>
+            <w:tcW w:type="dxa" w:w="1872"/>
+            <w:tcMar>
+              <w:top w:w="60" w:type="dxa"/>
+              <w:start w:w="90" w:type="dxa"/>
+              <w:bottom w:w="60" w:type="dxa"/>
+              <w:end w:w="90" w:type="dxa"/>
+            </w:tcMar>
+            <w:tcBorders>
+              <w:top w:val="nil"/>
+              <w:bottom w:val="nil"/>
+              <w:left w:val="nil"/>
+              <w:right w:val="nil"/>
+            </w:tcBorders>
+          </w:tcPr>
+          <w:p>
+            <w:pPr>
+              <w:spacing w:after="0"/>
+            </w:pPr>
+            <w:r>
+              <w:rPr>
+                <w:sz w:val="14"/>
+              </w:rPr>
+              <w:t>-0.16 to 0.35</w:t>
+            </w:r>
+          </w:p>
+        </w:tc>
+      </w:tr>
+      <w:tr>
+        <w:tc>
+          <w:tcPr>
+            <w:tcW w:type="dxa" w:w="1872"/>
+            <w:tcMar>
+              <w:top w:w="60" w:type="dxa"/>
+              <w:start w:w="90" w:type="dxa"/>
+              <w:bottom w:w="60" w:type="dxa"/>
+              <w:end w:w="90" w:type="dxa"/>
+            </w:tcMar>
+            <w:tcBorders>
+              <w:top w:val="nil"/>
+              <w:bottom w:val="nil"/>
+              <w:left w:val="nil"/>
+              <w:right w:val="nil"/>
+            </w:tcBorders>
+          </w:tcPr>
+          <w:p>
+            <w:pPr>
+              <w:spacing w:after="0"/>
+            </w:pPr>
+            <w:r>
+              <w:rPr>
+                <w:sz w:val="14"/>
+              </w:rPr>
+              <w:t>Right SctO2</w:t>
+            </w:r>
+          </w:p>
+        </w:tc>
+        <w:tc>
+          <w:tcPr>
+            <w:tcW w:type="dxa" w:w="1872"/>
+            <w:tcMar>
+              <w:top w:w="60" w:type="dxa"/>
+              <w:start w:w="90" w:type="dxa"/>
+              <w:bottom w:w="60" w:type="dxa"/>
+              <w:end w:w="90" w:type="dxa"/>
+            </w:tcMar>
+            <w:tcBorders>
+              <w:top w:val="nil"/>
+              <w:bottom w:val="nil"/>
+              <w:left w:val="nil"/>
+              <w:right w:val="nil"/>
+            </w:tcBorders>
+          </w:tcPr>
+          <w:p>
+            <w:pPr>
+              <w:spacing w:after="0"/>
+            </w:pPr>
+            <w:r>
+              <w:rPr>
+                <w:sz w:val="14"/>
+              </w:rPr>
+              <w:t>EtCO2</w:t>
+            </w:r>
+          </w:p>
+        </w:tc>
+        <w:tc>
+          <w:tcPr>
+            <w:tcW w:type="dxa" w:w="1872"/>
+            <w:tcMar>
+              <w:top w:w="60" w:type="dxa"/>
+              <w:start w:w="90" w:type="dxa"/>
+              <w:bottom w:w="60" w:type="dxa"/>
+              <w:end w:w="90" w:type="dxa"/>
+            </w:tcMar>
+            <w:tcBorders>
+              <w:top w:val="nil"/>
+              <w:bottom w:val="nil"/>
+              <w:left w:val="nil"/>
+              <w:right w:val="nil"/>
+            </w:tcBorders>
+          </w:tcPr>
+          <w:p>
+            <w:pPr>
+              <w:spacing w:after="0"/>
+            </w:pPr>
+            <w:r>
+              <w:rPr>
+                <w:sz w:val="14"/>
+              </w:rPr>
+              <w:t>+5 mmHg</w:t>
+            </w:r>
+          </w:p>
+        </w:tc>
+        <w:tc>
+          <w:tcPr>
+            <w:tcW w:type="dxa" w:w="1872"/>
+            <w:tcMar>
+              <w:top w:w="60" w:type="dxa"/>
+              <w:start w:w="90" w:type="dxa"/>
+              <w:bottom w:w="60" w:type="dxa"/>
+              <w:end w:w="90" w:type="dxa"/>
+            </w:tcMar>
+            <w:tcBorders>
+              <w:top w:val="nil"/>
+              <w:bottom w:val="nil"/>
+              <w:left w:val="nil"/>
+              <w:right w:val="nil"/>
+            </w:tcBorders>
+          </w:tcPr>
+          <w:p>
+            <w:pPr>
+              <w:spacing w:after="0"/>
+            </w:pPr>
+            <w:r>
+              <w:rPr>
+                <w:sz w:val="14"/>
+              </w:rPr>
+              <w:t>2.98</w:t>
+            </w:r>
+          </w:p>
+        </w:tc>
+        <w:tc>
+          <w:tcPr>
+            <w:tcW w:type="dxa" w:w="1872"/>
+            <w:tcMar>
+              <w:top w:w="60" w:type="dxa"/>
+              <w:start w:w="90" w:type="dxa"/>
+              <w:bottom w:w="60" w:type="dxa"/>
+              <w:end w:w="90" w:type="dxa"/>
+            </w:tcMar>
+            <w:tcBorders>
+              <w:top w:val="nil"/>
+              <w:bottom w:val="nil"/>
+              <w:left w:val="nil"/>
+              <w:right w:val="nil"/>
+            </w:tcBorders>
+          </w:tcPr>
+          <w:p>
+            <w:pPr>
+              <w:spacing w:after="0"/>
+            </w:pPr>
+            <w:r>
+              <w:rPr>
+                <w:sz w:val="14"/>
+              </w:rPr>
+              <w:t>2.64 to 3.28</w:t>
+            </w:r>
+          </w:p>
+        </w:tc>
+      </w:tr>
+      <w:tr>
+        <w:tc>
+          <w:tcPr>
+            <w:tcW w:type="dxa" w:w="1872"/>
+            <w:tcMar>
+              <w:top w:w="60" w:type="dxa"/>
+              <w:start w:w="90" w:type="dxa"/>
+              <w:bottom w:w="60" w:type="dxa"/>
+              <w:end w:w="90" w:type="dxa"/>
+            </w:tcMar>
+            <w:tcBorders>
+              <w:top w:val="nil"/>
+              <w:bottom w:val="nil"/>
+              <w:left w:val="nil"/>
+              <w:right w:val="nil"/>
+            </w:tcBorders>
+          </w:tcPr>
+          <w:p>
+            <w:pPr>
+              <w:spacing w:after="0"/>
+            </w:pPr>
+            <w:r>
+              <w:rPr>
+                <w:sz w:val="14"/>
+              </w:rPr>
+              <w:t>Right SctO2</w:t>
+            </w:r>
+          </w:p>
+        </w:tc>
+        <w:tc>
+          <w:tcPr>
+            <w:tcW w:type="dxa" w:w="1872"/>
+            <w:tcMar>
+              <w:top w:w="60" w:type="dxa"/>
+              <w:start w:w="90" w:type="dxa"/>
+              <w:bottom w:w="60" w:type="dxa"/>
+              <w:end w:w="90" w:type="dxa"/>
+            </w:tcMar>
+            <w:tcBorders>
+              <w:top w:val="nil"/>
+              <w:bottom w:val="nil"/>
+              <w:left w:val="nil"/>
+              <w:right w:val="nil"/>
+            </w:tcBorders>
+          </w:tcPr>
+          <w:p>
+            <w:pPr>
+              <w:spacing w:after="0"/>
+            </w:pPr>
+            <w:r>
+              <w:rPr>
+                <w:sz w:val="14"/>
+              </w:rPr>
+              <w:t>FiO2</w:t>
+            </w:r>
+          </w:p>
+        </w:tc>
+        <w:tc>
+          <w:tcPr>
+            <w:tcW w:type="dxa" w:w="1872"/>
+            <w:tcMar>
+              <w:top w:w="60" w:type="dxa"/>
+              <w:start w:w="90" w:type="dxa"/>
+              <w:bottom w:w="60" w:type="dxa"/>
+              <w:end w:w="90" w:type="dxa"/>
+            </w:tcMar>
+            <w:tcBorders>
+              <w:top w:val="nil"/>
+              <w:bottom w:val="nil"/>
+              <w:left w:val="nil"/>
+              <w:right w:val="nil"/>
+            </w:tcBorders>
+          </w:tcPr>
+          <w:p>
+            <w:pPr>
+              <w:spacing w:after="0"/>
+            </w:pPr>
+            <w:r>
+              <w:rPr>
+                <w:sz w:val="14"/>
+              </w:rPr>
+              <w:t>+10 percentage points</w:t>
+            </w:r>
+          </w:p>
+        </w:tc>
+        <w:tc>
+          <w:tcPr>
+            <w:tcW w:type="dxa" w:w="1872"/>
+            <w:tcMar>
+              <w:top w:w="60" w:type="dxa"/>
+              <w:start w:w="90" w:type="dxa"/>
+              <w:bottom w:w="60" w:type="dxa"/>
+              <w:end w:w="90" w:type="dxa"/>
+            </w:tcMar>
+            <w:tcBorders>
+              <w:top w:val="nil"/>
+              <w:bottom w:val="nil"/>
+              <w:left w:val="nil"/>
+              <w:right w:val="nil"/>
+            </w:tcBorders>
+          </w:tcPr>
+          <w:p>
+            <w:pPr>
+              <w:spacing w:after="0"/>
+            </w:pPr>
+            <w:r>
+              <w:rPr>
+                <w:sz w:val="14"/>
+              </w:rPr>
+              <w:t>-0.05</w:t>
+            </w:r>
+          </w:p>
+        </w:tc>
+        <w:tc>
+          <w:tcPr>
+            <w:tcW w:type="dxa" w:w="1872"/>
+            <w:tcMar>
+              <w:top w:w="60" w:type="dxa"/>
+              <w:start w:w="90" w:type="dxa"/>
+              <w:bottom w:w="60" w:type="dxa"/>
+              <w:end w:w="90" w:type="dxa"/>
+            </w:tcMar>
+            <w:tcBorders>
+              <w:top w:val="nil"/>
+              <w:bottom w:val="nil"/>
+              <w:left w:val="nil"/>
+              <w:right w:val="nil"/>
+            </w:tcBorders>
+          </w:tcPr>
+          <w:p>
+            <w:pPr>
+              <w:spacing w:after="0"/>
+            </w:pPr>
+            <w:r>
+              <w:rPr>
+                <w:sz w:val="14"/>
+              </w:rPr>
+              <w:t>-0.46 to 0.37</w:t>
+            </w:r>
+          </w:p>
+        </w:tc>
+      </w:tr>
+      <w:tr>
+        <w:tc>
+          <w:tcPr>
+            <w:tcW w:type="dxa" w:w="1872"/>
+            <w:tcMar>
+              <w:top w:w="60" w:type="dxa"/>
+              <w:start w:w="90" w:type="dxa"/>
+              <w:bottom w:w="60" w:type="dxa"/>
+              <w:end w:w="90" w:type="dxa"/>
+            </w:tcMar>
+            <w:tcBorders>
+              <w:top w:val="nil"/>
+              <w:bottom w:val="nil"/>
+              <w:left w:val="nil"/>
+              <w:right w:val="nil"/>
+            </w:tcBorders>
+          </w:tcPr>
+          <w:p>
+            <w:pPr>
+              <w:spacing w:after="0"/>
+            </w:pPr>
+            <w:r>
+              <w:rPr>
+                <w:sz w:val="14"/>
+              </w:rPr>
+              <w:t>Right SctO2</w:t>
+            </w:r>
+          </w:p>
+        </w:tc>
+        <w:tc>
+          <w:tcPr>
+            <w:tcW w:type="dxa" w:w="1872"/>
+            <w:tcMar>
+              <w:top w:w="60" w:type="dxa"/>
+              <w:start w:w="90" w:type="dxa"/>
+              <w:bottom w:w="60" w:type="dxa"/>
+              <w:end w:w="90" w:type="dxa"/>
+            </w:tcMar>
+            <w:tcBorders>
+              <w:top w:val="nil"/>
+              <w:bottom w:val="nil"/>
+              <w:left w:val="nil"/>
+              <w:right w:val="nil"/>
+            </w:tcBorders>
+          </w:tcPr>
+          <w:p>
+            <w:pPr>
+              <w:spacing w:after="0"/>
+            </w:pPr>
+            <w:r>
+              <w:rPr>
+                <w:sz w:val="14"/>
+              </w:rPr>
+              <w:t>Temperature</w:t>
+            </w:r>
+          </w:p>
+        </w:tc>
+        <w:tc>
+          <w:tcPr>
+            <w:tcW w:type="dxa" w:w="1872"/>
+            <w:tcMar>
+              <w:top w:w="60" w:type="dxa"/>
+              <w:start w:w="90" w:type="dxa"/>
+              <w:bottom w:w="60" w:type="dxa"/>
+              <w:end w:w="90" w:type="dxa"/>
+            </w:tcMar>
+            <w:tcBorders>
+              <w:top w:val="nil"/>
+              <w:bottom w:val="nil"/>
+              <w:left w:val="nil"/>
+              <w:right w:val="nil"/>
+            </w:tcBorders>
+          </w:tcPr>
+          <w:p>
+            <w:pPr>
+              <w:spacing w:after="0"/>
+            </w:pPr>
+            <w:r>
+              <w:rPr>
+                <w:sz w:val="14"/>
+              </w:rPr>
+              <w:t>+0.5 C</w:t>
+            </w:r>
+          </w:p>
+        </w:tc>
+        <w:tc>
+          <w:tcPr>
+            <w:tcW w:type="dxa" w:w="1872"/>
+            <w:tcMar>
+              <w:top w:w="60" w:type="dxa"/>
+              <w:start w:w="90" w:type="dxa"/>
+              <w:bottom w:w="60" w:type="dxa"/>
+              <w:end w:w="90" w:type="dxa"/>
+            </w:tcMar>
+            <w:tcBorders>
+              <w:top w:val="nil"/>
+              <w:bottom w:val="nil"/>
+              <w:left w:val="nil"/>
+              <w:right w:val="nil"/>
+            </w:tcBorders>
+          </w:tcPr>
+          <w:p>
+            <w:pPr>
+              <w:spacing w:after="0"/>
+            </w:pPr>
+            <w:r>
+              <w:rPr>
+                <w:sz w:val="14"/>
+              </w:rPr>
+              <w:t>0.55</w:t>
+            </w:r>
+          </w:p>
+        </w:tc>
+        <w:tc>
+          <w:tcPr>
+            <w:tcW w:type="dxa" w:w="1872"/>
+            <w:tcMar>
+              <w:top w:w="60" w:type="dxa"/>
+              <w:start w:w="90" w:type="dxa"/>
+              <w:bottom w:w="60" w:type="dxa"/>
+              <w:end w:w="90" w:type="dxa"/>
+            </w:tcMar>
+            <w:tcBorders>
+              <w:top w:val="nil"/>
+              <w:bottom w:val="nil"/>
+              <w:left w:val="nil"/>
+              <w:right w:val="nil"/>
+            </w:tcBorders>
+          </w:tcPr>
+          <w:p>
+            <w:pPr>
+              <w:spacing w:after="0"/>
+            </w:pPr>
+            <w:r>
+              <w:rPr>
+                <w:sz w:val="14"/>
+              </w:rPr>
+              <w:t>0.25 to 0.87</w:t>
+            </w:r>
+          </w:p>
+        </w:tc>
+      </w:tr>
+      <w:tr>
+        <w:tc>
+          <w:tcPr>
+            <w:tcW w:type="dxa" w:w="1872"/>
+            <w:tcMar>
+              <w:top w:w="60" w:type="dxa"/>
+              <w:start w:w="90" w:type="dxa"/>
+              <w:bottom w:w="60" w:type="dxa"/>
+              <w:end w:w="90" w:type="dxa"/>
+            </w:tcMar>
+            <w:tcBorders>
+              <w:top w:val="nil"/>
+              <w:bottom w:val="nil"/>
+              <w:left w:val="nil"/>
+              <w:right w:val="nil"/>
+            </w:tcBorders>
+          </w:tcPr>
+          <w:p>
+            <w:pPr>
+              <w:spacing w:after="0"/>
+            </w:pPr>
+            <w:r>
+              <w:rPr>
+                <w:sz w:val="14"/>
+              </w:rPr>
+              <w:t>SftO2</w:t>
+            </w:r>
+          </w:p>
+        </w:tc>
+        <w:tc>
+          <w:tcPr>
+            <w:tcW w:type="dxa" w:w="1872"/>
+            <w:tcMar>
+              <w:top w:w="60" w:type="dxa"/>
+              <w:start w:w="90" w:type="dxa"/>
+              <w:bottom w:w="60" w:type="dxa"/>
+              <w:end w:w="90" w:type="dxa"/>
+            </w:tcMar>
+            <w:tcBorders>
+              <w:top w:val="nil"/>
+              <w:bottom w:val="nil"/>
+              <w:left w:val="nil"/>
+              <w:right w:val="nil"/>
+            </w:tcBorders>
+          </w:tcPr>
+          <w:p>
+            <w:pPr>
+              <w:spacing w:after="0"/>
+            </w:pPr>
+            <w:r>
+              <w:rPr>
+                <w:sz w:val="14"/>
+              </w:rPr>
+              <w:t>EtCO2</w:t>
+            </w:r>
+          </w:p>
+        </w:tc>
+        <w:tc>
+          <w:tcPr>
+            <w:tcW w:type="dxa" w:w="1872"/>
+            <w:tcMar>
+              <w:top w:w="60" w:type="dxa"/>
+              <w:start w:w="90" w:type="dxa"/>
+              <w:bottom w:w="60" w:type="dxa"/>
+              <w:end w:w="90" w:type="dxa"/>
+            </w:tcMar>
+            <w:tcBorders>
+              <w:top w:val="nil"/>
+              <w:bottom w:val="nil"/>
+              <w:left w:val="nil"/>
+              <w:right w:val="nil"/>
+            </w:tcBorders>
+          </w:tcPr>
+          <w:p>
+            <w:pPr>
+              <w:spacing w:after="0"/>
+            </w:pPr>
+            <w:r>
+              <w:rPr>
+                <w:sz w:val="14"/>
+              </w:rPr>
+              <w:t>+5 mmHg</w:t>
+            </w:r>
+          </w:p>
+        </w:tc>
+        <w:tc>
+          <w:tcPr>
+            <w:tcW w:type="dxa" w:w="1872"/>
+            <w:tcMar>
+              <w:top w:w="60" w:type="dxa"/>
+              <w:start w:w="90" w:type="dxa"/>
+              <w:bottom w:w="60" w:type="dxa"/>
+              <w:end w:w="90" w:type="dxa"/>
+            </w:tcMar>
+            <w:tcBorders>
+              <w:top w:val="nil"/>
+              <w:bottom w:val="nil"/>
+              <w:left w:val="nil"/>
+              <w:right w:val="nil"/>
+            </w:tcBorders>
+          </w:tcPr>
+          <w:p>
+            <w:pPr>
+              <w:spacing w:after="0"/>
+            </w:pPr>
+            <w:r>
+              <w:rPr>
+                <w:sz w:val="14"/>
+              </w:rPr>
+              <w:t>0.92</w:t>
+            </w:r>
+          </w:p>
+        </w:tc>
+        <w:tc>
+          <w:tcPr>
+            <w:tcW w:type="dxa" w:w="1872"/>
+            <w:tcMar>
+              <w:top w:w="60" w:type="dxa"/>
+              <w:start w:w="90" w:type="dxa"/>
+              <w:bottom w:w="60" w:type="dxa"/>
+              <w:end w:w="90" w:type="dxa"/>
+            </w:tcMar>
+            <w:tcBorders>
+              <w:top w:val="nil"/>
+              <w:bottom w:val="nil"/>
+              <w:left w:val="nil"/>
+              <w:right w:val="nil"/>
+            </w:tcBorders>
+          </w:tcPr>
+          <w:p>
+            <w:pPr>
+              <w:spacing w:after="0"/>
+            </w:pPr>
+            <w:r>
+              <w:rPr>
+                <w:sz w:val="14"/>
+              </w:rPr>
+              <w:t>0.68 to 1.16</w:t>
+            </w:r>
+          </w:p>
+        </w:tc>
+      </w:tr>
+      <w:tr>
+        <w:tc>
+          <w:tcPr>
+            <w:tcW w:type="dxa" w:w="1872"/>
+            <w:tcMar>
+              <w:top w:w="60" w:type="dxa"/>
+              <w:start w:w="90" w:type="dxa"/>
+              <w:bottom w:w="60" w:type="dxa"/>
+              <w:end w:w="90" w:type="dxa"/>
+            </w:tcMar>
+            <w:tcBorders>
+              <w:top w:val="nil"/>
+              <w:bottom w:val="nil"/>
+              <w:left w:val="nil"/>
+              <w:right w:val="nil"/>
+            </w:tcBorders>
+          </w:tcPr>
+          <w:p>
+            <w:pPr>
+              <w:spacing w:after="0"/>
+            </w:pPr>
+            <w:r>
+              <w:rPr>
+                <w:sz w:val="14"/>
+              </w:rPr>
+              <w:t>SftO2</w:t>
+            </w:r>
+          </w:p>
+        </w:tc>
+        <w:tc>
+          <w:tcPr>
+            <w:tcW w:type="dxa" w:w="1872"/>
+            <w:tcMar>
+              <w:top w:w="60" w:type="dxa"/>
+              <w:start w:w="90" w:type="dxa"/>
+              <w:bottom w:w="60" w:type="dxa"/>
+              <w:end w:w="90" w:type="dxa"/>
+            </w:tcMar>
+            <w:tcBorders>
+              <w:top w:val="nil"/>
+              <w:bottom w:val="nil"/>
+              <w:left w:val="nil"/>
+              <w:right w:val="nil"/>
+            </w:tcBorders>
+          </w:tcPr>
+          <w:p>
+            <w:pPr>
+              <w:spacing w:after="0"/>
+            </w:pPr>
+            <w:r>
+              <w:rPr>
+                <w:sz w:val="14"/>
+              </w:rPr>
+              <w:t>FiO2</w:t>
+            </w:r>
+          </w:p>
+        </w:tc>
+        <w:tc>
+          <w:tcPr>
+            <w:tcW w:type="dxa" w:w="1872"/>
+            <w:tcMar>
+              <w:top w:w="60" w:type="dxa"/>
+              <w:start w:w="90" w:type="dxa"/>
+              <w:bottom w:w="60" w:type="dxa"/>
+              <w:end w:w="90" w:type="dxa"/>
+            </w:tcMar>
+            <w:tcBorders>
+              <w:top w:val="nil"/>
+              <w:bottom w:val="nil"/>
+              <w:left w:val="nil"/>
+              <w:right w:val="nil"/>
+            </w:tcBorders>
+          </w:tcPr>
+          <w:p>
+            <w:pPr>
+              <w:spacing w:after="0"/>
+            </w:pPr>
+            <w:r>
+              <w:rPr>
+                <w:sz w:val="14"/>
+              </w:rPr>
+              <w:t>+10 percentage points</w:t>
+            </w:r>
+          </w:p>
+        </w:tc>
+        <w:tc>
+          <w:tcPr>
+            <w:tcW w:type="dxa" w:w="1872"/>
+            <w:tcMar>
+              <w:top w:w="60" w:type="dxa"/>
+              <w:start w:w="90" w:type="dxa"/>
+              <w:bottom w:w="60" w:type="dxa"/>
+              <w:end w:w="90" w:type="dxa"/>
+            </w:tcMar>
+            <w:tcBorders>
+              <w:top w:val="nil"/>
+              <w:bottom w:val="nil"/>
+              <w:left w:val="nil"/>
+              <w:right w:val="nil"/>
+            </w:tcBorders>
+          </w:tcPr>
+          <w:p>
+            <w:pPr>
+              <w:spacing w:after="0"/>
+            </w:pPr>
+            <w:r>
+              <w:rPr>
+                <w:sz w:val="14"/>
+              </w:rPr>
+              <w:t>0.30</w:t>
+            </w:r>
+          </w:p>
+        </w:tc>
+        <w:tc>
+          <w:tcPr>
+            <w:tcW w:type="dxa" w:w="1872"/>
+            <w:tcMar>
+              <w:top w:w="60" w:type="dxa"/>
+              <w:start w:w="90" w:type="dxa"/>
+              <w:bottom w:w="60" w:type="dxa"/>
+              <w:end w:w="90" w:type="dxa"/>
+            </w:tcMar>
+            <w:tcBorders>
+              <w:top w:val="nil"/>
+              <w:bottom w:val="nil"/>
+              <w:left w:val="nil"/>
+              <w:right w:val="nil"/>
+            </w:tcBorders>
+          </w:tcPr>
+          <w:p>
+            <w:pPr>
+              <w:spacing w:after="0"/>
+            </w:pPr>
+            <w:r>
+              <w:rPr>
+                <w:sz w:val="14"/>
+              </w:rPr>
+              <w:t>0.11 to 0.46</w:t>
+            </w:r>
+          </w:p>
+        </w:tc>
+      </w:tr>
+      <w:tr>
+        <w:tc>
+          <w:tcPr>
+            <w:tcW w:type="dxa" w:w="1872"/>
+            <w:tcMar>
+              <w:top w:w="60" w:type="dxa"/>
+              <w:start w:w="90" w:type="dxa"/>
+              <w:bottom w:w="60" w:type="dxa"/>
+              <w:end w:w="90" w:type="dxa"/>
+            </w:tcMar>
+            <w:tcBorders>
+              <w:bottom w:val="single" w:sz="8" w:color="000000"/>
+              <w:left w:val="nil"/>
+              <w:right w:val="nil"/>
+            </w:tcBorders>
+          </w:tcPr>
+          <w:p>
+            <w:pPr>
+              <w:spacing w:after="0"/>
+            </w:pPr>
+            <w:r>
+              <w:rPr>
+                <w:sz w:val="14"/>
+              </w:rPr>
+              <w:t>SftO2</w:t>
+            </w:r>
+          </w:p>
+        </w:tc>
+        <w:tc>
+          <w:tcPr>
+            <w:tcW w:type="dxa" w:w="1872"/>
+            <w:tcMar>
+              <w:top w:w="60" w:type="dxa"/>
+              <w:start w:w="90" w:type="dxa"/>
+              <w:bottom w:w="60" w:type="dxa"/>
+              <w:end w:w="90" w:type="dxa"/>
+            </w:tcMar>
+            <w:tcBorders>
+              <w:bottom w:val="single" w:sz="8" w:color="000000"/>
+              <w:left w:val="nil"/>
+              <w:right w:val="nil"/>
+            </w:tcBorders>
+          </w:tcPr>
+          <w:p>
+            <w:pPr>
+              <w:spacing w:after="0"/>
+            </w:pPr>
+            <w:r>
+              <w:rPr>
+                <w:sz w:val="14"/>
+              </w:rPr>
+              <w:t>Temperature</w:t>
+            </w:r>
+          </w:p>
+        </w:tc>
+        <w:tc>
+          <w:tcPr>
+            <w:tcW w:type="dxa" w:w="1872"/>
+            <w:tcMar>
+              <w:top w:w="60" w:type="dxa"/>
+              <w:start w:w="90" w:type="dxa"/>
+              <w:bottom w:w="60" w:type="dxa"/>
+              <w:end w:w="90" w:type="dxa"/>
+            </w:tcMar>
+            <w:tcBorders>
+              <w:bottom w:val="single" w:sz="8" w:color="000000"/>
+              <w:left w:val="nil"/>
+              <w:right w:val="nil"/>
+            </w:tcBorders>
+          </w:tcPr>
+          <w:p>
+            <w:pPr>
+              <w:spacing w:after="0"/>
+            </w:pPr>
+            <w:r>
+              <w:rPr>
+                <w:sz w:val="14"/>
+              </w:rPr>
+              <w:t>+0.5 C</w:t>
+            </w:r>
+          </w:p>
+        </w:tc>
+        <w:tc>
+          <w:tcPr>
+            <w:tcW w:type="dxa" w:w="1872"/>
+            <w:tcMar>
+              <w:top w:w="60" w:type="dxa"/>
+              <w:start w:w="90" w:type="dxa"/>
+              <w:bottom w:w="60" w:type="dxa"/>
+              <w:end w:w="90" w:type="dxa"/>
+            </w:tcMar>
+            <w:tcBorders>
+              <w:bottom w:val="single" w:sz="8" w:color="000000"/>
+              <w:left w:val="nil"/>
+              <w:right w:val="nil"/>
+            </w:tcBorders>
+          </w:tcPr>
+          <w:p>
+            <w:pPr>
+              <w:spacing w:after="0"/>
+            </w:pPr>
+            <w:r>
+              <w:rPr>
+                <w:sz w:val="14"/>
+              </w:rPr>
+              <w:t>0.15</w:t>
+            </w:r>
+          </w:p>
+        </w:tc>
+        <w:tc>
+          <w:tcPr>
+            <w:tcW w:type="dxa" w:w="1872"/>
+            <w:tcMar>
+              <w:top w:w="60" w:type="dxa"/>
+              <w:start w:w="90" w:type="dxa"/>
+              <w:bottom w:w="60" w:type="dxa"/>
+              <w:end w:w="90" w:type="dxa"/>
+            </w:tcMar>
+            <w:tcBorders>
+              <w:bottom w:val="single" w:sz="8" w:color="000000"/>
+              <w:left w:val="nil"/>
+              <w:right w:val="nil"/>
+            </w:tcBorders>
+          </w:tcPr>
+          <w:p>
+            <w:pPr>
+              <w:spacing w:after="0"/>
+            </w:pPr>
+            <w:r>
+              <w:rPr>
+                <w:sz w:val="14"/>
+              </w:rPr>
+              <w:t>-0.03 to 0.30</w:t>
+            </w:r>
+          </w:p>
+        </w:tc>
+      </w:tr>
+    </w:tbl>
+    <w:p/>
+    <w:p>
+      <w:pPr>
+        <w:spacing w:before="200" w:after="80"/>
+      </w:pPr>
       <w:r>
         <w:rPr>
-          <w:rFonts w:ascii="Consolas" w:hAnsi="Consolas"/>
-          <w:sz w:val="20"/>
+          <w:b/>
         </w:rPr>
-        <w:t>generated_assets/figure3_clinical_step_contrasts.png</w:t>
-      </w:r>
-      <w:r>
-        <w:t>.]</w:t>
+        <w:t>Figure 3 | Clinical-step comparison of EtCO2, FiO2, and temperature.</w:t>
       </w:r>
     </w:p>
+    <w:p>
+      <w:pPr>
+        <w:spacing w:after="120"/>
+      </w:pPr>
+      <w:r>
+        <w:t>Points show adjusted differences in rSO2 for clinically interpretable exposure increments; horizontal bars show 95% intervals.</w:t>
+      </w:r>
+    </w:p>
+    <w:p>
+      <w:pPr>
+        <w:jc w:val="center"/>
+      </w:pPr>
+      <w:r>
+        <w:drawing>
+          <wp:inline xmlns:a="http://schemas.openxmlformats.org/drawingml/2006/main" xmlns:pic="http://schemas.openxmlformats.org/drawingml/2006/picture">
+            <wp:extent cx="5669280" cy="2267712"/>
+            <wp:docPr id="2" name="Picture 2"/>
+            <wp:cNvGraphicFramePr>
+              <a:graphicFrameLocks noChangeAspect="1"/>
+            </wp:cNvGraphicFramePr>
+            <a:graphic>
+              <a:graphicData uri="http://schemas.openxmlformats.org/drawingml/2006/picture">
+                <pic:pic>
+                  <pic:nvPicPr>
+                    <pic:cNvPr id="0" name="figure3_clinical_step_contrasts.png"/>
+                    <pic:cNvPicPr/>
+                  </pic:nvPicPr>
+                  <pic:blipFill>
+                    <a:blip r:embed="rId10"/>
+                    <a:stretch>
+                      <a:fillRect/>
+                    </a:stretch>
+                  </pic:blipFill>
+                  <pic:spPr>
+                    <a:xfrm>
+                      <a:off x="0" y="0"/>
+                      <a:ext cx="5669280" cy="2267712"/>
+                    </a:xfrm>
+                    <a:prstGeom prst="rect"/>
+                  </pic:spPr>
+                </pic:pic>
+              </a:graphicData>
+            </a:graphic>
+          </wp:inline>
+        </w:drawing>
+      </w:r>
+    </w:p>
+    <w:p/>
     <w:p>
       <w:pPr>
         <w:pStyle w:val="Heading2"/>
@@ -501,45 +4297,123 @@
       </w:r>
     </w:p>
     <w:p>
-      <w:r>
-        <w:t xml:space="preserve">[Insert Figure 2: </w:t>
-      </w:r>
+      <w:pPr>
+        <w:spacing w:before="200" w:after="80"/>
+      </w:pPr>
       <w:r>
         <w:rPr>
-          <w:rFonts w:ascii="Consolas" w:hAnsi="Consolas"/>
-          <w:sz w:val="20"/>
+          <w:b/>
         </w:rPr>
-        <w:t>generated_assets/figure2_etco2_adjusted_curves.png</w:t>
-      </w:r>
-      <w:r>
-        <w:t>. Bands show uncertainty intervals derived from archived prediction matrices; the bootstrap construction and sampling unit are described in the Supplement.]</w:t>
+        <w:t>Figure 2 | Adjusted EtCO2-rSO2 response curves.</w:t>
       </w:r>
     </w:p>
     <w:p>
+      <w:pPr>
+        <w:spacing w:after="120"/>
+      </w:pPr>
       <w:r>
-        <w:t xml:space="preserve">[Insert Figure 4: </w:t>
+        <w:t>Curves show adjusted tissue oxygenation across the observed EtCO2 range by channel. Bands show uncertainty intervals derived from archived prediction matrices.</w:t>
       </w:r>
+    </w:p>
+    <w:p>
+      <w:pPr>
+        <w:jc w:val="center"/>
+      </w:pPr>
+      <w:r>
+        <w:drawing>
+          <wp:inline xmlns:a="http://schemas.openxmlformats.org/drawingml/2006/main" xmlns:pic="http://schemas.openxmlformats.org/drawingml/2006/picture">
+            <wp:extent cx="5669280" cy="1965350"/>
+            <wp:docPr id="3" name="Picture 3"/>
+            <wp:cNvGraphicFramePr>
+              <a:graphicFrameLocks noChangeAspect="1"/>
+            </wp:cNvGraphicFramePr>
+            <a:graphic>
+              <a:graphicData uri="http://schemas.openxmlformats.org/drawingml/2006/picture">
+                <pic:pic>
+                  <pic:nvPicPr>
+                    <pic:cNvPr id="0" name="figure2_etco2_adjusted_curves.png"/>
+                    <pic:cNvPicPr/>
+                  </pic:nvPicPr>
+                  <pic:blipFill>
+                    <a:blip r:embed="rId11"/>
+                    <a:stretch>
+                      <a:fillRect/>
+                    </a:stretch>
+                  </pic:blipFill>
+                  <pic:spPr>
+                    <a:xfrm>
+                      <a:off x="0" y="0"/>
+                      <a:ext cx="5669280" cy="1965350"/>
+                    </a:xfrm>
+                    <a:prstGeom prst="rect"/>
+                  </pic:spPr>
+                </pic:pic>
+              </a:graphicData>
+            </a:graphic>
+          </wp:inline>
+        </w:drawing>
+      </w:r>
+    </w:p>
+    <w:p/>
+    <w:p>
+      <w:pPr>
+        <w:spacing w:before="200" w:after="80"/>
+      </w:pPr>
       <w:r>
         <w:rPr>
-          <w:rFonts w:ascii="Consolas" w:hAnsi="Consolas"/>
-          <w:sz w:val="20"/>
+          <w:b/>
         </w:rPr>
-        <w:t>generated_assets/figure4_etco2_local_slopes.png</w:t>
-      </w:r>
-      <w:r>
-        <w:t xml:space="preserve">. Source data: </w:t>
-      </w:r>
-      <w:r>
-        <w:rPr>
-          <w:rFonts w:ascii="Consolas" w:hAnsi="Consolas"/>
-          <w:sz w:val="20"/>
-        </w:rPr>
-        <w:t>generated_assets/source_data_figure4_etco2_local_slopes.csv</w:t>
-      </w:r>
-      <w:r>
-        <w:t>. Local slopes are descriptive model summaries from EtCO2 decile bins.]</w:t>
+        <w:t>Figure 4 | Local slopes of the adjusted EtCO2-rSO2 relationship.</w:t>
       </w:r>
     </w:p>
+    <w:p>
+      <w:pPr>
+        <w:spacing w:after="120"/>
+      </w:pPr>
+      <w:r>
+        <w:t>Local slopes summarize descriptive model gradients across EtCO2 decile bins. These summaries are descriptive and do not define treatment thresholds.</w:t>
+      </w:r>
+    </w:p>
+    <w:p>
+      <w:pPr>
+        <w:jc w:val="center"/>
+      </w:pPr>
+      <w:r>
+        <w:drawing>
+          <wp:inline xmlns:a="http://schemas.openxmlformats.org/drawingml/2006/main" xmlns:pic="http://schemas.openxmlformats.org/drawingml/2006/picture">
+            <wp:extent cx="5669280" cy="2811963"/>
+            <wp:docPr id="4" name="Picture 4"/>
+            <wp:cNvGraphicFramePr>
+              <a:graphicFrameLocks noChangeAspect="1"/>
+            </wp:cNvGraphicFramePr>
+            <a:graphic>
+              <a:graphicData uri="http://schemas.openxmlformats.org/drawingml/2006/picture">
+                <pic:pic>
+                  <pic:nvPicPr>
+                    <pic:cNvPr id="0" name="figure4_etco2_local_slopes.png"/>
+                    <pic:cNvPicPr/>
+                  </pic:nvPicPr>
+                  <pic:blipFill>
+                    <a:blip r:embed="rId12"/>
+                    <a:stretch>
+                      <a:fillRect/>
+                    </a:stretch>
+                  </pic:blipFill>
+                  <pic:spPr>
+                    <a:xfrm>
+                      <a:off x="0" y="0"/>
+                      <a:ext cx="5669280" cy="2811963"/>
+                    </a:xfrm>
+                    <a:prstGeom prst="rect"/>
+                  </pic:spPr>
+                </pic:pic>
+              </a:graphicData>
+            </a:graphic>
+          </wp:inline>
+        </w:drawing>
+      </w:r>
+    </w:p>
+    <w:p/>
     <w:p>
       <w:pPr>
         <w:pStyle w:val="Heading2"/>
@@ -811,7 +4685,7 @@
       </w:r>
     </w:p>
     <w:sectPr>
-      <w:footerReference w:type="default" r:id="rId9"/>
+      <w:footerReference w:type="default" r:id="rId13"/>
       <w:pgSz w:w="12240" w:h="15840"/>
       <w:pgMar w:top="1440" w:right="1440" w:bottom="1440" w:left="1440" w:header="708" w:footer="708" w:gutter="0"/>
       <w:cols w:space="720"/>

</xml_diff>

<commit_message>
Polish CO2 manuscript core narrative
</commit_message>
<xml_diff>
--- a/docs/manuscript_development/CO2_MANUSCRIPT_DRAFT_V1.docx
+++ b/docs/manuscript_development/CO2_MANUSCRIPT_DRAFT_V1.docx
@@ -12,7 +12,7 @@
           <w:color w:val="0B2545"/>
           <w:sz w:val="36"/>
         </w:rPr>
-        <w:t>End-tidal carbon dioxide and regional tissue oxygenation during off-pump coronary bypass</w:t>
+        <w:t>End-tidal carbon dioxide is associated with cerebral tissue oxygenation during off-pump coronary bypass</w:t>
       </w:r>
     </w:p>
     <w:p>
@@ -43,7 +43,7 @@
     </w:p>
     <w:p>
       <w:r>
-        <w:t>End-tidal carbon dioxide and regional tissue oxygenation during off-pump coronary bypass</w:t>
+        <w:t>End-tidal carbon dioxide is associated with cerebral tissue oxygenation during off-pump coronary bypass</w:t>
       </w:r>
     </w:p>
     <w:p>
@@ -82,7 +82,7 @@
     </w:p>
     <w:p>
       <w:r>
-        <w:t>EtCO2 and tissue oxygenation during OPCAB</w:t>
+        <w:t>EtCO2 and cerebral oxygenation during OPCAB</w:t>
       </w:r>
     </w:p>
     <w:p>
@@ -161,7 +161,7 @@
     </w:p>
     <w:p>
       <w:r>
-        <w:t>Near-infrared spectroscopy tracks tissue oxygenation during cardiac surgery, but changes in rSO2 are difficult to attribute because ventilation, oxygen delivery, temperature, blood pressure, and flow vary together. Carbon dioxide is a plausible contributor because it affects cerebrovascular tone and is continuously available as end-tidal carbon dioxide (EtCO2) during anesthesia. We used high-frequency intraoperative data from approximately 1,800 patients undergoing off-pump coronary bypass surgery to estimate adjusted nonlinear relationships between EtCO2 and regional tissue oxygenation. EtCO2 was analyzed as a continuously available clinical marker of ventilation-perfusion and perfusion physiology, not as a direct substitute for PaCO2. Generalized additive models were fitted separately for left cerebral tissue oxygen saturation (left SctO2), right SctO2, and forearm tissue oxygen saturation (SftO2), with adjustment for FiO2, temperature, mean arterial pressure, cardiac index, other available covariates, and patient-level factors. A 5 mmHg higher EtCO2 was associated with higher tissue oxygenation by 2.89 percentage points (95% CI, 2.41 to 3.33) for left SctO2, 2.98 percentage points (95% CI, 2.64 to 3.28) for right SctO2, and 0.92 percentage points (95% CI, 0.68 to 1.16) for SftO2. Comparable clinical-step changes in FiO2 and temperature were smaller and less consistent. These findings identify EtCO2 as an adjusted correlate of intraoperative cerebral oxygenation, but they do not establish PaCO2-mediated causality, an optimal EtCO2 target, or benefit from EtCO2 manipulation.</w:t>
+        <w:t>Near-infrared spectroscopy provides continuous tissue oxygenation data during cardiac surgery, but a change in rSO2 is difficult to interpret when ventilation, oxygen delivery, temperature, pressure, and flow change together. Carbon dioxide is a plausible contributor to this signal because it affects cerebrovascular tone, and end-tidal carbon dioxide (EtCO2) is recorded continuously during anesthesia. Here we modeled high-frequency intraoperative data from patients undergoing off-pump coronary bypass surgery to estimate adjusted nonlinear relationships between EtCO2 and regional tissue oxygenation. The analytic cohorts included 1,792 patients for left and right cerebral tissue oxygen saturation (SctO2) and 1,789 patients for forearm tissue oxygen saturation (SftO2), with more than 20 million usable timestamp-level observations per channel. We fitted generalized additive models separately for left SctO2, right SctO2, and SftO2, adjusting for FiO2, temperature, mean arterial pressure, cardiac index, other available covariates, and patient-level factors. A 5 mmHg higher EtCO2 was associated with 2.89 percentage points higher left SctO2 (95% CI, 2.41 to 3.33), 2.98 percentage points higher right SctO2 (95% CI, 2.64 to 3.28), and 0.92 percentage points higher SftO2 (95% CI, 0.68 to 1.16). Equivalent clinical-step contrasts for FiO2 and temperature were smaller and less consistent. EtCO2 therefore emerged as a strong, nonlinear, tissue-bed-specific correlate of intraoperative cerebral oxygenation. These data support using EtCO2 as context when interpreting cerebral oximetry during off-pump coronary bypass, but they do not establish PaCO2-mediated causality, define an EtCO2 target, or show that changing EtCO2 improves patient outcomes.</w:t>
       </w:r>
     </w:p>
     <w:p>
@@ -174,22 +174,22 @@
     </w:p>
     <w:p>
       <w:r>
-        <w:t>Near-infrared spectroscopy gives anesthesiologists a continuous view of regional tissue oxygenation during cardiac surgery.^1 The signal precedes clinical neurological or systemic outcomes, but its physiological source is often ambiguous. A fall in rSO2 may reflect changes in perfusion pressure, cardiac output, arterial oxygen content, cerebral metabolism, ventilation, temperature, sensor position, or several of these at once.</w:t>
+        <w:t>Near-infrared spectroscopy is used during cardiac surgery to monitor regional tissue oxygenation in real time.^1 Its clinical interpretation remains difficult. A low cerebral rSO2 value can reflect impaired oxygen delivery, altered venous volume, changes in cerebral metabolic demand, sensor factors, or systemic hemodynamic instability. During off-pump coronary bypass, these influences often occur together.</w:t>
       </w:r>
     </w:p>
     <w:p>
       <w:r>
-        <w:t>Carbon dioxide is a plausible contributor because PaCO2 changes cerebral blood flow through cerebrovascular reactivity, and EtCO2 is recorded continuously during anesthesia.^2 In practice, however, EtCO2 is not a pure respiratory exposure. It also reflects ventilation-perfusion matching, pulmonary blood flow, and systemic perfusion. This makes EtCO2 clinically useful and analytically difficult: the same number can signal a ventilation change, a perfusion change, or both.</w:t>
+        <w:t>Carbon dioxide is one reason the signal is hard to interpret. PaCO2 changes cerebral blood flow through cerebrovascular reactivity, and controlled human experiments show graded cerebral oxygenation responses to carbon dioxide under isoxic conditions.^2 In the operating room, clinicians usually see EtCO2 rather than continuous PaCO2. EtCO2 is useful because it is available at every breath, but it is not a pure carbon dioxide exposure. It also reflects ventilation-perfusion matching, pulmonary blood flow, dead space, and systemic perfusion. The same EtCO2 value can therefore carry respiratory and circulatory information.</w:t>
       </w:r>
     </w:p>
     <w:p>
       <w:r>
-        <w:t>Controlled studies have shown that manipulating carbon dioxide can alter cerebral oxygen saturation. Healthy-volunteer experiments found graded cerebral oxygenation responses to end-tidal carbon dioxide, and perioperative studies have examined EtCO2-rSO2 relationships in selected surgical settings.^2,3 Cardiac-surgery work has also explored whether NIRS reflects CO2-related physiology and whether mild hypercapnia can attenuate cerebral desaturation.^4,5 These studies support biological plausibility, but most used small samples, controlled gas challenges, selected surgical settings, or intermittent measurements.</w:t>
+        <w:t>Prior perioperative work supports a relationship between carbon dioxide and cerebral oxygenation, but the evidence base is fragmented. EtCO2-rSO2 modeling has been reported in carotid endarterectomy.^3 Cardiac-surgery studies have linked arterial carbon dioxide tension to NIRS values and have tested mild hypercapnia during cardiopulmonary bypass or off-pump bypass.^4,5,6 These studies establish biological plausibility and clinical interest. They do not describe, at scale, how EtCO2 relates to cerebral and peripheral tissue oxygenation during routine off-pump coronary bypass after simultaneous adjustment for oxygen fraction, temperature, perfusion pressure, cardiac index, and patient factors.</w:t>
       </w:r>
     </w:p>
     <w:p>
       <w:r>
-        <w:t>Few data describe the adjusted EtCO2-rSO2 relationship at high temporal resolution during off-pump coronary bypass. We therefore modeled EtCO2 and tissue oxygenation continuously, using generalized additive models to estimate nonlinear relationships after adjustment for FiO2, temperature, hemodynamics, and patient factors. We also compared EtCO2 with FiO2 and temperature using clinically interpretable exposure increments, and we examined whether the association differed between cerebral and forearm tissue beds.</w:t>
+        <w:t>We therefore used high-frequency intraoperative data to model EtCO2 and regional tissue oxygenation continuously during off-pump coronary bypass. We estimated nonlinear adjusted associations for left SctO2, right SctO2, and SftO2 using generalized additive models. We then placed EtCO2 on a clinical scale by comparing a 5 mmHg EtCO2 contrast with prespecified FiO2 and temperature contrasts. The goal was interpretive: to determine whether EtCO2 should be considered when clinicians read intraoperative cerebral oximetry, not to define a carbon dioxide treatment target.</w:t>
       </w:r>
     </w:p>
     <w:p>
@@ -4437,37 +4437,37 @@
     </w:p>
     <w:p>
       <w:r>
-        <w:t>This high-frequency intraoperative analysis identifies EtCO2 as a clinically interpretable correlate of tissue oxygenation during off-pump coronary bypass surgery. The association was largest in the two cerebral channels: a 5 mmHg higher EtCO2 corresponded to approximately 3 percentage points higher left and right SctO2, with bootstrap confidence intervals that excluded zero. The corresponding association with SftO2 was positive but smaller. This site-specific pattern argues against treating cerebral and forearm oximetry channels as interchangeable. Cerebral and forearm sensors appear to carry related but distinct physiologic information.</w:t>
+        <w:t>This study identifies EtCO2 as a strong adjusted correlate of cerebral tissue oxygenation during off-pump coronary bypass. A 5 mmHg higher EtCO2 was associated with nearly 3 percentage points higher left and right SctO2. The same contrast was associated with less than 1 percentage point higher SftO2. This pattern was consistent across the two cerebral channels and smaller in the forearm channel, indicating that EtCO2 is linked more closely to cerebral than peripheral oximetry in this setting.</w:t>
       </w:r>
     </w:p>
     <w:p>
       <w:r>
-        <w:t>The cerebral finding is biologically plausible. Carbon dioxide is a potent regulator of cerebrovascular tone, and controlled human studies show graded cerebral oxygenation responses to changes in end-tidal or arterial carbon dioxide.^2 Rather than studying a controlled gas challenge, this analysis estimates the EtCO2-rSO2 relationship in routine intraoperative data, during a procedure in which ventilation, perfusion, oxygen delivery, vasoactive treatment, and temperature vary simultaneously. The association remained visible after adjustment for FiO2, temperature, mean arterial pressure, hemodynamic covariates, and patient-level factors. These data indicate that EtCO2 should be considered alongside hemodynamic and oxygenation variables when interpreting cerebral oximetry changes during off-pump coronary bypass.</w:t>
+        <w:t>The finding is physiologically plausible. Carbon dioxide changes cerebrovascular tone, and controlled experiments show graded cerebral oxygenation responses to carbon dioxide.^2 Our analysis extends that physiology into routine surgical data, where EtCO2, FiO2, temperature, pressure, cardiac index, and patient factors vary together. The EtCO2 association remained visible after adjustment for these concurrent variables. The result therefore supports a practical interpretation: a cerebral oximetry value during off-pump coronary bypass should be read with the EtCO2 trend in view.</w:t>
       </w:r>
     </w:p>
     <w:p>
       <w:r>
-        <w:t>The smaller SftO2 association supports tissue-bed specificity rather than a uniform oximetry response across sensor sites. Forearm tissue oxygenation reflects skeletal muscle, skin, subcutaneous tissue, venous volume, local microvascular tone, and probe-specific factors. These determinants differ from those of cerebral oxygenation, where carbon dioxide-mediated cerebrovascular reactivity is expected to be more prominent. The observed pattern is consistent with a stronger CO2-linked signal in cerebral tissue than in the peripheral tissue bed. It also supports using paired cerebral and peripheral oximetry cautiously: concordant changes may suggest shared systemic physiology, whereas disproportionate cerebral changes may prompt closer review of cerebral perfusion, ventilation, and carbon dioxide measurements.</w:t>
+        <w:t>The forearm channel strengthens the interpretation. If EtCO2 were acting only as a nonspecific marker of global signal quality or systemic oxygenation, similar contrasts might be expected across tissue beds. Instead, the cerebral contrasts were about three times larger than the SftO2 contrast. Forearm oximetry reflects skeletal muscle, skin, subcutaneous tissue, venous volume, local microvascular tone, and probe position. Cerebral oximetry is more directly exposed to carbon dioxide-mediated cerebrovascular reactivity. The smaller forearm association therefore supports tissue-bed specificity rather than a uniform rSO2 response.</w:t>
       </w:r>
     </w:p>
     <w:p>
       <w:r>
-        <w:t>The FiO2 and temperature contrasts place the EtCO2 association on a clinical scale. FiO2, temperature, and ventilation are all adjustable during anesthesia, but their modeled clinical-step associations with rSO2 were not equivalent. In the current analysis, EtCO2 showed the largest and most consistent association with left and right SctO2 among the evaluated respiratory and thermal variables. This does not mean that EtCO2 should be manipulated automatically whenever rSO2 falls. It suggests that EtCO2 is a relevant contextual variable when clinicians interpret low or falling cerebral rSO2. A low or falling rSO2 value may not be interpretable without knowing whether EtCO2 has changed, particularly when arterial oxygen saturation is already high and perfusion variables are changing at the same time.</w:t>
+        <w:t>The comparison with FiO2 and temperature gives the effect a clinical scale. In the current models, a 10 percentage-point higher FiO2 was not associated with a consistent increase in cerebral SctO2, and a 0.5 C higher temperature showed smaller channel-dependent associations. EtCO2 showed the largest and most consistent cerebral contrast among the evaluated respiratory and thermal variables. This does not mean that EtCO2 should be increased whenever SctO2 falls. It means that EtCO2 is a relevant explanatory variable when clinicians interpret low or changing cerebral oxygenation, particularly when arterial oxygen saturation is already high and hemodynamic variables are changing.</w:t>
       </w:r>
     </w:p>
     <w:p>
       <w:r>
-        <w:t>Prior studies tested carbon dioxide under controlled or selected perioperative conditions; this analysis examines routine off-pump bypass data at timestamp level. In carotid endarterectomy, EtCO2-rSO2 pharmacodynamic modeling showed that rSO2 tended to increase as EtCO2 increased.^3 In cardiac surgery, PaCO2 changes have been linked to changes in cerebral oxygenation during controlled conditions, and pilot trials have tested mild hypercapnia during cardiopulmonary bypass or off-pump bypass.^4,5 The present analysis differs in scale and design. It uses millions of timestamp-level observations from off-pump coronary bypass surgery and models nonlinear adjusted relationships rather than relying on intermittent measurements or selected gas targets. This design is useful for physiologic interpretation, but it is not a substitute for a prospective trial.</w:t>
+        <w:t>These results fit with prior carbon dioxide and NIRS studies but differ in scale and clinical context. Volunteer data showed graded cerebral oxygenation responses to carbon dioxide under controlled conditions.^2 Carotid endarterectomy data supported quantitative EtCO2-rSO2 modeling.^3 Cardiac-surgery studies linked PaCO2 to cerebral oximetry and tested mild hypercapnia during cardiopulmonary bypass or off-pump bypass.^4,5,6 The present analysis does not replace those mechanistic and interventional studies. It adds high-frequency observational evidence from routine off-pump coronary bypass and shows that the EtCO2-rSO2 relationship remains detectable after simultaneous adjustment for major intraoperative covariates.</w:t>
       </w:r>
     </w:p>
     <w:p>
       <w:r>
-        <w:t>The claim has clear limits. EtCO2 is not PaCO2. It is influenced by ventilation, dead space, pulmonary blood flow, cardiac output, and ventilation-perfusion matching, so residual confounding by perfusion and gas exchange cannot be eliminated. The study is observational, and the modeled association should not be interpreted as proof that raising EtCO2 will raise cerebral oxygenation in a given patient. The analysis does not identify an optimal EtCO2 range and does not test postoperative neurological outcomes. Current comparisons are limited to EtCO2, FiO2, and temperature; broader comparisons with all intraoperative hemodynamic and ventilatory variables would require completed all-intraoperative models. The manuscript should therefore make a physiologic and interpretive claim, not a therapeutic claim.</w:t>
+        <w:t>The limitations define the claim. EtCO2 is not PaCO2. It is shaped by ventilation, dead space, pulmonary blood flow, cardiac output, and ventilation-perfusion matching. Residual confounding by perfusion and gas exchange is therefore unavoidable. The models used sampled timestamp-level data and model-based uncertainty intervals, so they should be interpreted as physiologic association models rather than patient-level causal estimates. The analysis did not test postoperative neurological outcomes, did not define an optimal EtCO2 range, and did not establish whether changing EtCO2 improves cerebral oxygenation in a given patient. Current reported comparisons are limited to EtCO2, FiO2, and temperature; broader ventilatory and hemodynamic sensitivity analyses remain a separate decision.</w:t>
       </w:r>
     </w:p>
     <w:p>
       <w:r>
-        <w:t>EtCO2 provides clinically available context for interpreting intraoperative cerebral oxygenation during off-pump coronary bypass. If the association is supported by sensitivity analyses and external cohorts, EtCO2 may become a useful component of physiology-guided interpretation of cerebral oximetry. Prospective studies with PaCO2 measurement, prespecified EtCO2 protocols, and clinical endpoints are needed before this approach can be tested as a management strategy.</w:t>
+        <w:t>EtCO2 should be treated as context for cerebral oximetry, not as a therapeutic target derived from this dataset. The next step is prospective validation with paired PaCO2 measurement, prespecified ventilatory protocols, integrated hemodynamic monitoring, and outcome-linked endpoints. Until then, the main implication is interpretive: during off-pump coronary bypass, EtCO2 carries information that helps explain cerebral rSO2 variation.</w:t>
       </w:r>
     </w:p>
     <w:p>

</xml_diff>

<commit_message>
Refine CO2 manuscript figures and discussion
</commit_message>
<xml_diff>
--- a/docs/manuscript_development/CO2_MANUSCRIPT_DRAFT_V1.docx
+++ b/docs/manuscript_development/CO2_MANUSCRIPT_DRAFT_V1.docx
@@ -144,11 +144,16 @@
       </w:r>
     </w:p>
     <w:p>
+      <w:r>
+        <w:t>Supplementary display item:</w:t>
+      </w:r>
+    </w:p>
+    <w:p>
       <w:pPr>
         <w:pStyle w:val="ListBullet"/>
       </w:pPr>
       <w:r>
-        <w:t>Figure 4. Local slope or threshold view of the adjusted EtCO2-rSO2 relationship.</w:t>
+        <w:t>Supplementary Figure 1. Descriptive local slopes across the analytic EtCO2 range.</w:t>
       </w:r>
     </w:p>
     <w:p>
@@ -312,7 +317,7 @@
     </w:p>
     <w:p>
       <w:r>
-        <w:t>To make the nonlinear model clinically interpretable, we estimated expected rSO2 changes for common intraoperative exposure increments. The primary contrast was a 5 mmHg EtCO2 difference. Comparator contrasts included FiO2 and temperature increments defined in the analysis configuration. Local slopes were also summarized across exposure quantile bins.</w:t>
+        <w:t>To make the nonlinear model clinically interpretable, we estimated expected rSO2 changes for common intraoperative exposure increments. The primary contrast was a 5 mmHg EtCO2 difference. Comparator contrasts included FiO2 and temperature increments defined in the analysis configuration. Descriptive local slopes were summarized across EtCO2 mmHg bins from 20 to 50 mmHg as a supplementary model-shape check.</w:t>
       </w:r>
     </w:p>
     <w:p>
@@ -4293,7 +4298,7 @@
     </w:p>
     <w:p>
       <w:r>
-        <w:t>The adjusted EtCO2 response curves showed increasing rSO2 across much of the observed EtCO2 range. Left and right SctO2 had similar curve shapes and effect sizes, while SftO2 showed higher baseline oxygenation and a smaller EtCO2-associated contrast. Descriptive local-slope summaries suggested steeper EtCO2-rSO2 gradients in the central exposure range and flatter gradients near the upper tail, where data were sparser and uncertainty was wider.</w:t>
+        <w:t>The adjusted EtCO2 response curves showed increasing rSO2 across much of the observed EtCO2 range. Left and right SctO2 had similar curve shapes and effect sizes, while SftO2 showed higher baseline oxygenation and a smaller EtCO2-associated contrast. Descriptive local-slope summaries across 20-50 mmHg EtCO2 bins supported the same shape, with steeper cerebral gradients in the mid-range and flatter gradients near the upper range; these summaries are reported as Supplementary Figure 1 because they are model-shape descriptors rather than independent clinical endpoints.</w:t>
       </w:r>
     </w:p>
     <w:p>
@@ -4312,7 +4317,7 @@
         <w:spacing w:after="120"/>
       </w:pPr>
       <w:r>
-        <w:t>Curves show adjusted tissue oxygenation across the observed EtCO2 range by channel. Bands show uncertainty intervals derived from archived prediction matrices.</w:t>
+        <w:t>Curves show adjusted tissue oxygenation across the observed EtCO2 range by channel. Bands show uncertainty intervals derived from archived prediction matrices. Bottom ticks show modeled curve support, not the observed EtCO2 histogram.</w:t>
       </w:r>
     </w:p>
     <w:p>
@@ -4322,7 +4327,7 @@
       <w:r>
         <w:drawing>
           <wp:inline xmlns:a="http://schemas.openxmlformats.org/drawingml/2006/main" xmlns:pic="http://schemas.openxmlformats.org/drawingml/2006/picture">
-            <wp:extent cx="5669280" cy="1965350"/>
+            <wp:extent cx="5669280" cy="2116531"/>
             <wp:docPr id="3" name="Picture 3"/>
             <wp:cNvGraphicFramePr>
               <a:graphicFrameLocks noChangeAspect="1"/>
@@ -4343,66 +4348,7 @@
                   <pic:spPr>
                     <a:xfrm>
                       <a:off x="0" y="0"/>
-                      <a:ext cx="5669280" cy="1965350"/>
-                    </a:xfrm>
-                    <a:prstGeom prst="rect"/>
-                  </pic:spPr>
-                </pic:pic>
-              </a:graphicData>
-            </a:graphic>
-          </wp:inline>
-        </w:drawing>
-      </w:r>
-    </w:p>
-    <w:p/>
-    <w:p>
-      <w:pPr>
-        <w:spacing w:before="200" w:after="80"/>
-      </w:pPr>
-      <w:r>
-        <w:rPr>
-          <w:b/>
-        </w:rPr>
-        <w:t>Figure 4 | Local slopes of the adjusted EtCO2-rSO2 relationship.</w:t>
-      </w:r>
-    </w:p>
-    <w:p>
-      <w:pPr>
-        <w:spacing w:after="120"/>
-      </w:pPr>
-      <w:r>
-        <w:t>Local slopes summarize descriptive model gradients across EtCO2 decile bins. These summaries are descriptive and do not define treatment thresholds.</w:t>
-      </w:r>
-    </w:p>
-    <w:p>
-      <w:pPr>
-        <w:jc w:val="center"/>
-      </w:pPr>
-      <w:r>
-        <w:drawing>
-          <wp:inline xmlns:a="http://schemas.openxmlformats.org/drawingml/2006/main" xmlns:pic="http://schemas.openxmlformats.org/drawingml/2006/picture">
-            <wp:extent cx="5669280" cy="2811963"/>
-            <wp:docPr id="4" name="Picture 4"/>
-            <wp:cNvGraphicFramePr>
-              <a:graphicFrameLocks noChangeAspect="1"/>
-            </wp:cNvGraphicFramePr>
-            <a:graphic>
-              <a:graphicData uri="http://schemas.openxmlformats.org/drawingml/2006/picture">
-                <pic:pic>
-                  <pic:nvPicPr>
-                    <pic:cNvPr id="0" name="figure4_etco2_local_slopes.png"/>
-                    <pic:cNvPicPr/>
-                  </pic:nvPicPr>
-                  <pic:blipFill>
-                    <a:blip r:embed="rId12"/>
-                    <a:stretch>
-                      <a:fillRect/>
-                    </a:stretch>
-                  </pic:blipFill>
-                  <pic:spPr>
-                    <a:xfrm>
-                      <a:off x="0" y="0"/>
-                      <a:ext cx="5669280" cy="2811963"/>
+                      <a:ext cx="5669280" cy="2116531"/>
                     </a:xfrm>
                     <a:prstGeom prst="rect"/>
                   </pic:spPr>
@@ -4437,37 +4383,32 @@
     </w:p>
     <w:p>
       <w:r>
-        <w:t>This study identifies EtCO2 as a strong adjusted correlate of cerebral tissue oxygenation during off-pump coronary bypass. A 5 mmHg higher EtCO2 was associated with nearly 3 percentage points higher left and right SctO2. The same contrast was associated with less than 1 percentage point higher SftO2. This pattern was consistent across the two cerebral channels and smaller in the forearm channel, indicating that EtCO2 is linked more closely to cerebral than peripheral oximetry in this setting.</w:t>
+        <w:t>This high-frequency analysis identifies EtCO2 as a strong adjusted correlate of cerebral tissue oxygenation during off-pump coronary bypass. A 5 mmHg higher EtCO2 was associated with nearly 3 percentage points higher left and right SctO2. The same contrast was associated with less than 1 percentage point higher SftO2. The separation between cerebral and forearm channels is the central result: EtCO2 tracked cerebral oximetry more closely than peripheral oximetry in this surgical setting.</w:t>
       </w:r>
     </w:p>
     <w:p>
       <w:r>
-        <w:t>The finding is physiologically plausible. Carbon dioxide changes cerebrovascular tone, and controlled experiments show graded cerebral oxygenation responses to carbon dioxide.^2 Our analysis extends that physiology into routine surgical data, where EtCO2, FiO2, temperature, pressure, cardiac index, and patient factors vary together. The EtCO2 association remained visible after adjustment for these concurrent variables. The result therefore supports a practical interpretation: a cerebral oximetry value during off-pump coronary bypass should be read with the EtCO2 trend in view.</w:t>
+        <w:t>The association is biologically plausible. Carbon dioxide changes cerebrovascular tone, and controlled physiology studies show graded cerebral oxygenation responses to carbon dioxide under controlled oxygen conditions.^2 We observed the same direction of association in routine operative data, where EtCO2, FiO2, temperature, pressure, cardiac index and patient factors vary together. EtCO2 should therefore be read as a clinically available marker that carries carbon dioxide, ventilation-perfusion and perfusion information, not as a direct substitute for PaCO2.</w:t>
       </w:r>
     </w:p>
     <w:p>
       <w:r>
-        <w:t>The forearm channel strengthens the interpretation. If EtCO2 were acting only as a nonspecific marker of global signal quality or systemic oxygenation, similar contrasts might be expected across tissue beds. Instead, the cerebral contrasts were about three times larger than the SftO2 contrast. Forearm oximetry reflects skeletal muscle, skin, subcutaneous tissue, venous volume, local microvascular tone, and probe position. Cerebral oximetry is more directly exposed to carbon dioxide-mediated cerebrovascular reactivity. The smaller forearm association therefore supports tissue-bed specificity rather than a uniform rSO2 response.</w:t>
+        <w:t>The forearm channel strengthens the interpretation. If EtCO2 were acting only as a nonspecific marker of signal quality, systemic oxygenation or global physiologic instability, similar contrasts across tissue beds would be expected. Instead, the cerebral contrasts were about three times larger than the SftO2 contrast. Forearm oximetry reflects skeletal muscle, skin, subcutaneous tissue, venous volume, local microvascular tone and probe position. Cerebral oximetry is more directly linked to carbon dioxide-mediated cerebrovascular reactivity. The smaller forearm association therefore supports tissue-bed specificity rather than a uniform rSO2 response.</w:t>
       </w:r>
     </w:p>
     <w:p>
       <w:r>
-        <w:t>The comparison with FiO2 and temperature gives the effect a clinical scale. In the current models, a 10 percentage-point higher FiO2 was not associated with a consistent increase in cerebral SctO2, and a 0.5 C higher temperature showed smaller channel-dependent associations. EtCO2 showed the largest and most consistent cerebral contrast among the evaluated respiratory and thermal variables. This does not mean that EtCO2 should be increased whenever SctO2 falls. It means that EtCO2 is a relevant explanatory variable when clinicians interpret low or changing cerebral oxygenation, particularly when arterial oxygen saturation is already high and hemodynamic variables are changing.</w:t>
+        <w:t>The clinical-step comparison places this association on a practical scale. In the current models, a 10 percentage-point higher FiO2 was not associated with a consistent increase in cerebral SctO2, and a 0.5 C higher temperature showed smaller channel-dependent associations. EtCO2 showed the largest and most consistent cerebral contrast among the prespecified respiratory and thermal comparisons. This does not mean EtCO2 should be increased whenever SctO2 falls. It means that a low or changing cerebral oximetry value during off-pump coronary bypass should be interpreted with the EtCO2 trend in view, especially when oxygen saturation is already high and hemodynamic variables are changing.</w:t>
       </w:r>
     </w:p>
     <w:p>
       <w:r>
-        <w:t>These results fit with prior carbon dioxide and NIRS studies but differ in scale and clinical context. Volunteer data showed graded cerebral oxygenation responses to carbon dioxide under controlled conditions.^2 Carotid endarterectomy data supported quantitative EtCO2-rSO2 modeling.^3 Cardiac-surgery studies linked PaCO2 to cerebral oximetry and tested mild hypercapnia during cardiopulmonary bypass or off-pump bypass.^4,5,6 The present analysis does not replace those mechanistic and interventional studies. It adds high-frequency observational evidence from routine off-pump coronary bypass and shows that the EtCO2-rSO2 relationship remains detectable after simultaneous adjustment for major intraoperative covariates.</w:t>
+        <w:t>These findings fit prior carbon dioxide and NIRS work but add scale and clinical context. Volunteer data showed graded cerebral oxygenation responses to carbon dioxide under controlled conditions.^2 Carotid endarterectomy data supported quantitative EtCO2-rSO2 modeling.^3 Cardiac-surgery studies linked PaCO2 to cerebral oximetry and tested mild hypercapnia during cardiopulmonary bypass or off-pump bypass.^4,5,6 The present analysis does not replace those mechanistic and interventional studies. It shows that the EtCO2-rSO2 relationship remains visible in routine off-pump coronary bypass data after simultaneous adjustment for major intraoperative covariates.</w:t>
       </w:r>
     </w:p>
     <w:p>
       <w:r>
-        <w:t>The limitations define the claim. EtCO2 is not PaCO2. It is shaped by ventilation, dead space, pulmonary blood flow, cardiac output, and ventilation-perfusion matching. Residual confounding by perfusion and gas exchange is therefore unavoidable. The models used sampled timestamp-level data and model-based uncertainty intervals, so they should be interpreted as physiologic association models rather than patient-level causal estimates. The analysis did not test postoperative neurological outcomes, did not define an optimal EtCO2 range, and did not establish whether changing EtCO2 improves cerebral oxygenation in a given patient. Current reported comparisons are limited to EtCO2, FiO2, and temperature; broader ventilatory and hemodynamic sensitivity analyses remain a separate decision.</w:t>
-      </w:r>
-    </w:p>
-    <w:p>
-      <w:r>
-        <w:t>EtCO2 should be treated as context for cerebral oximetry, not as a therapeutic target derived from this dataset. The next step is prospective validation with paired PaCO2 measurement, prespecified ventilatory protocols, integrated hemodynamic monitoring, and outcome-linked endpoints. Until then, the main implication is interpretive: during off-pump coronary bypass, EtCO2 carries information that helps explain cerebral rSO2 variation.</w:t>
+        <w:t>The limitations define the claim. EtCO2 is not PaCO2. It is shaped by ventilation, dead space, pulmonary blood flow, cardiac output and ventilation-perfusion matching, so residual confounding by perfusion and gas exchange is unavoidable. The models used sampled timestamp-level data and model-based uncertainty intervals, so they should be interpreted as physiologic association models rather than patient-level causal estimates. The analysis did not test postoperative neurological outcomes, did not define an optimal EtCO2 range and did not establish whether changing EtCO2 improves cerebral oxygenation in an individual patient. Prospective validation should pair EtCO2 with arterial PaCO2, prespecify ventilatory protocols, integrate hemodynamic monitoring and link intraoperative oxygenation patterns to postoperative outcomes. Until then, EtCO2 should be treated as context for cerebral oximetry, not as a treatment target derived from this dataset.</w:t>
       </w:r>
     </w:p>
     <w:p>
@@ -4685,7 +4626,7 @@
       </w:r>
     </w:p>
     <w:sectPr>
-      <w:footerReference w:type="default" r:id="rId13"/>
+      <w:footerReference w:type="default" r:id="rId12"/>
       <w:pgSz w:w="12240" w:h="15840"/>
       <w:pgMar w:top="1440" w:right="1440" w:bottom="1440" w:left="1440" w:header="708" w:footer="708" w:gutter="0"/>
       <w:cols w:space="720"/>

</xml_diff>